<commit_message>
feat: add CleverTap integration checklist and self-audit web application
</commit_message>
<xml_diff>
--- a/CleverTap-Audit-Tool-Proposal.docx
+++ b/CleverTap-Audit-Tool-Proposal.docx
@@ -1760,7 +1760,675 @@
           <w:sz w:val="30"/>
           <w:szCs w:val="30"/>
         </w:rPr>
-        <w:t xml:space="preserve">5.  User Flow</w:t>
+        <w:t xml:space="preserve">5.  Engine Coverage — What Each Method Needs &amp; Solves</w:t>
+      </w:r>
+    </w:p>
+    <w:p>
+      <w:pPr>
+        <w:spacing w:after="100"/>
+      </w:pPr>
+      <w:r>
+        <w:rPr>
+          <w:sz w:val="20"/>
+          <w:szCs w:val="20"/>
+        </w:rPr>
+        <w:t xml:space="preserve">Across the 39 checklist items (27 App + 12 Web), here is what each engine needs as input and what it can verify. Items overlap — many are confirmed by two engines (e.g. onUserLogin: Static confirms the code is present, API confirms profiles actually carry identity).</w:t>
+      </w:r>
+    </w:p>
+    <w:tbl>
+      <w:tblPr>
+        <w:tblW w:type="dxa" w:w="9360"/>
+        <w:tblBorders>
+          <w:top w:val="single" w:color="auto" w:sz="4"/>
+          <w:left w:val="single" w:color="auto" w:sz="4"/>
+          <w:bottom w:val="single" w:color="auto" w:sz="4"/>
+          <w:right w:val="single" w:color="auto" w:sz="4"/>
+          <w:insideH w:val="single" w:color="auto" w:sz="4"/>
+          <w:insideV w:val="single" w:color="auto" w:sz="4"/>
+        </w:tblBorders>
+      </w:tblPr>
+      <w:tblGrid>
+        <w:gridCol w:w="1900"/>
+        <w:gridCol w:w="2200"/>
+        <w:gridCol w:w="1360"/>
+        <w:gridCol w:w="3900"/>
+      </w:tblGrid>
+      <w:tr>
+        <w:trPr>
+          <w:tblHeader/>
+        </w:trPr>
+        <w:tc>
+          <w:tcPr>
+            <w:tcW w:type="dxa" w:w="1900"/>
+            <w:shd w:fill="1F5FA8" w:color="auto" w:val="clear"/>
+            <w:tcMar>
+              <w:top w:type="dxa" w:w="60"/>
+              <w:left w:type="dxa" w:w="90"/>
+              <w:bottom w:type="dxa" w:w="60"/>
+              <w:right w:type="dxa" w:w="90"/>
+            </w:tcMar>
+          </w:tcPr>
+          <w:p>
+            <w:pPr>
+              <w:jc w:val="left"/>
+            </w:pPr>
+            <w:r>
+              <w:rPr>
+                <w:b/>
+                <w:bCs/>
+                <w:color w:val="FFFFFF"/>
+                <w:sz w:val="18"/>
+                <w:szCs w:val="18"/>
+              </w:rPr>
+              <w:t xml:space="preserve">Engine</w:t>
+            </w:r>
+          </w:p>
+        </w:tc>
+        <w:tc>
+          <w:tcPr>
+            <w:tcW w:type="dxa" w:w="2200"/>
+            <w:shd w:fill="1F5FA8" w:color="auto" w:val="clear"/>
+            <w:tcMar>
+              <w:top w:type="dxa" w:w="60"/>
+              <w:left w:type="dxa" w:w="90"/>
+              <w:bottom w:type="dxa" w:w="60"/>
+              <w:right w:type="dxa" w:w="90"/>
+            </w:tcMar>
+          </w:tcPr>
+          <w:p>
+            <w:pPr>
+              <w:jc w:val="left"/>
+            </w:pPr>
+            <w:r>
+              <w:rPr>
+                <w:b/>
+                <w:bCs/>
+                <w:color w:val="FFFFFF"/>
+                <w:sz w:val="18"/>
+                <w:szCs w:val="18"/>
+              </w:rPr>
+              <w:t xml:space="preserve">Needs (input)</w:t>
+            </w:r>
+          </w:p>
+        </w:tc>
+        <w:tc>
+          <w:tcPr>
+            <w:tcW w:type="dxa" w:w="1360"/>
+            <w:shd w:fill="1F5FA8" w:color="auto" w:val="clear"/>
+            <w:tcMar>
+              <w:top w:type="dxa" w:w="60"/>
+              <w:left w:type="dxa" w:w="90"/>
+              <w:bottom w:type="dxa" w:w="60"/>
+              <w:right w:type="dxa" w:w="90"/>
+            </w:tcMar>
+          </w:tcPr>
+          <w:p>
+            <w:pPr>
+              <w:jc w:val="left"/>
+            </w:pPr>
+            <w:r>
+              <w:rPr>
+                <w:b/>
+                <w:bCs/>
+                <w:color w:val="FFFFFF"/>
+                <w:sz w:val="18"/>
+                <w:szCs w:val="18"/>
+              </w:rPr>
+              <w:t xml:space="preserve">Solves</w:t>
+            </w:r>
+          </w:p>
+        </w:tc>
+        <w:tc>
+          <w:tcPr>
+            <w:tcW w:type="dxa" w:w="3900"/>
+            <w:shd w:fill="1F5FA8" w:color="auto" w:val="clear"/>
+            <w:tcMar>
+              <w:top w:type="dxa" w:w="60"/>
+              <w:left w:type="dxa" w:w="90"/>
+              <w:bottom w:type="dxa" w:w="60"/>
+              <w:right w:type="dxa" w:w="90"/>
+            </w:tcMar>
+          </w:tcPr>
+          <w:p>
+            <w:pPr>
+              <w:jc w:val="left"/>
+            </w:pPr>
+            <w:r>
+              <w:rPr>
+                <w:b/>
+                <w:bCs/>
+                <w:color w:val="FFFFFF"/>
+                <w:sz w:val="18"/>
+                <w:szCs w:val="18"/>
+              </w:rPr>
+              <w:t xml:space="preserve">What it covers</w:t>
+            </w:r>
+          </w:p>
+        </w:tc>
+      </w:tr>
+      <w:tr>
+        <w:tc>
+          <w:tcPr>
+            <w:tcW w:type="dxa" w:w="1900"/>
+            <w:shd w:fill="FFFFFF" w:color="auto" w:val="clear"/>
+            <w:tcMar>
+              <w:top w:type="dxa" w:w="60"/>
+              <w:left w:type="dxa" w:w="90"/>
+              <w:bottom w:type="dxa" w:w="60"/>
+              <w:right w:type="dxa" w:w="90"/>
+            </w:tcMar>
+          </w:tcPr>
+          <w:p>
+            <w:pPr>
+              <w:jc w:val="left"/>
+            </w:pPr>
+            <w:r>
+              <w:rPr>
+                <w:b w:val="false"/>
+                <w:bCs w:val="false"/>
+                <w:color w:val="1A1A1A"/>
+                <w:sz w:val="18"/>
+                <w:szCs w:val="18"/>
+              </w:rPr>
+              <w:t xml:space="preserve">API Verifier (read + trigger/confirm)</w:t>
+            </w:r>
+          </w:p>
+        </w:tc>
+        <w:tc>
+          <w:tcPr>
+            <w:tcW w:type="dxa" w:w="2200"/>
+            <w:shd w:fill="FFFFFF" w:color="auto" w:val="clear"/>
+            <w:tcMar>
+              <w:top w:type="dxa" w:w="60"/>
+              <w:left w:type="dxa" w:w="90"/>
+              <w:bottom w:type="dxa" w:w="60"/>
+              <w:right w:type="dxa" w:w="90"/>
+            </w:tcMar>
+          </w:tcPr>
+          <w:p>
+            <w:pPr>
+              <w:jc w:val="left"/>
+            </w:pPr>
+            <w:r>
+              <w:rPr>
+                <w:b w:val="false"/>
+                <w:bCs w:val="false"/>
+                <w:color w:val="1A1A1A"/>
+                <w:sz w:val="18"/>
+                <w:szCs w:val="18"/>
+              </w:rPr>
+              <w:t xml:space="preserve">Read-only Account ID + Passcode + region</w:t>
+            </w:r>
+          </w:p>
+        </w:tc>
+        <w:tc>
+          <w:tcPr>
+            <w:tcW w:type="dxa" w:w="1360"/>
+            <w:shd w:fill="FFFFFF" w:color="auto" w:val="clear"/>
+            <w:tcMar>
+              <w:top w:type="dxa" w:w="60"/>
+              <w:left w:type="dxa" w:w="90"/>
+              <w:bottom w:type="dxa" w:w="60"/>
+              <w:right w:type="dxa" w:w="90"/>
+            </w:tcMar>
+          </w:tcPr>
+          <w:p>
+            <w:pPr>
+              <w:jc w:val="left"/>
+            </w:pPr>
+            <w:r>
+              <w:rPr>
+                <w:b w:val="false"/>
+                <w:bCs w:val="false"/>
+                <w:color w:val="1A1A1A"/>
+                <w:sz w:val="18"/>
+                <w:szCs w:val="18"/>
+              </w:rPr>
+              <w:t xml:space="preserve">~29 / 39 (~74%)</w:t>
+            </w:r>
+          </w:p>
+        </w:tc>
+        <w:tc>
+          <w:tcPr>
+            <w:tcW w:type="dxa" w:w="3900"/>
+            <w:shd w:fill="FFFFFF" w:color="auto" w:val="clear"/>
+            <w:tcMar>
+              <w:top w:type="dxa" w:w="60"/>
+              <w:left w:type="dxa" w:w="90"/>
+              <w:bottom w:type="dxa" w:w="60"/>
+              <w:right w:type="dxa" w:w="90"/>
+            </w:tcMar>
+          </w:tcPr>
+          <w:p>
+            <w:pPr>
+              <w:jc w:val="left"/>
+            </w:pPr>
+            <w:r>
+              <w:rPr>
+                <w:b w:val="false"/>
+                <w:bCs w:val="false"/>
+                <w:color w:val="1A1A1A"/>
+                <w:sz w:val="18"/>
+                <w:szCs w:val="18"/>
+              </w:rPr>
+              <w:t xml:space="preserve">App Installed/Launched, custom events, identity/email/phone, anonymous profiles, lat-long, data-type correctness, no-null values, impressions, uninstall &amp; session analytics, test push (trigger→confirm), web push, UTM</w:t>
+            </w:r>
+          </w:p>
+        </w:tc>
+      </w:tr>
+      <w:tr>
+        <w:tc>
+          <w:tcPr>
+            <w:tcW w:type="dxa" w:w="1900"/>
+            <w:shd w:fill="F2F5F9" w:color="auto" w:val="clear"/>
+            <w:tcMar>
+              <w:top w:type="dxa" w:w="60"/>
+              <w:left w:type="dxa" w:w="90"/>
+              <w:bottom w:type="dxa" w:w="60"/>
+              <w:right w:type="dxa" w:w="90"/>
+            </w:tcMar>
+          </w:tcPr>
+          <w:p>
+            <w:pPr>
+              <w:jc w:val="left"/>
+            </w:pPr>
+            <w:r>
+              <w:rPr>
+                <w:b w:val="false"/>
+                <w:bCs w:val="false"/>
+                <w:color w:val="1A1A1A"/>
+                <w:sz w:val="18"/>
+                <w:szCs w:val="18"/>
+              </w:rPr>
+              <w:t xml:space="preserve">Web Crawler (live)</w:t>
+            </w:r>
+          </w:p>
+        </w:tc>
+        <w:tc>
+          <w:tcPr>
+            <w:tcW w:type="dxa" w:w="2200"/>
+            <w:shd w:fill="F2F5F9" w:color="auto" w:val="clear"/>
+            <w:tcMar>
+              <w:top w:type="dxa" w:w="60"/>
+              <w:left w:type="dxa" w:w="90"/>
+              <w:bottom w:type="dxa" w:w="60"/>
+              <w:right w:type="dxa" w:w="90"/>
+            </w:tcMar>
+          </w:tcPr>
+          <w:p>
+            <w:pPr>
+              <w:jc w:val="left"/>
+            </w:pPr>
+            <w:r>
+              <w:rPr>
+                <w:b w:val="false"/>
+                <w:bCs w:val="false"/>
+                <w:color w:val="1A1A1A"/>
+                <w:sz w:val="18"/>
+                <w:szCs w:val="18"/>
+              </w:rPr>
+              <w:t xml:space="preserve">Website URL — nothing uploaded</w:t>
+            </w:r>
+          </w:p>
+        </w:tc>
+        <w:tc>
+          <w:tcPr>
+            <w:tcW w:type="dxa" w:w="1360"/>
+            <w:shd w:fill="F2F5F9" w:color="auto" w:val="clear"/>
+            <w:tcMar>
+              <w:top w:type="dxa" w:w="60"/>
+              <w:left w:type="dxa" w:w="90"/>
+              <w:bottom w:type="dxa" w:w="60"/>
+              <w:right w:type="dxa" w:w="90"/>
+            </w:tcMar>
+          </w:tcPr>
+          <w:p>
+            <w:pPr>
+              <w:jc w:val="left"/>
+            </w:pPr>
+            <w:r>
+              <w:rPr>
+                <w:b w:val="false"/>
+                <w:bCs w:val="false"/>
+                <w:color w:val="1A1A1A"/>
+                <w:sz w:val="18"/>
+                <w:szCs w:val="18"/>
+              </w:rPr>
+              <w:t xml:space="preserve">7 (web only)</w:t>
+            </w:r>
+          </w:p>
+        </w:tc>
+        <w:tc>
+          <w:tcPr>
+            <w:tcW w:type="dxa" w:w="3900"/>
+            <w:shd w:fill="F2F5F9" w:color="auto" w:val="clear"/>
+            <w:tcMar>
+              <w:top w:type="dxa" w:w="60"/>
+              <w:left w:type="dxa" w:w="90"/>
+              <w:bottom w:type="dxa" w:w="60"/>
+              <w:right w:type="dxa" w:w="90"/>
+            </w:tcMar>
+          </w:tcPr>
+          <w:p>
+            <w:pPr>
+              <w:jc w:val="left"/>
+            </w:pPr>
+            <w:r>
+              <w:rPr>
+                <w:b w:val="false"/>
+                <w:bCs w:val="false"/>
+                <w:color w:val="1A1A1A"/>
+                <w:sz w:val="18"/>
+                <w:szCs w:val="18"/>
+              </w:rPr>
+              <w:t xml:space="preserve">SDK in &lt;head&gt;, GDPR config, service worker file, network calls, UTM live, custom events live</w:t>
+            </w:r>
+          </w:p>
+        </w:tc>
+      </w:tr>
+      <w:tr>
+        <w:tc>
+          <w:tcPr>
+            <w:tcW w:type="dxa" w:w="1900"/>
+            <w:shd w:fill="FFFFFF" w:color="auto" w:val="clear"/>
+            <w:tcMar>
+              <w:top w:type="dxa" w:w="60"/>
+              <w:left w:type="dxa" w:w="90"/>
+              <w:bottom w:type="dxa" w:w="60"/>
+              <w:right w:type="dxa" w:w="90"/>
+            </w:tcMar>
+          </w:tcPr>
+          <w:p>
+            <w:pPr>
+              <w:jc w:val="left"/>
+            </w:pPr>
+            <w:r>
+              <w:rPr>
+                <w:b w:val="false"/>
+                <w:bCs w:val="false"/>
+                <w:color w:val="1A1A1A"/>
+                <w:sz w:val="18"/>
+                <w:szCs w:val="18"/>
+              </w:rPr>
+              <w:t xml:space="preserve">Static Scanner</w:t>
+            </w:r>
+          </w:p>
+        </w:tc>
+        <w:tc>
+          <w:tcPr>
+            <w:tcW w:type="dxa" w:w="2200"/>
+            <w:shd w:fill="FFFFFF" w:color="auto" w:val="clear"/>
+            <w:tcMar>
+              <w:top w:type="dxa" w:w="60"/>
+              <w:left w:type="dxa" w:w="90"/>
+              <w:bottom w:type="dxa" w:w="60"/>
+              <w:right w:type="dxa" w:w="90"/>
+            </w:tcMar>
+          </w:tcPr>
+          <w:p>
+            <w:pPr>
+              <w:jc w:val="left"/>
+            </w:pPr>
+            <w:r>
+              <w:rPr>
+                <w:b w:val="false"/>
+                <w:bCs w:val="false"/>
+                <w:color w:val="1A1A1A"/>
+                <w:sz w:val="18"/>
+                <w:szCs w:val="18"/>
+              </w:rPr>
+              <w:t xml:space="preserve">APK / IPA / source zip</w:t>
+            </w:r>
+          </w:p>
+        </w:tc>
+        <w:tc>
+          <w:tcPr>
+            <w:tcW w:type="dxa" w:w="1360"/>
+            <w:shd w:fill="FFFFFF" w:color="auto" w:val="clear"/>
+            <w:tcMar>
+              <w:top w:type="dxa" w:w="60"/>
+              <w:left w:type="dxa" w:w="90"/>
+              <w:bottom w:type="dxa" w:w="60"/>
+              <w:right w:type="dxa" w:w="90"/>
+            </w:tcMar>
+          </w:tcPr>
+          <w:p>
+            <w:pPr>
+              <w:jc w:val="left"/>
+            </w:pPr>
+            <w:r>
+              <w:rPr>
+                <w:b w:val="false"/>
+                <w:bCs w:val="false"/>
+                <w:color w:val="1A1A1A"/>
+                <w:sz w:val="18"/>
+                <w:szCs w:val="18"/>
+              </w:rPr>
+              <w:t xml:space="preserve">~10</w:t>
+            </w:r>
+          </w:p>
+        </w:tc>
+        <w:tc>
+          <w:tcPr>
+            <w:tcW w:type="dxa" w:w="3900"/>
+            <w:shd w:fill="FFFFFF" w:color="auto" w:val="clear"/>
+            <w:tcMar>
+              <w:top w:type="dxa" w:w="60"/>
+              <w:left w:type="dxa" w:w="90"/>
+              <w:bottom w:type="dxa" w:w="60"/>
+              <w:right w:type="dxa" w:w="90"/>
+            </w:tcMar>
+          </w:tcPr>
+          <w:p>
+            <w:pPr>
+              <w:jc w:val="left"/>
+            </w:pPr>
+            <w:r>
+              <w:rPr>
+                <w:b w:val="false"/>
+                <w:bCs w:val="false"/>
+                <w:color w:val="1A1A1A"/>
+                <w:sz w:val="18"/>
+                <w:szCs w:val="18"/>
+              </w:rPr>
+              <w:t xml:space="preserve">SDK version, notification channel, manifest deep-link schemes, iOS NSE, code presence of onUserLogin / setLocation / GDPR calls</w:t>
+            </w:r>
+          </w:p>
+        </w:tc>
+      </w:tr>
+      <w:tr>
+        <w:tc>
+          <w:tcPr>
+            <w:tcW w:type="dxa" w:w="1900"/>
+            <w:shd w:fill="F2F5F9" w:color="auto" w:val="clear"/>
+            <w:tcMar>
+              <w:top w:type="dxa" w:w="60"/>
+              <w:left w:type="dxa" w:w="90"/>
+              <w:bottom w:type="dxa" w:w="60"/>
+              <w:right w:type="dxa" w:w="90"/>
+            </w:tcMar>
+          </w:tcPr>
+          <w:p>
+            <w:pPr>
+              <w:jc w:val="left"/>
+            </w:pPr>
+            <w:r>
+              <w:rPr>
+                <w:b w:val="false"/>
+                <w:bCs w:val="false"/>
+                <w:color w:val="1A1A1A"/>
+                <w:sz w:val="18"/>
+                <w:szCs w:val="18"/>
+              </w:rPr>
+              <w:t xml:space="preserve">Manual (human)</w:t>
+            </w:r>
+          </w:p>
+        </w:tc>
+        <w:tc>
+          <w:tcPr>
+            <w:tcW w:type="dxa" w:w="2200"/>
+            <w:shd w:fill="F2F5F9" w:color="auto" w:val="clear"/>
+            <w:tcMar>
+              <w:top w:type="dxa" w:w="60"/>
+              <w:left w:type="dxa" w:w="90"/>
+              <w:bottom w:type="dxa" w:w="60"/>
+              <w:right w:type="dxa" w:w="90"/>
+            </w:tcMar>
+          </w:tcPr>
+          <w:p>
+            <w:pPr>
+              <w:jc w:val="left"/>
+            </w:pPr>
+            <w:r>
+              <w:rPr>
+                <w:b w:val="false"/>
+                <w:bCs w:val="false"/>
+                <w:color w:val="1A1A1A"/>
+                <w:sz w:val="18"/>
+                <w:szCs w:val="18"/>
+              </w:rPr>
+              <w:t xml:space="preserve">A test device + dashboard access</w:t>
+            </w:r>
+          </w:p>
+        </w:tc>
+        <w:tc>
+          <w:tcPr>
+            <w:tcW w:type="dxa" w:w="1360"/>
+            <w:shd w:fill="F2F5F9" w:color="auto" w:val="clear"/>
+            <w:tcMar>
+              <w:top w:type="dxa" w:w="60"/>
+              <w:left w:type="dxa" w:w="90"/>
+              <w:bottom w:type="dxa" w:w="60"/>
+              <w:right w:type="dxa" w:w="90"/>
+            </w:tcMar>
+          </w:tcPr>
+          <w:p>
+            <w:pPr>
+              <w:jc w:val="left"/>
+            </w:pPr>
+            <w:r>
+              <w:rPr>
+                <w:b w:val="false"/>
+                <w:bCs w:val="false"/>
+                <w:color w:val="1A1A1A"/>
+                <w:sz w:val="18"/>
+                <w:szCs w:val="18"/>
+              </w:rPr>
+              <w:t xml:space="preserve">~5 (~13%)</w:t>
+            </w:r>
+          </w:p>
+        </w:tc>
+        <w:tc>
+          <w:tcPr>
+            <w:tcW w:type="dxa" w:w="3900"/>
+            <w:shd w:fill="F2F5F9" w:color="auto" w:val="clear"/>
+            <w:tcMar>
+              <w:top w:type="dxa" w:w="60"/>
+              <w:left w:type="dxa" w:w="90"/>
+              <w:bottom w:type="dxa" w:w="60"/>
+              <w:right w:type="dxa" w:w="90"/>
+            </w:tcMar>
+          </w:tcPr>
+          <w:p>
+            <w:pPr>
+              <w:jc w:val="left"/>
+            </w:pPr>
+            <w:r>
+              <w:rPr>
+                <w:b w:val="false"/>
+                <w:bCs w:val="false"/>
+                <w:color w:val="1A1A1A"/>
+                <w:sz w:val="18"/>
+                <w:szCs w:val="18"/>
+              </w:rPr>
+              <w:t xml:space="preserve">Push received in killed / background / foreground state, splash-screen exclusion, deep-link landing on the correct screen</w:t>
+            </w:r>
+          </w:p>
+        </w:tc>
+      </w:tr>
+    </w:tbl>
+    <w:p>
+      <w:pPr>
+        <w:spacing w:after="100"/>
+      </w:pPr>
+      <w:r>
+        <w:rPr>
+          <w:b/>
+          <w:bCs/>
+          <w:sz w:val="20"/>
+          <w:szCs w:val="20"/>
+        </w:rPr>
+        <w:t xml:space="preserve">Coverage summary: </w:t>
+      </w:r>
+      <w:r>
+        <w:rPr>
+          <w:sz w:val="20"/>
+          <w:szCs w:val="20"/>
+        </w:rPr>
+        <w:t xml:space="preserve">The API Verifier alone tests ~74% of the checklist with no source code. Add the Web Crawler (web) and Static Scanner (app config) and the three engines together cover ~87%. Only ~13% is truly manual.</w:t>
+      </w:r>
+    </w:p>
+    <w:p>
+      <w:pPr>
+        <w:spacing w:after="100"/>
+      </w:pPr>
+      <w:r>
+        <w:rPr>
+          <w:b/>
+          <w:bCs/>
+          <w:sz w:val="20"/>
+          <w:szCs w:val="20"/>
+        </w:rPr>
+        <w:t xml:space="preserve">App vs Web split: </w:t>
+      </w:r>
+      <w:r>
+        <w:rPr>
+          <w:sz w:val="20"/>
+          <w:szCs w:val="20"/>
+        </w:rPr>
+        <w:t xml:space="preserve">App (27 items) — ~19 API-testable, ~6 static-only config, 4 manual-only. Web (12 items) — Web Crawler + API together cover 11 of 12; only the deep-link landing page stays manual.</w:t>
+      </w:r>
+    </w:p>
+    <w:p>
+      <w:pPr>
+        <w:spacing w:after="100"/>
+      </w:pPr>
+      <w:r>
+        <w:rPr>
+          <w:b/>
+          <w:bCs/>
+          <w:sz w:val="20"/>
+          <w:szCs w:val="20"/>
+        </w:rPr>
+        <w:t xml:space="preserve">The ~5 items no engine can test: </w:t>
+      </w:r>
+      <w:r>
+        <w:rPr>
+          <w:sz w:val="20"/>
+          <w:szCs w:val="20"/>
+        </w:rPr>
+        <w:t xml:space="preserve">push received in killed / background / foreground state, in-app splash exclusion, and deep-link landing on the right screen — all 'what happened on the physical screen', for which no account signal exists.</w:t>
+      </w:r>
+    </w:p>
+    <w:p>
+      <w:r>
+        <w:br w:type="page"/>
+      </w:r>
+    </w:p>
+    <w:p>
+      <w:pPr>
+        <w:pStyle w:val="Heading1"/>
+        <w:spacing w:after="120" w:before="260"/>
+      </w:pPr>
+      <w:r>
+        <w:rPr>
+          <w:b/>
+          <w:bCs/>
+          <w:color w:val="1F5FA8"/>
+          <w:sz w:val="30"/>
+          <w:szCs w:val="30"/>
+        </w:rPr>
+        <w:t xml:space="preserve">6.  User Flow</w:t>
       </w:r>
     </w:p>
     <w:p>
@@ -1943,7 +2611,7 @@
           <w:sz w:val="30"/>
           <w:szCs w:val="30"/>
         </w:rPr>
-        <w:t xml:space="preserve">6.  Architecture</w:t>
+        <w:t xml:space="preserve">7.  Architecture</w:t>
       </w:r>
     </w:p>
     <w:tbl>
@@ -2665,7 +3333,7 @@
           <w:sz w:val="30"/>
           <w:szCs w:val="30"/>
         </w:rPr>
-        <w:t xml:space="preserve">7.  Recommended Tech Stack</w:t>
+        <w:t xml:space="preserve">8.  Recommended Tech Stack</w:t>
       </w:r>
     </w:p>
     <w:tbl>
@@ -3093,7 +3761,7 @@
           <w:sz w:val="30"/>
           <w:szCs w:val="30"/>
         </w:rPr>
-        <w:t xml:space="preserve">8.  Security &amp; Privacy (important for official use)</w:t>
+        <w:t xml:space="preserve">9.  Security &amp; Privacy (important for official use)</w:t>
       </w:r>
     </w:p>
     <w:p>
@@ -3182,7 +3850,7 @@
           <w:sz w:val="30"/>
           <w:szCs w:val="30"/>
         </w:rPr>
-        <w:t xml:space="preserve">9.  What We Need From CleverTap (questions to raise)</w:t>
+        <w:t xml:space="preserve">10.  What We Need From CleverTap (questions to raise)</w:t>
       </w:r>
     </w:p>
     <w:p>
@@ -4554,7 +5222,7 @@
           <w:sz w:val="30"/>
           <w:szCs w:val="30"/>
         </w:rPr>
-        <w:t xml:space="preserve">10.  The 3 Questions That Matter Most</w:t>
+        <w:t xml:space="preserve">11.  The 3 Questions That Matter Most</w:t>
       </w:r>
     </w:p>
     <w:p>
@@ -4678,7 +5346,7 @@
           <w:sz w:val="30"/>
           <w:szCs w:val="30"/>
         </w:rPr>
-        <w:t xml:space="preserve">11.  Appendix — CleverTap API Reference (for the Verifier)</w:t>
+        <w:t xml:space="preserve">12.  Appendix — CleverTap API Reference (for the Verifier)</w:t>
       </w:r>
     </w:p>
     <w:p>

</xml_diff>

<commit_message>
docs: update CleverTap Audit Tool proposal
</commit_message>
<xml_diff>
--- a/CleverTap-Audit-Tool-Proposal.docx
+++ b/CleverTap-Audit-Tool-Proposal.docx
@@ -6168,6 +6168,4894 @@
         <w:t xml:space="preserve">endpoints above are confirmed from developer.clevertap.com. Rate limits apply (e.g. /1/targets/create.json ~3 req/s; identity sends ~1000 users/request) — the Verifier should sample, not bulk-scan.</w:t>
       </w:r>
     </w:p>
+    <w:p>
+      <w:r>
+        <w:br w:type="page"/>
+      </w:r>
+    </w:p>
+    <w:p>
+      <w:pPr>
+        <w:pStyle w:val="Heading1"/>
+        <w:spacing w:after="120" w:before="260"/>
+      </w:pPr>
+      <w:r>
+        <w:rPr>
+          <w:b/>
+          <w:bCs/>
+          <w:color w:val="1F5FA8"/>
+          <w:sz w:val="30"/>
+          <w:szCs w:val="30"/>
+        </w:rPr>
+        <w:t xml:space="preserve">13.  Appendix — Full Coverage Matrix (every item x method)</w:t>
+      </w:r>
+    </w:p>
+    <w:p>
+      <w:pPr>
+        <w:spacing w:after="100"/>
+      </w:pPr>
+      <w:r>
+        <w:rPr>
+          <w:b/>
+          <w:bCs/>
+          <w:sz w:val="18"/>
+          <w:szCs w:val="18"/>
+        </w:rPr>
+        <w:t xml:space="preserve">Legend:  </w:t>
+      </w:r>
+      <w:r>
+        <w:rPr>
+          <w:b/>
+          <w:bCs/>
+          <w:color w:val="16A34A"/>
+          <w:sz w:val="18"/>
+          <w:szCs w:val="18"/>
+        </w:rPr>
+        <w:t xml:space="preserve">✓</w:t>
+      </w:r>
+      <w:r>
+        <w:rPr>
+          <w:sz w:val="18"/>
+          <w:szCs w:val="18"/>
+        </w:rPr>
+        <w:t xml:space="preserve"> = can verify    </w:t>
+      </w:r>
+      <w:r>
+        <w:rPr>
+          <w:b/>
+          <w:bCs/>
+          <w:color w:val="D97706"/>
+          <w:sz w:val="18"/>
+          <w:szCs w:val="18"/>
+        </w:rPr>
+        <w:t xml:space="preserve">~</w:t>
+      </w:r>
+      <w:r>
+        <w:rPr>
+          <w:sz w:val="18"/>
+          <w:szCs w:val="18"/>
+        </w:rPr>
+        <w:t xml:space="preserve"> = partial / corroborates    blank = not by this method.</w:t>
+      </w:r>
+    </w:p>
+    <w:p>
+      <w:pPr>
+        <w:spacing w:after="80" w:before="120"/>
+      </w:pPr>
+      <w:r>
+        <w:rPr>
+          <w:b/>
+          <w:bCs/>
+          <w:color w:val="1A1A1A"/>
+          <w:sz w:val="20"/>
+          <w:szCs w:val="20"/>
+        </w:rPr>
+        <w:t xml:space="preserve">App checklist (APK / IPA) — 27 items</w:t>
+      </w:r>
+    </w:p>
+    <w:tbl>
+      <w:tblPr>
+        <w:tblW w:type="dxa" w:w="9360"/>
+        <w:tblBorders>
+          <w:top w:val="single" w:color="auto" w:sz="4"/>
+          <w:left w:val="single" w:color="auto" w:sz="4"/>
+          <w:bottom w:val="single" w:color="auto" w:sz="4"/>
+          <w:right w:val="single" w:color="auto" w:sz="4"/>
+          <w:insideH w:val="single" w:color="auto" w:sz="4"/>
+          <w:insideV w:val="single" w:color="auto" w:sz="4"/>
+        </w:tblBorders>
+      </w:tblPr>
+      <w:tblGrid>
+        <w:gridCol w:w="5400"/>
+        <w:gridCol w:w="1320"/>
+        <w:gridCol w:w="1320"/>
+        <w:gridCol w:w="1320"/>
+      </w:tblGrid>
+      <w:tr>
+        <w:trPr>
+          <w:tblHeader/>
+        </w:trPr>
+        <w:tc>
+          <w:tcPr>
+            <w:tcW w:type="dxa" w:w="5400"/>
+            <w:shd w:fill="1F5FA8" w:color="auto" w:val="clear"/>
+            <w:tcMar>
+              <w:top w:type="dxa" w:w="50"/>
+              <w:left w:type="dxa" w:w="70"/>
+              <w:bottom w:type="dxa" w:w="50"/>
+              <w:right w:type="dxa" w:w="70"/>
+            </w:tcMar>
+          </w:tcPr>
+          <w:p>
+            <w:pPr>
+              <w:jc w:val="left"/>
+            </w:pPr>
+            <w:r>
+              <w:rPr>
+                <w:b/>
+                <w:bCs/>
+                <w:color w:val="FFFFFF"/>
+                <w:sz w:val="17"/>
+                <w:szCs w:val="17"/>
+              </w:rPr>
+              <w:t xml:space="preserve">Checklist item</w:t>
+            </w:r>
+          </w:p>
+        </w:tc>
+        <w:tc>
+          <w:tcPr>
+            <w:tcW w:type="dxa" w:w="1320"/>
+            <w:shd w:fill="1F5FA8" w:color="auto" w:val="clear"/>
+            <w:tcMar>
+              <w:top w:type="dxa" w:w="50"/>
+              <w:left w:type="dxa" w:w="70"/>
+              <w:bottom w:type="dxa" w:w="50"/>
+              <w:right w:type="dxa" w:w="70"/>
+            </w:tcMar>
+          </w:tcPr>
+          <w:p>
+            <w:pPr>
+              <w:jc w:val="center"/>
+            </w:pPr>
+            <w:r>
+              <w:rPr>
+                <w:b/>
+                <w:bCs/>
+                <w:color w:val="FFFFFF"/>
+                <w:sz w:val="17"/>
+                <w:szCs w:val="17"/>
+              </w:rPr>
+              <w:t xml:space="preserve">API</w:t>
+            </w:r>
+          </w:p>
+        </w:tc>
+        <w:tc>
+          <w:tcPr>
+            <w:tcW w:type="dxa" w:w="1320"/>
+            <w:shd w:fill="1F5FA8" w:color="auto" w:val="clear"/>
+            <w:tcMar>
+              <w:top w:type="dxa" w:w="50"/>
+              <w:left w:type="dxa" w:w="70"/>
+              <w:bottom w:type="dxa" w:w="50"/>
+              <w:right w:type="dxa" w:w="70"/>
+            </w:tcMar>
+          </w:tcPr>
+          <w:p>
+            <w:pPr>
+              <w:jc w:val="center"/>
+            </w:pPr>
+            <w:r>
+              <w:rPr>
+                <w:b/>
+                <w:bCs/>
+                <w:color w:val="FFFFFF"/>
+                <w:sz w:val="17"/>
+                <w:szCs w:val="17"/>
+              </w:rPr>
+              <w:t xml:space="preserve">Static (APK/IPA)</w:t>
+            </w:r>
+          </w:p>
+        </w:tc>
+        <w:tc>
+          <w:tcPr>
+            <w:tcW w:type="dxa" w:w="1320"/>
+            <w:shd w:fill="1F5FA8" w:color="auto" w:val="clear"/>
+            <w:tcMar>
+              <w:top w:type="dxa" w:w="50"/>
+              <w:left w:type="dxa" w:w="70"/>
+              <w:bottom w:type="dxa" w:w="50"/>
+              <w:right w:type="dxa" w:w="70"/>
+            </w:tcMar>
+          </w:tcPr>
+          <w:p>
+            <w:pPr>
+              <w:jc w:val="center"/>
+            </w:pPr>
+            <w:r>
+              <w:rPr>
+                <w:b/>
+                <w:bCs/>
+                <w:color w:val="FFFFFF"/>
+                <w:sz w:val="17"/>
+                <w:szCs w:val="17"/>
+              </w:rPr>
+              <w:t xml:space="preserve">Manual</w:t>
+            </w:r>
+          </w:p>
+        </w:tc>
+      </w:tr>
+      <w:tr>
+        <w:tc>
+          <w:tcPr>
+            <w:tcW w:type="dxa" w:w="5400"/>
+            <w:shd w:fill="FFFFFF" w:color="auto" w:val="clear"/>
+            <w:tcMar>
+              <w:top w:type="dxa" w:w="50"/>
+              <w:left w:type="dxa" w:w="80"/>
+              <w:bottom w:type="dxa" w:w="50"/>
+              <w:right w:type="dxa" w:w="80"/>
+            </w:tcMar>
+          </w:tcPr>
+          <w:p>
+            <w:r>
+              <w:rPr>
+                <w:b w:val="false"/>
+                <w:bCs w:val="false"/>
+                <w:color w:val="1A1A1A"/>
+                <w:sz w:val="17"/>
+                <w:szCs w:val="17"/>
+              </w:rPr>
+              <w:t xml:space="preserve">T1 · App Installed event</w:t>
+            </w:r>
+          </w:p>
+        </w:tc>
+        <w:tc>
+          <w:tcPr>
+            <w:tcW w:type="dxa" w:w="1320"/>
+            <w:shd w:fill="FFFFFF" w:color="auto" w:val="clear"/>
+            <w:tcMar>
+              <w:top w:type="dxa" w:w="50"/>
+              <w:left w:type="dxa" w:w="60"/>
+              <w:bottom w:type="dxa" w:w="50"/>
+              <w:right w:type="dxa" w:w="60"/>
+            </w:tcMar>
+          </w:tcPr>
+          <w:p>
+            <w:pPr>
+              <w:jc w:val="center"/>
+            </w:pPr>
+            <w:r>
+              <w:rPr>
+                <w:b/>
+                <w:bCs/>
+                <w:color w:val="16A34A"/>
+                <w:sz w:val="18"/>
+                <w:szCs w:val="18"/>
+              </w:rPr>
+              <w:t xml:space="preserve">✓</w:t>
+            </w:r>
+          </w:p>
+        </w:tc>
+        <w:tc>
+          <w:tcPr>
+            <w:tcW w:type="dxa" w:w="1320"/>
+            <w:shd w:fill="FFFFFF" w:color="auto" w:val="clear"/>
+            <w:tcMar>
+              <w:top w:type="dxa" w:w="50"/>
+              <w:left w:type="dxa" w:w="60"/>
+              <w:bottom w:type="dxa" w:w="50"/>
+              <w:right w:type="dxa" w:w="60"/>
+            </w:tcMar>
+          </w:tcPr>
+          <w:p>
+            <w:pPr>
+              <w:jc w:val="center"/>
+            </w:pPr>
+            <w:r>
+              <w:rPr>
+                <w:b/>
+                <w:bCs/>
+                <w:color w:val="1A1A1A"/>
+                <w:sz w:val="18"/>
+                <w:szCs w:val="18"/>
+              </w:rPr>
+              <w:t xml:space="preserve"/>
+            </w:r>
+          </w:p>
+        </w:tc>
+        <w:tc>
+          <w:tcPr>
+            <w:tcW w:type="dxa" w:w="1320"/>
+            <w:shd w:fill="FFFFFF" w:color="auto" w:val="clear"/>
+            <w:tcMar>
+              <w:top w:type="dxa" w:w="50"/>
+              <w:left w:type="dxa" w:w="60"/>
+              <w:bottom w:type="dxa" w:w="50"/>
+              <w:right w:type="dxa" w:w="60"/>
+            </w:tcMar>
+          </w:tcPr>
+          <w:p>
+            <w:pPr>
+              <w:jc w:val="center"/>
+            </w:pPr>
+            <w:r>
+              <w:rPr>
+                <w:b/>
+                <w:bCs/>
+                <w:color w:val="1A1A1A"/>
+                <w:sz w:val="18"/>
+                <w:szCs w:val="18"/>
+              </w:rPr>
+              <w:t xml:space="preserve"/>
+            </w:r>
+          </w:p>
+        </w:tc>
+      </w:tr>
+      <w:tr>
+        <w:tc>
+          <w:tcPr>
+            <w:tcW w:type="dxa" w:w="5400"/>
+            <w:shd w:fill="F2F5F9" w:color="auto" w:val="clear"/>
+            <w:tcMar>
+              <w:top w:type="dxa" w:w="50"/>
+              <w:left w:type="dxa" w:w="80"/>
+              <w:bottom w:type="dxa" w:w="50"/>
+              <w:right w:type="dxa" w:w="80"/>
+            </w:tcMar>
+          </w:tcPr>
+          <w:p>
+            <w:r>
+              <w:rPr>
+                <w:b w:val="false"/>
+                <w:bCs w:val="false"/>
+                <w:color w:val="1A1A1A"/>
+                <w:sz w:val="17"/>
+                <w:szCs w:val="17"/>
+              </w:rPr>
+              <w:t xml:space="preserve">T1 · App Launched event</w:t>
+            </w:r>
+          </w:p>
+        </w:tc>
+        <w:tc>
+          <w:tcPr>
+            <w:tcW w:type="dxa" w:w="1320"/>
+            <w:shd w:fill="F2F5F9" w:color="auto" w:val="clear"/>
+            <w:tcMar>
+              <w:top w:type="dxa" w:w="50"/>
+              <w:left w:type="dxa" w:w="60"/>
+              <w:bottom w:type="dxa" w:w="50"/>
+              <w:right w:type="dxa" w:w="60"/>
+            </w:tcMar>
+          </w:tcPr>
+          <w:p>
+            <w:pPr>
+              <w:jc w:val="center"/>
+            </w:pPr>
+            <w:r>
+              <w:rPr>
+                <w:b/>
+                <w:bCs/>
+                <w:color w:val="16A34A"/>
+                <w:sz w:val="18"/>
+                <w:szCs w:val="18"/>
+              </w:rPr>
+              <w:t xml:space="preserve">✓</w:t>
+            </w:r>
+          </w:p>
+        </w:tc>
+        <w:tc>
+          <w:tcPr>
+            <w:tcW w:type="dxa" w:w="1320"/>
+            <w:shd w:fill="F2F5F9" w:color="auto" w:val="clear"/>
+            <w:tcMar>
+              <w:top w:type="dxa" w:w="50"/>
+              <w:left w:type="dxa" w:w="60"/>
+              <w:bottom w:type="dxa" w:w="50"/>
+              <w:right w:type="dxa" w:w="60"/>
+            </w:tcMar>
+          </w:tcPr>
+          <w:p>
+            <w:pPr>
+              <w:jc w:val="center"/>
+            </w:pPr>
+            <w:r>
+              <w:rPr>
+                <w:b/>
+                <w:bCs/>
+                <w:color w:val="1A1A1A"/>
+                <w:sz w:val="18"/>
+                <w:szCs w:val="18"/>
+              </w:rPr>
+              <w:t xml:space="preserve"/>
+            </w:r>
+          </w:p>
+        </w:tc>
+        <w:tc>
+          <w:tcPr>
+            <w:tcW w:type="dxa" w:w="1320"/>
+            <w:shd w:fill="F2F5F9" w:color="auto" w:val="clear"/>
+            <w:tcMar>
+              <w:top w:type="dxa" w:w="50"/>
+              <w:left w:type="dxa" w:w="60"/>
+              <w:bottom w:type="dxa" w:w="50"/>
+              <w:right w:type="dxa" w:w="60"/>
+            </w:tcMar>
+          </w:tcPr>
+          <w:p>
+            <w:pPr>
+              <w:jc w:val="center"/>
+            </w:pPr>
+            <w:r>
+              <w:rPr>
+                <w:b/>
+                <w:bCs/>
+                <w:color w:val="1A1A1A"/>
+                <w:sz w:val="18"/>
+                <w:szCs w:val="18"/>
+              </w:rPr>
+              <w:t xml:space="preserve"/>
+            </w:r>
+          </w:p>
+        </w:tc>
+      </w:tr>
+      <w:tr>
+        <w:tc>
+          <w:tcPr>
+            <w:tcW w:type="dxa" w:w="5400"/>
+            <w:shd w:fill="FFFFFF" w:color="auto" w:val="clear"/>
+            <w:tcMar>
+              <w:top w:type="dxa" w:w="50"/>
+              <w:left w:type="dxa" w:w="80"/>
+              <w:bottom w:type="dxa" w:w="50"/>
+              <w:right w:type="dxa" w:w="80"/>
+            </w:tcMar>
+          </w:tcPr>
+          <w:p>
+            <w:r>
+              <w:rPr>
+                <w:b w:val="false"/>
+                <w:bCs w:val="false"/>
+                <w:color w:val="1A1A1A"/>
+                <w:sz w:val="17"/>
+                <w:szCs w:val="17"/>
+              </w:rPr>
+              <w:t xml:space="preserve">T1 · Latest SDK version</w:t>
+            </w:r>
+          </w:p>
+        </w:tc>
+        <w:tc>
+          <w:tcPr>
+            <w:tcW w:type="dxa" w:w="1320"/>
+            <w:shd w:fill="FFFFFF" w:color="auto" w:val="clear"/>
+            <w:tcMar>
+              <w:top w:type="dxa" w:w="50"/>
+              <w:left w:type="dxa" w:w="60"/>
+              <w:bottom w:type="dxa" w:w="50"/>
+              <w:right w:type="dxa" w:w="60"/>
+            </w:tcMar>
+          </w:tcPr>
+          <w:p>
+            <w:pPr>
+              <w:jc w:val="center"/>
+            </w:pPr>
+            <w:r>
+              <w:rPr>
+                <w:b/>
+                <w:bCs/>
+                <w:color w:val="D97706"/>
+                <w:sz w:val="18"/>
+                <w:szCs w:val="18"/>
+              </w:rPr>
+              <w:t xml:space="preserve">~</w:t>
+            </w:r>
+          </w:p>
+        </w:tc>
+        <w:tc>
+          <w:tcPr>
+            <w:tcW w:type="dxa" w:w="1320"/>
+            <w:shd w:fill="FFFFFF" w:color="auto" w:val="clear"/>
+            <w:tcMar>
+              <w:top w:type="dxa" w:w="50"/>
+              <w:left w:type="dxa" w:w="60"/>
+              <w:bottom w:type="dxa" w:w="50"/>
+              <w:right w:type="dxa" w:w="60"/>
+            </w:tcMar>
+          </w:tcPr>
+          <w:p>
+            <w:pPr>
+              <w:jc w:val="center"/>
+            </w:pPr>
+            <w:r>
+              <w:rPr>
+                <w:b/>
+                <w:bCs/>
+                <w:color w:val="16A34A"/>
+                <w:sz w:val="18"/>
+                <w:szCs w:val="18"/>
+              </w:rPr>
+              <w:t xml:space="preserve">✓</w:t>
+            </w:r>
+          </w:p>
+        </w:tc>
+        <w:tc>
+          <w:tcPr>
+            <w:tcW w:type="dxa" w:w="1320"/>
+            <w:shd w:fill="FFFFFF" w:color="auto" w:val="clear"/>
+            <w:tcMar>
+              <w:top w:type="dxa" w:w="50"/>
+              <w:left w:type="dxa" w:w="60"/>
+              <w:bottom w:type="dxa" w:w="50"/>
+              <w:right w:type="dxa" w:w="60"/>
+            </w:tcMar>
+          </w:tcPr>
+          <w:p>
+            <w:pPr>
+              <w:jc w:val="center"/>
+            </w:pPr>
+            <w:r>
+              <w:rPr>
+                <w:b/>
+                <w:bCs/>
+                <w:color w:val="1A1A1A"/>
+                <w:sz w:val="18"/>
+                <w:szCs w:val="18"/>
+              </w:rPr>
+              <w:t xml:space="preserve"/>
+            </w:r>
+          </w:p>
+        </w:tc>
+      </w:tr>
+      <w:tr>
+        <w:tc>
+          <w:tcPr>
+            <w:tcW w:type="dxa" w:w="5400"/>
+            <w:shd w:fill="F2F5F9" w:color="auto" w:val="clear"/>
+            <w:tcMar>
+              <w:top w:type="dxa" w:w="50"/>
+              <w:left w:type="dxa" w:w="80"/>
+              <w:bottom w:type="dxa" w:w="50"/>
+              <w:right w:type="dxa" w:w="80"/>
+            </w:tcMar>
+          </w:tcPr>
+          <w:p>
+            <w:r>
+              <w:rPr>
+                <w:b w:val="false"/>
+                <w:bCs w:val="false"/>
+                <w:color w:val="1A1A1A"/>
+                <w:sz w:val="17"/>
+                <w:szCs w:val="17"/>
+              </w:rPr>
+              <w:t xml:space="preserve">T1 · Push notification channel (Android)</w:t>
+            </w:r>
+          </w:p>
+        </w:tc>
+        <w:tc>
+          <w:tcPr>
+            <w:tcW w:type="dxa" w:w="1320"/>
+            <w:shd w:fill="F2F5F9" w:color="auto" w:val="clear"/>
+            <w:tcMar>
+              <w:top w:type="dxa" w:w="50"/>
+              <w:left w:type="dxa" w:w="60"/>
+              <w:bottom w:type="dxa" w:w="50"/>
+              <w:right w:type="dxa" w:w="60"/>
+            </w:tcMar>
+          </w:tcPr>
+          <w:p>
+            <w:pPr>
+              <w:jc w:val="center"/>
+            </w:pPr>
+            <w:r>
+              <w:rPr>
+                <w:b/>
+                <w:bCs/>
+                <w:color w:val="1A1A1A"/>
+                <w:sz w:val="18"/>
+                <w:szCs w:val="18"/>
+              </w:rPr>
+              <w:t xml:space="preserve"/>
+            </w:r>
+          </w:p>
+        </w:tc>
+        <w:tc>
+          <w:tcPr>
+            <w:tcW w:type="dxa" w:w="1320"/>
+            <w:shd w:fill="F2F5F9" w:color="auto" w:val="clear"/>
+            <w:tcMar>
+              <w:top w:type="dxa" w:w="50"/>
+              <w:left w:type="dxa" w:w="60"/>
+              <w:bottom w:type="dxa" w:w="50"/>
+              <w:right w:type="dxa" w:w="60"/>
+            </w:tcMar>
+          </w:tcPr>
+          <w:p>
+            <w:pPr>
+              <w:jc w:val="center"/>
+            </w:pPr>
+            <w:r>
+              <w:rPr>
+                <w:b/>
+                <w:bCs/>
+                <w:color w:val="16A34A"/>
+                <w:sz w:val="18"/>
+                <w:szCs w:val="18"/>
+              </w:rPr>
+              <w:t xml:space="preserve">✓</w:t>
+            </w:r>
+          </w:p>
+        </w:tc>
+        <w:tc>
+          <w:tcPr>
+            <w:tcW w:type="dxa" w:w="1320"/>
+            <w:shd w:fill="F2F5F9" w:color="auto" w:val="clear"/>
+            <w:tcMar>
+              <w:top w:type="dxa" w:w="50"/>
+              <w:left w:type="dxa" w:w="60"/>
+              <w:bottom w:type="dxa" w:w="50"/>
+              <w:right w:type="dxa" w:w="60"/>
+            </w:tcMar>
+          </w:tcPr>
+          <w:p>
+            <w:pPr>
+              <w:jc w:val="center"/>
+            </w:pPr>
+            <w:r>
+              <w:rPr>
+                <w:b/>
+                <w:bCs/>
+                <w:color w:val="1A1A1A"/>
+                <w:sz w:val="18"/>
+                <w:szCs w:val="18"/>
+              </w:rPr>
+              <w:t xml:space="preserve"/>
+            </w:r>
+          </w:p>
+        </w:tc>
+      </w:tr>
+      <w:tr>
+        <w:tc>
+          <w:tcPr>
+            <w:tcW w:type="dxa" w:w="5400"/>
+            <w:shd w:fill="FFFFFF" w:color="auto" w:val="clear"/>
+            <w:tcMar>
+              <w:top w:type="dxa" w:w="50"/>
+              <w:left w:type="dxa" w:w="80"/>
+              <w:bottom w:type="dxa" w:w="50"/>
+              <w:right w:type="dxa" w:w="80"/>
+            </w:tcMar>
+          </w:tcPr>
+          <w:p>
+            <w:r>
+              <w:rPr>
+                <w:b w:val="false"/>
+                <w:bCs w:val="false"/>
+                <w:color w:val="1A1A1A"/>
+                <w:sz w:val="17"/>
+                <w:szCs w:val="17"/>
+              </w:rPr>
+              <w:t xml:space="preserve">T1 · Identity / email / phone passed</w:t>
+            </w:r>
+          </w:p>
+        </w:tc>
+        <w:tc>
+          <w:tcPr>
+            <w:tcW w:type="dxa" w:w="1320"/>
+            <w:shd w:fill="FFFFFF" w:color="auto" w:val="clear"/>
+            <w:tcMar>
+              <w:top w:type="dxa" w:w="50"/>
+              <w:left w:type="dxa" w:w="60"/>
+              <w:bottom w:type="dxa" w:w="50"/>
+              <w:right w:type="dxa" w:w="60"/>
+            </w:tcMar>
+          </w:tcPr>
+          <w:p>
+            <w:pPr>
+              <w:jc w:val="center"/>
+            </w:pPr>
+            <w:r>
+              <w:rPr>
+                <w:b/>
+                <w:bCs/>
+                <w:color w:val="16A34A"/>
+                <w:sz w:val="18"/>
+                <w:szCs w:val="18"/>
+              </w:rPr>
+              <w:t xml:space="preserve">✓</w:t>
+            </w:r>
+          </w:p>
+        </w:tc>
+        <w:tc>
+          <w:tcPr>
+            <w:tcW w:type="dxa" w:w="1320"/>
+            <w:shd w:fill="FFFFFF" w:color="auto" w:val="clear"/>
+            <w:tcMar>
+              <w:top w:type="dxa" w:w="50"/>
+              <w:left w:type="dxa" w:w="60"/>
+              <w:bottom w:type="dxa" w:w="50"/>
+              <w:right w:type="dxa" w:w="60"/>
+            </w:tcMar>
+          </w:tcPr>
+          <w:p>
+            <w:pPr>
+              <w:jc w:val="center"/>
+            </w:pPr>
+            <w:r>
+              <w:rPr>
+                <w:b/>
+                <w:bCs/>
+                <w:color w:val="1A1A1A"/>
+                <w:sz w:val="18"/>
+                <w:szCs w:val="18"/>
+              </w:rPr>
+              <w:t xml:space="preserve"/>
+            </w:r>
+          </w:p>
+        </w:tc>
+        <w:tc>
+          <w:tcPr>
+            <w:tcW w:type="dxa" w:w="1320"/>
+            <w:shd w:fill="FFFFFF" w:color="auto" w:val="clear"/>
+            <w:tcMar>
+              <w:top w:type="dxa" w:w="50"/>
+              <w:left w:type="dxa" w:w="60"/>
+              <w:bottom w:type="dxa" w:w="50"/>
+              <w:right w:type="dxa" w:w="60"/>
+            </w:tcMar>
+          </w:tcPr>
+          <w:p>
+            <w:pPr>
+              <w:jc w:val="center"/>
+            </w:pPr>
+            <w:r>
+              <w:rPr>
+                <w:b/>
+                <w:bCs/>
+                <w:color w:val="1A1A1A"/>
+                <w:sz w:val="18"/>
+                <w:szCs w:val="18"/>
+              </w:rPr>
+              <w:t xml:space="preserve"/>
+            </w:r>
+          </w:p>
+        </w:tc>
+      </w:tr>
+      <w:tr>
+        <w:tc>
+          <w:tcPr>
+            <w:tcW w:type="dxa" w:w="5400"/>
+            <w:shd w:fill="F2F5F9" w:color="auto" w:val="clear"/>
+            <w:tcMar>
+              <w:top w:type="dxa" w:w="50"/>
+              <w:left w:type="dxa" w:w="80"/>
+              <w:bottom w:type="dxa" w:w="50"/>
+              <w:right w:type="dxa" w:w="80"/>
+            </w:tcMar>
+          </w:tcPr>
+          <w:p>
+            <w:r>
+              <w:rPr>
+                <w:b w:val="false"/>
+                <w:bCs w:val="false"/>
+                <w:color w:val="1A1A1A"/>
+                <w:sz w:val="17"/>
+                <w:szCs w:val="17"/>
+              </w:rPr>
+              <w:t xml:space="preserve">T1 · onUserLogin in registration/login</w:t>
+            </w:r>
+          </w:p>
+        </w:tc>
+        <w:tc>
+          <w:tcPr>
+            <w:tcW w:type="dxa" w:w="1320"/>
+            <w:shd w:fill="F2F5F9" w:color="auto" w:val="clear"/>
+            <w:tcMar>
+              <w:top w:type="dxa" w:w="50"/>
+              <w:left w:type="dxa" w:w="60"/>
+              <w:bottom w:type="dxa" w:w="50"/>
+              <w:right w:type="dxa" w:w="60"/>
+            </w:tcMar>
+          </w:tcPr>
+          <w:p>
+            <w:pPr>
+              <w:jc w:val="center"/>
+            </w:pPr>
+            <w:r>
+              <w:rPr>
+                <w:b/>
+                <w:bCs/>
+                <w:color w:val="16A34A"/>
+                <w:sz w:val="18"/>
+                <w:szCs w:val="18"/>
+              </w:rPr>
+              <w:t xml:space="preserve">✓</w:t>
+            </w:r>
+          </w:p>
+        </w:tc>
+        <w:tc>
+          <w:tcPr>
+            <w:tcW w:type="dxa" w:w="1320"/>
+            <w:shd w:fill="F2F5F9" w:color="auto" w:val="clear"/>
+            <w:tcMar>
+              <w:top w:type="dxa" w:w="50"/>
+              <w:left w:type="dxa" w:w="60"/>
+              <w:bottom w:type="dxa" w:w="50"/>
+              <w:right w:type="dxa" w:w="60"/>
+            </w:tcMar>
+          </w:tcPr>
+          <w:p>
+            <w:pPr>
+              <w:jc w:val="center"/>
+            </w:pPr>
+            <w:r>
+              <w:rPr>
+                <w:b/>
+                <w:bCs/>
+                <w:color w:val="16A34A"/>
+                <w:sz w:val="18"/>
+                <w:szCs w:val="18"/>
+              </w:rPr>
+              <w:t xml:space="preserve">✓</w:t>
+            </w:r>
+          </w:p>
+        </w:tc>
+        <w:tc>
+          <w:tcPr>
+            <w:tcW w:type="dxa" w:w="1320"/>
+            <w:shd w:fill="F2F5F9" w:color="auto" w:val="clear"/>
+            <w:tcMar>
+              <w:top w:type="dxa" w:w="50"/>
+              <w:left w:type="dxa" w:w="60"/>
+              <w:bottom w:type="dxa" w:w="50"/>
+              <w:right w:type="dxa" w:w="60"/>
+            </w:tcMar>
+          </w:tcPr>
+          <w:p>
+            <w:pPr>
+              <w:jc w:val="center"/>
+            </w:pPr>
+            <w:r>
+              <w:rPr>
+                <w:b/>
+                <w:bCs/>
+                <w:color w:val="1A1A1A"/>
+                <w:sz w:val="18"/>
+                <w:szCs w:val="18"/>
+              </w:rPr>
+              <w:t xml:space="preserve"/>
+            </w:r>
+          </w:p>
+        </w:tc>
+      </w:tr>
+      <w:tr>
+        <w:tc>
+          <w:tcPr>
+            <w:tcW w:type="dxa" w:w="5400"/>
+            <w:shd w:fill="FFFFFF" w:color="auto" w:val="clear"/>
+            <w:tcMar>
+              <w:top w:type="dxa" w:w="50"/>
+              <w:left w:type="dxa" w:w="80"/>
+              <w:bottom w:type="dxa" w:w="50"/>
+              <w:right w:type="dxa" w:w="80"/>
+            </w:tcMar>
+          </w:tcPr>
+          <w:p>
+            <w:r>
+              <w:rPr>
+                <w:b w:val="false"/>
+                <w:bCs w:val="false"/>
+                <w:color w:val="1A1A1A"/>
+                <w:sz w:val="17"/>
+                <w:szCs w:val="17"/>
+              </w:rPr>
+              <w:t xml:space="preserve">T1 · onUserLogin on app update</w:t>
+            </w:r>
+          </w:p>
+        </w:tc>
+        <w:tc>
+          <w:tcPr>
+            <w:tcW w:type="dxa" w:w="1320"/>
+            <w:shd w:fill="FFFFFF" w:color="auto" w:val="clear"/>
+            <w:tcMar>
+              <w:top w:type="dxa" w:w="50"/>
+              <w:left w:type="dxa" w:w="60"/>
+              <w:bottom w:type="dxa" w:w="50"/>
+              <w:right w:type="dxa" w:w="60"/>
+            </w:tcMar>
+          </w:tcPr>
+          <w:p>
+            <w:pPr>
+              <w:jc w:val="center"/>
+            </w:pPr>
+            <w:r>
+              <w:rPr>
+                <w:b/>
+                <w:bCs/>
+                <w:color w:val="1A1A1A"/>
+                <w:sz w:val="18"/>
+                <w:szCs w:val="18"/>
+              </w:rPr>
+              <w:t xml:space="preserve"/>
+            </w:r>
+          </w:p>
+        </w:tc>
+        <w:tc>
+          <w:tcPr>
+            <w:tcW w:type="dxa" w:w="1320"/>
+            <w:shd w:fill="FFFFFF" w:color="auto" w:val="clear"/>
+            <w:tcMar>
+              <w:top w:type="dxa" w:w="50"/>
+              <w:left w:type="dxa" w:w="60"/>
+              <w:bottom w:type="dxa" w:w="50"/>
+              <w:right w:type="dxa" w:w="60"/>
+            </w:tcMar>
+          </w:tcPr>
+          <w:p>
+            <w:pPr>
+              <w:jc w:val="center"/>
+            </w:pPr>
+            <w:r>
+              <w:rPr>
+                <w:b/>
+                <w:bCs/>
+                <w:color w:val="16A34A"/>
+                <w:sz w:val="18"/>
+                <w:szCs w:val="18"/>
+              </w:rPr>
+              <w:t xml:space="preserve">✓</w:t>
+            </w:r>
+          </w:p>
+        </w:tc>
+        <w:tc>
+          <w:tcPr>
+            <w:tcW w:type="dxa" w:w="1320"/>
+            <w:shd w:fill="FFFFFF" w:color="auto" w:val="clear"/>
+            <w:tcMar>
+              <w:top w:type="dxa" w:w="50"/>
+              <w:left w:type="dxa" w:w="60"/>
+              <w:bottom w:type="dxa" w:w="50"/>
+              <w:right w:type="dxa" w:w="60"/>
+            </w:tcMar>
+          </w:tcPr>
+          <w:p>
+            <w:pPr>
+              <w:jc w:val="center"/>
+            </w:pPr>
+            <w:r>
+              <w:rPr>
+                <w:b/>
+                <w:bCs/>
+                <w:color w:val="D97706"/>
+                <w:sz w:val="18"/>
+                <w:szCs w:val="18"/>
+              </w:rPr>
+              <w:t xml:space="preserve">~</w:t>
+            </w:r>
+          </w:p>
+        </w:tc>
+      </w:tr>
+      <w:tr>
+        <w:tc>
+          <w:tcPr>
+            <w:tcW w:type="dxa" w:w="5400"/>
+            <w:shd w:fill="F2F5F9" w:color="auto" w:val="clear"/>
+            <w:tcMar>
+              <w:top w:type="dxa" w:w="50"/>
+              <w:left w:type="dxa" w:w="80"/>
+              <w:bottom w:type="dxa" w:w="50"/>
+              <w:right w:type="dxa" w:w="80"/>
+            </w:tcMar>
+          </w:tcPr>
+          <w:p>
+            <w:r>
+              <w:rPr>
+                <w:b w:val="false"/>
+                <w:bCs w:val="false"/>
+                <w:color w:val="1A1A1A"/>
+                <w:sz w:val="17"/>
+                <w:szCs w:val="17"/>
+              </w:rPr>
+              <w:t xml:space="preserve">T1 · Custom events passed</w:t>
+            </w:r>
+          </w:p>
+        </w:tc>
+        <w:tc>
+          <w:tcPr>
+            <w:tcW w:type="dxa" w:w="1320"/>
+            <w:shd w:fill="F2F5F9" w:color="auto" w:val="clear"/>
+            <w:tcMar>
+              <w:top w:type="dxa" w:w="50"/>
+              <w:left w:type="dxa" w:w="60"/>
+              <w:bottom w:type="dxa" w:w="50"/>
+              <w:right w:type="dxa" w:w="60"/>
+            </w:tcMar>
+          </w:tcPr>
+          <w:p>
+            <w:pPr>
+              <w:jc w:val="center"/>
+            </w:pPr>
+            <w:r>
+              <w:rPr>
+                <w:b/>
+                <w:bCs/>
+                <w:color w:val="16A34A"/>
+                <w:sz w:val="18"/>
+                <w:szCs w:val="18"/>
+              </w:rPr>
+              <w:t xml:space="preserve">✓</w:t>
+            </w:r>
+          </w:p>
+        </w:tc>
+        <w:tc>
+          <w:tcPr>
+            <w:tcW w:type="dxa" w:w="1320"/>
+            <w:shd w:fill="F2F5F9" w:color="auto" w:val="clear"/>
+            <w:tcMar>
+              <w:top w:type="dxa" w:w="50"/>
+              <w:left w:type="dxa" w:w="60"/>
+              <w:bottom w:type="dxa" w:w="50"/>
+              <w:right w:type="dxa" w:w="60"/>
+            </w:tcMar>
+          </w:tcPr>
+          <w:p>
+            <w:pPr>
+              <w:jc w:val="center"/>
+            </w:pPr>
+            <w:r>
+              <w:rPr>
+                <w:b/>
+                <w:bCs/>
+                <w:color w:val="1A1A1A"/>
+                <w:sz w:val="18"/>
+                <w:szCs w:val="18"/>
+              </w:rPr>
+              <w:t xml:space="preserve"/>
+            </w:r>
+          </w:p>
+        </w:tc>
+        <w:tc>
+          <w:tcPr>
+            <w:tcW w:type="dxa" w:w="1320"/>
+            <w:shd w:fill="F2F5F9" w:color="auto" w:val="clear"/>
+            <w:tcMar>
+              <w:top w:type="dxa" w:w="50"/>
+              <w:left w:type="dxa" w:w="60"/>
+              <w:bottom w:type="dxa" w:w="50"/>
+              <w:right w:type="dxa" w:w="60"/>
+            </w:tcMar>
+          </w:tcPr>
+          <w:p>
+            <w:pPr>
+              <w:jc w:val="center"/>
+            </w:pPr>
+            <w:r>
+              <w:rPr>
+                <w:b/>
+                <w:bCs/>
+                <w:color w:val="1A1A1A"/>
+                <w:sz w:val="18"/>
+                <w:szCs w:val="18"/>
+              </w:rPr>
+              <w:t xml:space="preserve"/>
+            </w:r>
+          </w:p>
+        </w:tc>
+      </w:tr>
+      <w:tr>
+        <w:tc>
+          <w:tcPr>
+            <w:tcW w:type="dxa" w:w="5400"/>
+            <w:shd w:fill="FFFFFF" w:color="auto" w:val="clear"/>
+            <w:tcMar>
+              <w:top w:type="dxa" w:w="50"/>
+              <w:left w:type="dxa" w:w="80"/>
+              <w:bottom w:type="dxa" w:w="50"/>
+              <w:right w:type="dxa" w:w="80"/>
+            </w:tcMar>
+          </w:tcPr>
+          <w:p>
+            <w:r>
+              <w:rPr>
+                <w:b w:val="false"/>
+                <w:bCs w:val="false"/>
+                <w:color w:val="1A1A1A"/>
+                <w:sz w:val="17"/>
+                <w:szCs w:val="17"/>
+              </w:rPr>
+              <w:t xml:space="preserve">T1 · Device token generated</w:t>
+            </w:r>
+          </w:p>
+        </w:tc>
+        <w:tc>
+          <w:tcPr>
+            <w:tcW w:type="dxa" w:w="1320"/>
+            <w:shd w:fill="FFFFFF" w:color="auto" w:val="clear"/>
+            <w:tcMar>
+              <w:top w:type="dxa" w:w="50"/>
+              <w:left w:type="dxa" w:w="60"/>
+              <w:bottom w:type="dxa" w:w="50"/>
+              <w:right w:type="dxa" w:w="60"/>
+            </w:tcMar>
+          </w:tcPr>
+          <w:p>
+            <w:pPr>
+              <w:jc w:val="center"/>
+            </w:pPr>
+            <w:r>
+              <w:rPr>
+                <w:b/>
+                <w:bCs/>
+                <w:color w:val="16A34A"/>
+                <w:sz w:val="18"/>
+                <w:szCs w:val="18"/>
+              </w:rPr>
+              <w:t xml:space="preserve">✓</w:t>
+            </w:r>
+          </w:p>
+        </w:tc>
+        <w:tc>
+          <w:tcPr>
+            <w:tcW w:type="dxa" w:w="1320"/>
+            <w:shd w:fill="FFFFFF" w:color="auto" w:val="clear"/>
+            <w:tcMar>
+              <w:top w:type="dxa" w:w="50"/>
+              <w:left w:type="dxa" w:w="60"/>
+              <w:bottom w:type="dxa" w:w="50"/>
+              <w:right w:type="dxa" w:w="60"/>
+            </w:tcMar>
+          </w:tcPr>
+          <w:p>
+            <w:pPr>
+              <w:jc w:val="center"/>
+            </w:pPr>
+            <w:r>
+              <w:rPr>
+                <w:b/>
+                <w:bCs/>
+                <w:color w:val="D97706"/>
+                <w:sz w:val="18"/>
+                <w:szCs w:val="18"/>
+              </w:rPr>
+              <w:t xml:space="preserve">~</w:t>
+            </w:r>
+          </w:p>
+        </w:tc>
+        <w:tc>
+          <w:tcPr>
+            <w:tcW w:type="dxa" w:w="1320"/>
+            <w:shd w:fill="FFFFFF" w:color="auto" w:val="clear"/>
+            <w:tcMar>
+              <w:top w:type="dxa" w:w="50"/>
+              <w:left w:type="dxa" w:w="60"/>
+              <w:bottom w:type="dxa" w:w="50"/>
+              <w:right w:type="dxa" w:w="60"/>
+            </w:tcMar>
+          </w:tcPr>
+          <w:p>
+            <w:pPr>
+              <w:jc w:val="center"/>
+            </w:pPr>
+            <w:r>
+              <w:rPr>
+                <w:b/>
+                <w:bCs/>
+                <w:color w:val="1A1A1A"/>
+                <w:sz w:val="18"/>
+                <w:szCs w:val="18"/>
+              </w:rPr>
+              <w:t xml:space="preserve"/>
+            </w:r>
+          </w:p>
+        </w:tc>
+      </w:tr>
+      <w:tr>
+        <w:tc>
+          <w:tcPr>
+            <w:tcW w:type="dxa" w:w="5400"/>
+            <w:shd w:fill="F2F5F9" w:color="auto" w:val="clear"/>
+            <w:tcMar>
+              <w:top w:type="dxa" w:w="50"/>
+              <w:left w:type="dxa" w:w="80"/>
+              <w:bottom w:type="dxa" w:w="50"/>
+              <w:right w:type="dxa" w:w="80"/>
+            </w:tcMar>
+          </w:tcPr>
+          <w:p>
+            <w:r>
+              <w:rPr>
+                <w:b w:val="false"/>
+                <w:bCs w:val="false"/>
+                <w:color w:val="1A1A1A"/>
+                <w:sz w:val="17"/>
+                <w:szCs w:val="17"/>
+              </w:rPr>
+              <w:t xml:space="preserve">T2 · GDPR location</w:t>
+            </w:r>
+          </w:p>
+        </w:tc>
+        <w:tc>
+          <w:tcPr>
+            <w:tcW w:type="dxa" w:w="1320"/>
+            <w:shd w:fill="F2F5F9" w:color="auto" w:val="clear"/>
+            <w:tcMar>
+              <w:top w:type="dxa" w:w="50"/>
+              <w:left w:type="dxa" w:w="60"/>
+              <w:bottom w:type="dxa" w:w="50"/>
+              <w:right w:type="dxa" w:w="60"/>
+            </w:tcMar>
+          </w:tcPr>
+          <w:p>
+            <w:pPr>
+              <w:jc w:val="center"/>
+            </w:pPr>
+            <w:r>
+              <w:rPr>
+                <w:b/>
+                <w:bCs/>
+                <w:color w:val="16A34A"/>
+                <w:sz w:val="18"/>
+                <w:szCs w:val="18"/>
+              </w:rPr>
+              <w:t xml:space="preserve">✓</w:t>
+            </w:r>
+          </w:p>
+        </w:tc>
+        <w:tc>
+          <w:tcPr>
+            <w:tcW w:type="dxa" w:w="1320"/>
+            <w:shd w:fill="F2F5F9" w:color="auto" w:val="clear"/>
+            <w:tcMar>
+              <w:top w:type="dxa" w:w="50"/>
+              <w:left w:type="dxa" w:w="60"/>
+              <w:bottom w:type="dxa" w:w="50"/>
+              <w:right w:type="dxa" w:w="60"/>
+            </w:tcMar>
+          </w:tcPr>
+          <w:p>
+            <w:pPr>
+              <w:jc w:val="center"/>
+            </w:pPr>
+            <w:r>
+              <w:rPr>
+                <w:b/>
+                <w:bCs/>
+                <w:color w:val="16A34A"/>
+                <w:sz w:val="18"/>
+                <w:szCs w:val="18"/>
+              </w:rPr>
+              <w:t xml:space="preserve">✓</w:t>
+            </w:r>
+          </w:p>
+        </w:tc>
+        <w:tc>
+          <w:tcPr>
+            <w:tcW w:type="dxa" w:w="1320"/>
+            <w:shd w:fill="F2F5F9" w:color="auto" w:val="clear"/>
+            <w:tcMar>
+              <w:top w:type="dxa" w:w="50"/>
+              <w:left w:type="dxa" w:w="60"/>
+              <w:bottom w:type="dxa" w:w="50"/>
+              <w:right w:type="dxa" w:w="60"/>
+            </w:tcMar>
+          </w:tcPr>
+          <w:p>
+            <w:pPr>
+              <w:jc w:val="center"/>
+            </w:pPr>
+            <w:r>
+              <w:rPr>
+                <w:b/>
+                <w:bCs/>
+                <w:color w:val="1A1A1A"/>
+                <w:sz w:val="18"/>
+                <w:szCs w:val="18"/>
+              </w:rPr>
+              <w:t xml:space="preserve"/>
+            </w:r>
+          </w:p>
+        </w:tc>
+      </w:tr>
+      <w:tr>
+        <w:tc>
+          <w:tcPr>
+            <w:tcW w:type="dxa" w:w="5400"/>
+            <w:shd w:fill="FFFFFF" w:color="auto" w:val="clear"/>
+            <w:tcMar>
+              <w:top w:type="dxa" w:w="50"/>
+              <w:left w:type="dxa" w:w="80"/>
+              <w:bottom w:type="dxa" w:w="50"/>
+              <w:right w:type="dxa" w:w="80"/>
+            </w:tcMar>
+          </w:tcPr>
+          <w:p>
+            <w:r>
+              <w:rPr>
+                <w:b w:val="false"/>
+                <w:bCs w:val="false"/>
+                <w:color w:val="1A1A1A"/>
+                <w:sz w:val="17"/>
+                <w:szCs w:val="17"/>
+              </w:rPr>
+              <w:t xml:space="preserve">T2 · Check lat &amp; long</w:t>
+            </w:r>
+          </w:p>
+        </w:tc>
+        <w:tc>
+          <w:tcPr>
+            <w:tcW w:type="dxa" w:w="1320"/>
+            <w:shd w:fill="FFFFFF" w:color="auto" w:val="clear"/>
+            <w:tcMar>
+              <w:top w:type="dxa" w:w="50"/>
+              <w:left w:type="dxa" w:w="60"/>
+              <w:bottom w:type="dxa" w:w="50"/>
+              <w:right w:type="dxa" w:w="60"/>
+            </w:tcMar>
+          </w:tcPr>
+          <w:p>
+            <w:pPr>
+              <w:jc w:val="center"/>
+            </w:pPr>
+            <w:r>
+              <w:rPr>
+                <w:b/>
+                <w:bCs/>
+                <w:color w:val="16A34A"/>
+                <w:sz w:val="18"/>
+                <w:szCs w:val="18"/>
+              </w:rPr>
+              <w:t xml:space="preserve">✓</w:t>
+            </w:r>
+          </w:p>
+        </w:tc>
+        <w:tc>
+          <w:tcPr>
+            <w:tcW w:type="dxa" w:w="1320"/>
+            <w:shd w:fill="FFFFFF" w:color="auto" w:val="clear"/>
+            <w:tcMar>
+              <w:top w:type="dxa" w:w="50"/>
+              <w:left w:type="dxa" w:w="60"/>
+              <w:bottom w:type="dxa" w:w="50"/>
+              <w:right w:type="dxa" w:w="60"/>
+            </w:tcMar>
+          </w:tcPr>
+          <w:p>
+            <w:pPr>
+              <w:jc w:val="center"/>
+            </w:pPr>
+            <w:r>
+              <w:rPr>
+                <w:b/>
+                <w:bCs/>
+                <w:color w:val="D97706"/>
+                <w:sz w:val="18"/>
+                <w:szCs w:val="18"/>
+              </w:rPr>
+              <w:t xml:space="preserve">~</w:t>
+            </w:r>
+          </w:p>
+        </w:tc>
+        <w:tc>
+          <w:tcPr>
+            <w:tcW w:type="dxa" w:w="1320"/>
+            <w:shd w:fill="FFFFFF" w:color="auto" w:val="clear"/>
+            <w:tcMar>
+              <w:top w:type="dxa" w:w="50"/>
+              <w:left w:type="dxa" w:w="60"/>
+              <w:bottom w:type="dxa" w:w="50"/>
+              <w:right w:type="dxa" w:w="60"/>
+            </w:tcMar>
+          </w:tcPr>
+          <w:p>
+            <w:pPr>
+              <w:jc w:val="center"/>
+            </w:pPr>
+            <w:r>
+              <w:rPr>
+                <w:b/>
+                <w:bCs/>
+                <w:color w:val="1A1A1A"/>
+                <w:sz w:val="18"/>
+                <w:szCs w:val="18"/>
+              </w:rPr>
+              <w:t xml:space="preserve"/>
+            </w:r>
+          </w:p>
+        </w:tc>
+      </w:tr>
+      <w:tr>
+        <w:tc>
+          <w:tcPr>
+            <w:tcW w:type="dxa" w:w="5400"/>
+            <w:shd w:fill="F2F5F9" w:color="auto" w:val="clear"/>
+            <w:tcMar>
+              <w:top w:type="dxa" w:w="50"/>
+              <w:left w:type="dxa" w:w="80"/>
+              <w:bottom w:type="dxa" w:w="50"/>
+              <w:right w:type="dxa" w:w="80"/>
+            </w:tcMar>
+          </w:tcPr>
+          <w:p>
+            <w:r>
+              <w:rPr>
+                <w:b w:val="false"/>
+                <w:bCs w:val="false"/>
+                <w:color w:val="1A1A1A"/>
+                <w:sz w:val="17"/>
+                <w:szCs w:val="17"/>
+              </w:rPr>
+              <w:t xml:space="preserve">T2 · Anonymous profile before registration</w:t>
+            </w:r>
+          </w:p>
+        </w:tc>
+        <w:tc>
+          <w:tcPr>
+            <w:tcW w:type="dxa" w:w="1320"/>
+            <w:shd w:fill="F2F5F9" w:color="auto" w:val="clear"/>
+            <w:tcMar>
+              <w:top w:type="dxa" w:w="50"/>
+              <w:left w:type="dxa" w:w="60"/>
+              <w:bottom w:type="dxa" w:w="50"/>
+              <w:right w:type="dxa" w:w="60"/>
+            </w:tcMar>
+          </w:tcPr>
+          <w:p>
+            <w:pPr>
+              <w:jc w:val="center"/>
+            </w:pPr>
+            <w:r>
+              <w:rPr>
+                <w:b/>
+                <w:bCs/>
+                <w:color w:val="16A34A"/>
+                <w:sz w:val="18"/>
+                <w:szCs w:val="18"/>
+              </w:rPr>
+              <w:t xml:space="preserve">✓</w:t>
+            </w:r>
+          </w:p>
+        </w:tc>
+        <w:tc>
+          <w:tcPr>
+            <w:tcW w:type="dxa" w:w="1320"/>
+            <w:shd w:fill="F2F5F9" w:color="auto" w:val="clear"/>
+            <w:tcMar>
+              <w:top w:type="dxa" w:w="50"/>
+              <w:left w:type="dxa" w:w="60"/>
+              <w:bottom w:type="dxa" w:w="50"/>
+              <w:right w:type="dxa" w:w="60"/>
+            </w:tcMar>
+          </w:tcPr>
+          <w:p>
+            <w:pPr>
+              <w:jc w:val="center"/>
+            </w:pPr>
+            <w:r>
+              <w:rPr>
+                <w:b/>
+                <w:bCs/>
+                <w:color w:val="1A1A1A"/>
+                <w:sz w:val="18"/>
+                <w:szCs w:val="18"/>
+              </w:rPr>
+              <w:t xml:space="preserve"/>
+            </w:r>
+          </w:p>
+        </w:tc>
+        <w:tc>
+          <w:tcPr>
+            <w:tcW w:type="dxa" w:w="1320"/>
+            <w:shd w:fill="F2F5F9" w:color="auto" w:val="clear"/>
+            <w:tcMar>
+              <w:top w:type="dxa" w:w="50"/>
+              <w:left w:type="dxa" w:w="60"/>
+              <w:bottom w:type="dxa" w:w="50"/>
+              <w:right w:type="dxa" w:w="60"/>
+            </w:tcMar>
+          </w:tcPr>
+          <w:p>
+            <w:pPr>
+              <w:jc w:val="center"/>
+            </w:pPr>
+            <w:r>
+              <w:rPr>
+                <w:b/>
+                <w:bCs/>
+                <w:color w:val="1A1A1A"/>
+                <w:sz w:val="18"/>
+                <w:szCs w:val="18"/>
+              </w:rPr>
+              <w:t xml:space="preserve"/>
+            </w:r>
+          </w:p>
+        </w:tc>
+      </w:tr>
+      <w:tr>
+        <w:tc>
+          <w:tcPr>
+            <w:tcW w:type="dxa" w:w="5400"/>
+            <w:shd w:fill="FFFFFF" w:color="auto" w:val="clear"/>
+            <w:tcMar>
+              <w:top w:type="dxa" w:w="50"/>
+              <w:left w:type="dxa" w:w="80"/>
+              <w:bottom w:type="dxa" w:w="50"/>
+              <w:right w:type="dxa" w:w="80"/>
+            </w:tcMar>
+          </w:tcPr>
+          <w:p>
+            <w:r>
+              <w:rPr>
+                <w:b w:val="false"/>
+                <w:bCs w:val="false"/>
+                <w:color w:val="1A1A1A"/>
+                <w:sz w:val="17"/>
+                <w:szCs w:val="17"/>
+              </w:rPr>
+              <w:t xml:space="preserve">T2 · Phone number format (+91)</w:t>
+            </w:r>
+          </w:p>
+        </w:tc>
+        <w:tc>
+          <w:tcPr>
+            <w:tcW w:type="dxa" w:w="1320"/>
+            <w:shd w:fill="FFFFFF" w:color="auto" w:val="clear"/>
+            <w:tcMar>
+              <w:top w:type="dxa" w:w="50"/>
+              <w:left w:type="dxa" w:w="60"/>
+              <w:bottom w:type="dxa" w:w="50"/>
+              <w:right w:type="dxa" w:w="60"/>
+            </w:tcMar>
+          </w:tcPr>
+          <w:p>
+            <w:pPr>
+              <w:jc w:val="center"/>
+            </w:pPr>
+            <w:r>
+              <w:rPr>
+                <w:b/>
+                <w:bCs/>
+                <w:color w:val="16A34A"/>
+                <w:sz w:val="18"/>
+                <w:szCs w:val="18"/>
+              </w:rPr>
+              <w:t xml:space="preserve">✓</w:t>
+            </w:r>
+          </w:p>
+        </w:tc>
+        <w:tc>
+          <w:tcPr>
+            <w:tcW w:type="dxa" w:w="1320"/>
+            <w:shd w:fill="FFFFFF" w:color="auto" w:val="clear"/>
+            <w:tcMar>
+              <w:top w:type="dxa" w:w="50"/>
+              <w:left w:type="dxa" w:w="60"/>
+              <w:bottom w:type="dxa" w:w="50"/>
+              <w:right w:type="dxa" w:w="60"/>
+            </w:tcMar>
+          </w:tcPr>
+          <w:p>
+            <w:pPr>
+              <w:jc w:val="center"/>
+            </w:pPr>
+            <w:r>
+              <w:rPr>
+                <w:b/>
+                <w:bCs/>
+                <w:color w:val="1A1A1A"/>
+                <w:sz w:val="18"/>
+                <w:szCs w:val="18"/>
+              </w:rPr>
+              <w:t xml:space="preserve"/>
+            </w:r>
+          </w:p>
+        </w:tc>
+        <w:tc>
+          <w:tcPr>
+            <w:tcW w:type="dxa" w:w="1320"/>
+            <w:shd w:fill="FFFFFF" w:color="auto" w:val="clear"/>
+            <w:tcMar>
+              <w:top w:type="dxa" w:w="50"/>
+              <w:left w:type="dxa" w:w="60"/>
+              <w:bottom w:type="dxa" w:w="50"/>
+              <w:right w:type="dxa" w:w="60"/>
+            </w:tcMar>
+          </w:tcPr>
+          <w:p>
+            <w:pPr>
+              <w:jc w:val="center"/>
+            </w:pPr>
+            <w:r>
+              <w:rPr>
+                <w:b/>
+                <w:bCs/>
+                <w:color w:val="1A1A1A"/>
+                <w:sz w:val="18"/>
+                <w:szCs w:val="18"/>
+              </w:rPr>
+              <w:t xml:space="preserve"/>
+            </w:r>
+          </w:p>
+        </w:tc>
+      </w:tr>
+      <w:tr>
+        <w:tc>
+          <w:tcPr>
+            <w:tcW w:type="dxa" w:w="5400"/>
+            <w:shd w:fill="F2F5F9" w:color="auto" w:val="clear"/>
+            <w:tcMar>
+              <w:top w:type="dxa" w:w="50"/>
+              <w:left w:type="dxa" w:w="80"/>
+              <w:bottom w:type="dxa" w:w="50"/>
+              <w:right w:type="dxa" w:w="80"/>
+            </w:tcMar>
+          </w:tcPr>
+          <w:p>
+            <w:r>
+              <w:rPr>
+                <w:b w:val="false"/>
+                <w:bCs w:val="false"/>
+                <w:color w:val="1A1A1A"/>
+                <w:sz w:val="17"/>
+                <w:szCs w:val="17"/>
+              </w:rPr>
+              <w:t xml:space="preserve">T3 · Test push received</w:t>
+            </w:r>
+          </w:p>
+        </w:tc>
+        <w:tc>
+          <w:tcPr>
+            <w:tcW w:type="dxa" w:w="1320"/>
+            <w:shd w:fill="F2F5F9" w:color="auto" w:val="clear"/>
+            <w:tcMar>
+              <w:top w:type="dxa" w:w="50"/>
+              <w:left w:type="dxa" w:w="60"/>
+              <w:bottom w:type="dxa" w:w="50"/>
+              <w:right w:type="dxa" w:w="60"/>
+            </w:tcMar>
+          </w:tcPr>
+          <w:p>
+            <w:pPr>
+              <w:jc w:val="center"/>
+            </w:pPr>
+            <w:r>
+              <w:rPr>
+                <w:b/>
+                <w:bCs/>
+                <w:color w:val="16A34A"/>
+                <w:sz w:val="18"/>
+                <w:szCs w:val="18"/>
+              </w:rPr>
+              <w:t xml:space="preserve">✓</w:t>
+            </w:r>
+          </w:p>
+        </w:tc>
+        <w:tc>
+          <w:tcPr>
+            <w:tcW w:type="dxa" w:w="1320"/>
+            <w:shd w:fill="F2F5F9" w:color="auto" w:val="clear"/>
+            <w:tcMar>
+              <w:top w:type="dxa" w:w="50"/>
+              <w:left w:type="dxa" w:w="60"/>
+              <w:bottom w:type="dxa" w:w="50"/>
+              <w:right w:type="dxa" w:w="60"/>
+            </w:tcMar>
+          </w:tcPr>
+          <w:p>
+            <w:pPr>
+              <w:jc w:val="center"/>
+            </w:pPr>
+            <w:r>
+              <w:rPr>
+                <w:b/>
+                <w:bCs/>
+                <w:color w:val="1A1A1A"/>
+                <w:sz w:val="18"/>
+                <w:szCs w:val="18"/>
+              </w:rPr>
+              <w:t xml:space="preserve"/>
+            </w:r>
+          </w:p>
+        </w:tc>
+        <w:tc>
+          <w:tcPr>
+            <w:tcW w:type="dxa" w:w="1320"/>
+            <w:shd w:fill="F2F5F9" w:color="auto" w:val="clear"/>
+            <w:tcMar>
+              <w:top w:type="dxa" w:w="50"/>
+              <w:left w:type="dxa" w:w="60"/>
+              <w:bottom w:type="dxa" w:w="50"/>
+              <w:right w:type="dxa" w:w="60"/>
+            </w:tcMar>
+          </w:tcPr>
+          <w:p>
+            <w:pPr>
+              <w:jc w:val="center"/>
+            </w:pPr>
+            <w:r>
+              <w:rPr>
+                <w:b/>
+                <w:bCs/>
+                <w:color w:val="1A1A1A"/>
+                <w:sz w:val="18"/>
+                <w:szCs w:val="18"/>
+              </w:rPr>
+              <w:t xml:space="preserve"/>
+            </w:r>
+          </w:p>
+        </w:tc>
+      </w:tr>
+      <w:tr>
+        <w:tc>
+          <w:tcPr>
+            <w:tcW w:type="dxa" w:w="5400"/>
+            <w:shd w:fill="FFFFFF" w:color="auto" w:val="clear"/>
+            <w:tcMar>
+              <w:top w:type="dxa" w:w="50"/>
+              <w:left w:type="dxa" w:w="80"/>
+              <w:bottom w:type="dxa" w:w="50"/>
+              <w:right w:type="dxa" w:w="80"/>
+            </w:tcMar>
+          </w:tcPr>
+          <w:p>
+            <w:r>
+              <w:rPr>
+                <w:b w:val="false"/>
+                <w:bCs w:val="false"/>
+                <w:color w:val="1A1A1A"/>
+                <w:sz w:val="17"/>
+                <w:szCs w:val="17"/>
+              </w:rPr>
+              <w:t xml:space="preserve">T3 · Notification in killed state</w:t>
+            </w:r>
+          </w:p>
+        </w:tc>
+        <w:tc>
+          <w:tcPr>
+            <w:tcW w:type="dxa" w:w="1320"/>
+            <w:shd w:fill="FFFFFF" w:color="auto" w:val="clear"/>
+            <w:tcMar>
+              <w:top w:type="dxa" w:w="50"/>
+              <w:left w:type="dxa" w:w="60"/>
+              <w:bottom w:type="dxa" w:w="50"/>
+              <w:right w:type="dxa" w:w="60"/>
+            </w:tcMar>
+          </w:tcPr>
+          <w:p>
+            <w:pPr>
+              <w:jc w:val="center"/>
+            </w:pPr>
+            <w:r>
+              <w:rPr>
+                <w:b/>
+                <w:bCs/>
+                <w:color w:val="1A1A1A"/>
+                <w:sz w:val="18"/>
+                <w:szCs w:val="18"/>
+              </w:rPr>
+              <w:t xml:space="preserve"/>
+            </w:r>
+          </w:p>
+        </w:tc>
+        <w:tc>
+          <w:tcPr>
+            <w:tcW w:type="dxa" w:w="1320"/>
+            <w:shd w:fill="FFFFFF" w:color="auto" w:val="clear"/>
+            <w:tcMar>
+              <w:top w:type="dxa" w:w="50"/>
+              <w:left w:type="dxa" w:w="60"/>
+              <w:bottom w:type="dxa" w:w="50"/>
+              <w:right w:type="dxa" w:w="60"/>
+            </w:tcMar>
+          </w:tcPr>
+          <w:p>
+            <w:pPr>
+              <w:jc w:val="center"/>
+            </w:pPr>
+            <w:r>
+              <w:rPr>
+                <w:b/>
+                <w:bCs/>
+                <w:color w:val="1A1A1A"/>
+                <w:sz w:val="18"/>
+                <w:szCs w:val="18"/>
+              </w:rPr>
+              <w:t xml:space="preserve"/>
+            </w:r>
+          </w:p>
+        </w:tc>
+        <w:tc>
+          <w:tcPr>
+            <w:tcW w:type="dxa" w:w="1320"/>
+            <w:shd w:fill="FFFFFF" w:color="auto" w:val="clear"/>
+            <w:tcMar>
+              <w:top w:type="dxa" w:w="50"/>
+              <w:left w:type="dxa" w:w="60"/>
+              <w:bottom w:type="dxa" w:w="50"/>
+              <w:right w:type="dxa" w:w="60"/>
+            </w:tcMar>
+          </w:tcPr>
+          <w:p>
+            <w:pPr>
+              <w:jc w:val="center"/>
+            </w:pPr>
+            <w:r>
+              <w:rPr>
+                <w:b/>
+                <w:bCs/>
+                <w:color w:val="16A34A"/>
+                <w:sz w:val="18"/>
+                <w:szCs w:val="18"/>
+              </w:rPr>
+              <w:t xml:space="preserve">✓</w:t>
+            </w:r>
+          </w:p>
+        </w:tc>
+      </w:tr>
+      <w:tr>
+        <w:tc>
+          <w:tcPr>
+            <w:tcW w:type="dxa" w:w="5400"/>
+            <w:shd w:fill="F2F5F9" w:color="auto" w:val="clear"/>
+            <w:tcMar>
+              <w:top w:type="dxa" w:w="50"/>
+              <w:left w:type="dxa" w:w="80"/>
+              <w:bottom w:type="dxa" w:w="50"/>
+              <w:right w:type="dxa" w:w="80"/>
+            </w:tcMar>
+          </w:tcPr>
+          <w:p>
+            <w:r>
+              <w:rPr>
+                <w:b w:val="false"/>
+                <w:bCs w:val="false"/>
+                <w:color w:val="1A1A1A"/>
+                <w:sz w:val="17"/>
+                <w:szCs w:val="17"/>
+              </w:rPr>
+              <w:t xml:space="preserve">T3 · Notification in background state</w:t>
+            </w:r>
+          </w:p>
+        </w:tc>
+        <w:tc>
+          <w:tcPr>
+            <w:tcW w:type="dxa" w:w="1320"/>
+            <w:shd w:fill="F2F5F9" w:color="auto" w:val="clear"/>
+            <w:tcMar>
+              <w:top w:type="dxa" w:w="50"/>
+              <w:left w:type="dxa" w:w="60"/>
+              <w:bottom w:type="dxa" w:w="50"/>
+              <w:right w:type="dxa" w:w="60"/>
+            </w:tcMar>
+          </w:tcPr>
+          <w:p>
+            <w:pPr>
+              <w:jc w:val="center"/>
+            </w:pPr>
+            <w:r>
+              <w:rPr>
+                <w:b/>
+                <w:bCs/>
+                <w:color w:val="1A1A1A"/>
+                <w:sz w:val="18"/>
+                <w:szCs w:val="18"/>
+              </w:rPr>
+              <w:t xml:space="preserve"/>
+            </w:r>
+          </w:p>
+        </w:tc>
+        <w:tc>
+          <w:tcPr>
+            <w:tcW w:type="dxa" w:w="1320"/>
+            <w:shd w:fill="F2F5F9" w:color="auto" w:val="clear"/>
+            <w:tcMar>
+              <w:top w:type="dxa" w:w="50"/>
+              <w:left w:type="dxa" w:w="60"/>
+              <w:bottom w:type="dxa" w:w="50"/>
+              <w:right w:type="dxa" w:w="60"/>
+            </w:tcMar>
+          </w:tcPr>
+          <w:p>
+            <w:pPr>
+              <w:jc w:val="center"/>
+            </w:pPr>
+            <w:r>
+              <w:rPr>
+                <w:b/>
+                <w:bCs/>
+                <w:color w:val="1A1A1A"/>
+                <w:sz w:val="18"/>
+                <w:szCs w:val="18"/>
+              </w:rPr>
+              <w:t xml:space="preserve"/>
+            </w:r>
+          </w:p>
+        </w:tc>
+        <w:tc>
+          <w:tcPr>
+            <w:tcW w:type="dxa" w:w="1320"/>
+            <w:shd w:fill="F2F5F9" w:color="auto" w:val="clear"/>
+            <w:tcMar>
+              <w:top w:type="dxa" w:w="50"/>
+              <w:left w:type="dxa" w:w="60"/>
+              <w:bottom w:type="dxa" w:w="50"/>
+              <w:right w:type="dxa" w:w="60"/>
+            </w:tcMar>
+          </w:tcPr>
+          <w:p>
+            <w:pPr>
+              <w:jc w:val="center"/>
+            </w:pPr>
+            <w:r>
+              <w:rPr>
+                <w:b/>
+                <w:bCs/>
+                <w:color w:val="16A34A"/>
+                <w:sz w:val="18"/>
+                <w:szCs w:val="18"/>
+              </w:rPr>
+              <w:t xml:space="preserve">✓</w:t>
+            </w:r>
+          </w:p>
+        </w:tc>
+      </w:tr>
+      <w:tr>
+        <w:tc>
+          <w:tcPr>
+            <w:tcW w:type="dxa" w:w="5400"/>
+            <w:shd w:fill="FFFFFF" w:color="auto" w:val="clear"/>
+            <w:tcMar>
+              <w:top w:type="dxa" w:w="50"/>
+              <w:left w:type="dxa" w:w="80"/>
+              <w:bottom w:type="dxa" w:w="50"/>
+              <w:right w:type="dxa" w:w="80"/>
+            </w:tcMar>
+          </w:tcPr>
+          <w:p>
+            <w:r>
+              <w:rPr>
+                <w:b w:val="false"/>
+                <w:bCs w:val="false"/>
+                <w:color w:val="1A1A1A"/>
+                <w:sz w:val="17"/>
+                <w:szCs w:val="17"/>
+              </w:rPr>
+              <w:t xml:space="preserve">T3 · Notification in foreground state</w:t>
+            </w:r>
+          </w:p>
+        </w:tc>
+        <w:tc>
+          <w:tcPr>
+            <w:tcW w:type="dxa" w:w="1320"/>
+            <w:shd w:fill="FFFFFF" w:color="auto" w:val="clear"/>
+            <w:tcMar>
+              <w:top w:type="dxa" w:w="50"/>
+              <w:left w:type="dxa" w:w="60"/>
+              <w:bottom w:type="dxa" w:w="50"/>
+              <w:right w:type="dxa" w:w="60"/>
+            </w:tcMar>
+          </w:tcPr>
+          <w:p>
+            <w:pPr>
+              <w:jc w:val="center"/>
+            </w:pPr>
+            <w:r>
+              <w:rPr>
+                <w:b/>
+                <w:bCs/>
+                <w:color w:val="1A1A1A"/>
+                <w:sz w:val="18"/>
+                <w:szCs w:val="18"/>
+              </w:rPr>
+              <w:t xml:space="preserve"/>
+            </w:r>
+          </w:p>
+        </w:tc>
+        <w:tc>
+          <w:tcPr>
+            <w:tcW w:type="dxa" w:w="1320"/>
+            <w:shd w:fill="FFFFFF" w:color="auto" w:val="clear"/>
+            <w:tcMar>
+              <w:top w:type="dxa" w:w="50"/>
+              <w:left w:type="dxa" w:w="60"/>
+              <w:bottom w:type="dxa" w:w="50"/>
+              <w:right w:type="dxa" w:w="60"/>
+            </w:tcMar>
+          </w:tcPr>
+          <w:p>
+            <w:pPr>
+              <w:jc w:val="center"/>
+            </w:pPr>
+            <w:r>
+              <w:rPr>
+                <w:b/>
+                <w:bCs/>
+                <w:color w:val="1A1A1A"/>
+                <w:sz w:val="18"/>
+                <w:szCs w:val="18"/>
+              </w:rPr>
+              <w:t xml:space="preserve"/>
+            </w:r>
+          </w:p>
+        </w:tc>
+        <w:tc>
+          <w:tcPr>
+            <w:tcW w:type="dxa" w:w="1320"/>
+            <w:shd w:fill="FFFFFF" w:color="auto" w:val="clear"/>
+            <w:tcMar>
+              <w:top w:type="dxa" w:w="50"/>
+              <w:left w:type="dxa" w:w="60"/>
+              <w:bottom w:type="dxa" w:w="50"/>
+              <w:right w:type="dxa" w:w="60"/>
+            </w:tcMar>
+          </w:tcPr>
+          <w:p>
+            <w:pPr>
+              <w:jc w:val="center"/>
+            </w:pPr>
+            <w:r>
+              <w:rPr>
+                <w:b/>
+                <w:bCs/>
+                <w:color w:val="16A34A"/>
+                <w:sz w:val="18"/>
+                <w:szCs w:val="18"/>
+              </w:rPr>
+              <w:t xml:space="preserve">✓</w:t>
+            </w:r>
+          </w:p>
+        </w:tc>
+      </w:tr>
+      <w:tr>
+        <w:tc>
+          <w:tcPr>
+            <w:tcW w:type="dxa" w:w="5400"/>
+            <w:shd w:fill="F2F5F9" w:color="auto" w:val="clear"/>
+            <w:tcMar>
+              <w:top w:type="dxa" w:w="50"/>
+              <w:left w:type="dxa" w:w="80"/>
+              <w:bottom w:type="dxa" w:w="50"/>
+              <w:right w:type="dxa" w:w="80"/>
+            </w:tcMar>
+          </w:tcPr>
+          <w:p>
+            <w:r>
+              <w:rPr>
+                <w:b w:val="false"/>
+                <w:bCs w:val="false"/>
+                <w:color w:val="1A1A1A"/>
+                <w:sz w:val="17"/>
+                <w:szCs w:val="17"/>
+              </w:rPr>
+              <w:t xml:space="preserve">T3 · Push impressions captured</w:t>
+            </w:r>
+          </w:p>
+        </w:tc>
+        <w:tc>
+          <w:tcPr>
+            <w:tcW w:type="dxa" w:w="1320"/>
+            <w:shd w:fill="F2F5F9" w:color="auto" w:val="clear"/>
+            <w:tcMar>
+              <w:top w:type="dxa" w:w="50"/>
+              <w:left w:type="dxa" w:w="60"/>
+              <w:bottom w:type="dxa" w:w="50"/>
+              <w:right w:type="dxa" w:w="60"/>
+            </w:tcMar>
+          </w:tcPr>
+          <w:p>
+            <w:pPr>
+              <w:jc w:val="center"/>
+            </w:pPr>
+            <w:r>
+              <w:rPr>
+                <w:b/>
+                <w:bCs/>
+                <w:color w:val="16A34A"/>
+                <w:sz w:val="18"/>
+                <w:szCs w:val="18"/>
+              </w:rPr>
+              <w:t xml:space="preserve">✓</w:t>
+            </w:r>
+          </w:p>
+        </w:tc>
+        <w:tc>
+          <w:tcPr>
+            <w:tcW w:type="dxa" w:w="1320"/>
+            <w:shd w:fill="F2F5F9" w:color="auto" w:val="clear"/>
+            <w:tcMar>
+              <w:top w:type="dxa" w:w="50"/>
+              <w:left w:type="dxa" w:w="60"/>
+              <w:bottom w:type="dxa" w:w="50"/>
+              <w:right w:type="dxa" w:w="60"/>
+            </w:tcMar>
+          </w:tcPr>
+          <w:p>
+            <w:pPr>
+              <w:jc w:val="center"/>
+            </w:pPr>
+            <w:r>
+              <w:rPr>
+                <w:b/>
+                <w:bCs/>
+                <w:color w:val="1A1A1A"/>
+                <w:sz w:val="18"/>
+                <w:szCs w:val="18"/>
+              </w:rPr>
+              <w:t xml:space="preserve"/>
+            </w:r>
+          </w:p>
+        </w:tc>
+        <w:tc>
+          <w:tcPr>
+            <w:tcW w:type="dxa" w:w="1320"/>
+            <w:shd w:fill="F2F5F9" w:color="auto" w:val="clear"/>
+            <w:tcMar>
+              <w:top w:type="dxa" w:w="50"/>
+              <w:left w:type="dxa" w:w="60"/>
+              <w:bottom w:type="dxa" w:w="50"/>
+              <w:right w:type="dxa" w:w="60"/>
+            </w:tcMar>
+          </w:tcPr>
+          <w:p>
+            <w:pPr>
+              <w:jc w:val="center"/>
+            </w:pPr>
+            <w:r>
+              <w:rPr>
+                <w:b/>
+                <w:bCs/>
+                <w:color w:val="1A1A1A"/>
+                <w:sz w:val="18"/>
+                <w:szCs w:val="18"/>
+              </w:rPr>
+              <w:t xml:space="preserve"/>
+            </w:r>
+          </w:p>
+        </w:tc>
+      </w:tr>
+      <w:tr>
+        <w:tc>
+          <w:tcPr>
+            <w:tcW w:type="dxa" w:w="5400"/>
+            <w:shd w:fill="FFFFFF" w:color="auto" w:val="clear"/>
+            <w:tcMar>
+              <w:top w:type="dxa" w:w="50"/>
+              <w:left w:type="dxa" w:w="80"/>
+              <w:bottom w:type="dxa" w:w="50"/>
+              <w:right w:type="dxa" w:w="80"/>
+            </w:tcMar>
+          </w:tcPr>
+          <w:p>
+            <w:r>
+              <w:rPr>
+                <w:b w:val="false"/>
+                <w:bCs w:val="false"/>
+                <w:color w:val="1A1A1A"/>
+                <w:sz w:val="17"/>
+                <w:szCs w:val="17"/>
+              </w:rPr>
+              <w:t xml:space="preserve">T3 · Deep link — internal app</w:t>
+            </w:r>
+          </w:p>
+        </w:tc>
+        <w:tc>
+          <w:tcPr>
+            <w:tcW w:type="dxa" w:w="1320"/>
+            <w:shd w:fill="FFFFFF" w:color="auto" w:val="clear"/>
+            <w:tcMar>
+              <w:top w:type="dxa" w:w="50"/>
+              <w:left w:type="dxa" w:w="60"/>
+              <w:bottom w:type="dxa" w:w="50"/>
+              <w:right w:type="dxa" w:w="60"/>
+            </w:tcMar>
+          </w:tcPr>
+          <w:p>
+            <w:pPr>
+              <w:jc w:val="center"/>
+            </w:pPr>
+            <w:r>
+              <w:rPr>
+                <w:b/>
+                <w:bCs/>
+                <w:color w:val="1A1A1A"/>
+                <w:sz w:val="18"/>
+                <w:szCs w:val="18"/>
+              </w:rPr>
+              <w:t xml:space="preserve"/>
+            </w:r>
+          </w:p>
+        </w:tc>
+        <w:tc>
+          <w:tcPr>
+            <w:tcW w:type="dxa" w:w="1320"/>
+            <w:shd w:fill="FFFFFF" w:color="auto" w:val="clear"/>
+            <w:tcMar>
+              <w:top w:type="dxa" w:w="50"/>
+              <w:left w:type="dxa" w:w="60"/>
+              <w:bottom w:type="dxa" w:w="50"/>
+              <w:right w:type="dxa" w:w="60"/>
+            </w:tcMar>
+          </w:tcPr>
+          <w:p>
+            <w:pPr>
+              <w:jc w:val="center"/>
+            </w:pPr>
+            <w:r>
+              <w:rPr>
+                <w:b/>
+                <w:bCs/>
+                <w:color w:val="16A34A"/>
+                <w:sz w:val="18"/>
+                <w:szCs w:val="18"/>
+              </w:rPr>
+              <w:t xml:space="preserve">✓</w:t>
+            </w:r>
+          </w:p>
+        </w:tc>
+        <w:tc>
+          <w:tcPr>
+            <w:tcW w:type="dxa" w:w="1320"/>
+            <w:shd w:fill="FFFFFF" w:color="auto" w:val="clear"/>
+            <w:tcMar>
+              <w:top w:type="dxa" w:w="50"/>
+              <w:left w:type="dxa" w:w="60"/>
+              <w:bottom w:type="dxa" w:w="50"/>
+              <w:right w:type="dxa" w:w="60"/>
+            </w:tcMar>
+          </w:tcPr>
+          <w:p>
+            <w:pPr>
+              <w:jc w:val="center"/>
+            </w:pPr>
+            <w:r>
+              <w:rPr>
+                <w:b/>
+                <w:bCs/>
+                <w:color w:val="16A34A"/>
+                <w:sz w:val="18"/>
+                <w:szCs w:val="18"/>
+              </w:rPr>
+              <w:t xml:space="preserve">✓</w:t>
+            </w:r>
+          </w:p>
+        </w:tc>
+      </w:tr>
+      <w:tr>
+        <w:tc>
+          <w:tcPr>
+            <w:tcW w:type="dxa" w:w="5400"/>
+            <w:shd w:fill="F2F5F9" w:color="auto" w:val="clear"/>
+            <w:tcMar>
+              <w:top w:type="dxa" w:w="50"/>
+              <w:left w:type="dxa" w:w="80"/>
+              <w:bottom w:type="dxa" w:w="50"/>
+              <w:right w:type="dxa" w:w="80"/>
+            </w:tcMar>
+          </w:tcPr>
+          <w:p>
+            <w:r>
+              <w:rPr>
+                <w:b w:val="false"/>
+                <w:bCs w:val="false"/>
+                <w:color w:val="1A1A1A"/>
+                <w:sz w:val="17"/>
+                <w:szCs w:val="17"/>
+              </w:rPr>
+              <w:t xml:space="preserve">T3 · Deep link — external URL</w:t>
+            </w:r>
+          </w:p>
+        </w:tc>
+        <w:tc>
+          <w:tcPr>
+            <w:tcW w:type="dxa" w:w="1320"/>
+            <w:shd w:fill="F2F5F9" w:color="auto" w:val="clear"/>
+            <w:tcMar>
+              <w:top w:type="dxa" w:w="50"/>
+              <w:left w:type="dxa" w:w="60"/>
+              <w:bottom w:type="dxa" w:w="50"/>
+              <w:right w:type="dxa" w:w="60"/>
+            </w:tcMar>
+          </w:tcPr>
+          <w:p>
+            <w:pPr>
+              <w:jc w:val="center"/>
+            </w:pPr>
+            <w:r>
+              <w:rPr>
+                <w:b/>
+                <w:bCs/>
+                <w:color w:val="16A34A"/>
+                <w:sz w:val="18"/>
+                <w:szCs w:val="18"/>
+              </w:rPr>
+              <w:t xml:space="preserve">✓</w:t>
+            </w:r>
+          </w:p>
+        </w:tc>
+        <w:tc>
+          <w:tcPr>
+            <w:tcW w:type="dxa" w:w="1320"/>
+            <w:shd w:fill="F2F5F9" w:color="auto" w:val="clear"/>
+            <w:tcMar>
+              <w:top w:type="dxa" w:w="50"/>
+              <w:left w:type="dxa" w:w="60"/>
+              <w:bottom w:type="dxa" w:w="50"/>
+              <w:right w:type="dxa" w:w="60"/>
+            </w:tcMar>
+          </w:tcPr>
+          <w:p>
+            <w:pPr>
+              <w:jc w:val="center"/>
+            </w:pPr>
+            <w:r>
+              <w:rPr>
+                <w:b/>
+                <w:bCs/>
+                <w:color w:val="1A1A1A"/>
+                <w:sz w:val="18"/>
+                <w:szCs w:val="18"/>
+              </w:rPr>
+              <w:t xml:space="preserve"/>
+            </w:r>
+          </w:p>
+        </w:tc>
+        <w:tc>
+          <w:tcPr>
+            <w:tcW w:type="dxa" w:w="1320"/>
+            <w:shd w:fill="F2F5F9" w:color="auto" w:val="clear"/>
+            <w:tcMar>
+              <w:top w:type="dxa" w:w="50"/>
+              <w:left w:type="dxa" w:w="60"/>
+              <w:bottom w:type="dxa" w:w="50"/>
+              <w:right w:type="dxa" w:w="60"/>
+            </w:tcMar>
+          </w:tcPr>
+          <w:p>
+            <w:pPr>
+              <w:jc w:val="center"/>
+            </w:pPr>
+            <w:r>
+              <w:rPr>
+                <w:b/>
+                <w:bCs/>
+                <w:color w:val="16A34A"/>
+                <w:sz w:val="18"/>
+                <w:szCs w:val="18"/>
+              </w:rPr>
+              <w:t xml:space="preserve">✓</w:t>
+            </w:r>
+          </w:p>
+        </w:tc>
+      </w:tr>
+      <w:tr>
+        <w:tc>
+          <w:tcPr>
+            <w:tcW w:type="dxa" w:w="5400"/>
+            <w:shd w:fill="FFFFFF" w:color="auto" w:val="clear"/>
+            <w:tcMar>
+              <w:top w:type="dxa" w:w="50"/>
+              <w:left w:type="dxa" w:w="80"/>
+              <w:bottom w:type="dxa" w:w="50"/>
+              <w:right w:type="dxa" w:w="80"/>
+            </w:tcMar>
+          </w:tcPr>
+          <w:p>
+            <w:r>
+              <w:rPr>
+                <w:b w:val="false"/>
+                <w:bCs w:val="false"/>
+                <w:color w:val="1A1A1A"/>
+                <w:sz w:val="17"/>
+                <w:szCs w:val="17"/>
+              </w:rPr>
+              <w:t xml:space="preserve">T3 · Send test in-app</w:t>
+            </w:r>
+          </w:p>
+        </w:tc>
+        <w:tc>
+          <w:tcPr>
+            <w:tcW w:type="dxa" w:w="1320"/>
+            <w:shd w:fill="FFFFFF" w:color="auto" w:val="clear"/>
+            <w:tcMar>
+              <w:top w:type="dxa" w:w="50"/>
+              <w:left w:type="dxa" w:w="60"/>
+              <w:bottom w:type="dxa" w:w="50"/>
+              <w:right w:type="dxa" w:w="60"/>
+            </w:tcMar>
+          </w:tcPr>
+          <w:p>
+            <w:pPr>
+              <w:jc w:val="center"/>
+            </w:pPr>
+            <w:r>
+              <w:rPr>
+                <w:b/>
+                <w:bCs/>
+                <w:color w:val="16A34A"/>
+                <w:sz w:val="18"/>
+                <w:szCs w:val="18"/>
+              </w:rPr>
+              <w:t xml:space="preserve">✓</w:t>
+            </w:r>
+          </w:p>
+        </w:tc>
+        <w:tc>
+          <w:tcPr>
+            <w:tcW w:type="dxa" w:w="1320"/>
+            <w:shd w:fill="FFFFFF" w:color="auto" w:val="clear"/>
+            <w:tcMar>
+              <w:top w:type="dxa" w:w="50"/>
+              <w:left w:type="dxa" w:w="60"/>
+              <w:bottom w:type="dxa" w:w="50"/>
+              <w:right w:type="dxa" w:w="60"/>
+            </w:tcMar>
+          </w:tcPr>
+          <w:p>
+            <w:pPr>
+              <w:jc w:val="center"/>
+            </w:pPr>
+            <w:r>
+              <w:rPr>
+                <w:b/>
+                <w:bCs/>
+                <w:color w:val="1A1A1A"/>
+                <w:sz w:val="18"/>
+                <w:szCs w:val="18"/>
+              </w:rPr>
+              <w:t xml:space="preserve"/>
+            </w:r>
+          </w:p>
+        </w:tc>
+        <w:tc>
+          <w:tcPr>
+            <w:tcW w:type="dxa" w:w="1320"/>
+            <w:shd w:fill="FFFFFF" w:color="auto" w:val="clear"/>
+            <w:tcMar>
+              <w:top w:type="dxa" w:w="50"/>
+              <w:left w:type="dxa" w:w="60"/>
+              <w:bottom w:type="dxa" w:w="50"/>
+              <w:right w:type="dxa" w:w="60"/>
+            </w:tcMar>
+          </w:tcPr>
+          <w:p>
+            <w:pPr>
+              <w:jc w:val="center"/>
+            </w:pPr>
+            <w:r>
+              <w:rPr>
+                <w:b/>
+                <w:bCs/>
+                <w:color w:val="D97706"/>
+                <w:sz w:val="18"/>
+                <w:szCs w:val="18"/>
+              </w:rPr>
+              <w:t xml:space="preserve">~</w:t>
+            </w:r>
+          </w:p>
+        </w:tc>
+      </w:tr>
+      <w:tr>
+        <w:tc>
+          <w:tcPr>
+            <w:tcW w:type="dxa" w:w="5400"/>
+            <w:shd w:fill="F2F5F9" w:color="auto" w:val="clear"/>
+            <w:tcMar>
+              <w:top w:type="dxa" w:w="50"/>
+              <w:left w:type="dxa" w:w="80"/>
+              <w:bottom w:type="dxa" w:w="50"/>
+              <w:right w:type="dxa" w:w="80"/>
+            </w:tcMar>
+          </w:tcPr>
+          <w:p>
+            <w:r>
+              <w:rPr>
+                <w:b w:val="false"/>
+                <w:bCs w:val="false"/>
+                <w:color w:val="1A1A1A"/>
+                <w:sz w:val="17"/>
+                <w:szCs w:val="17"/>
+              </w:rPr>
+              <w:t xml:space="preserve">T3 · In-app splash exclude</w:t>
+            </w:r>
+          </w:p>
+        </w:tc>
+        <w:tc>
+          <w:tcPr>
+            <w:tcW w:type="dxa" w:w="1320"/>
+            <w:shd w:fill="F2F5F9" w:color="auto" w:val="clear"/>
+            <w:tcMar>
+              <w:top w:type="dxa" w:w="50"/>
+              <w:left w:type="dxa" w:w="60"/>
+              <w:bottom w:type="dxa" w:w="50"/>
+              <w:right w:type="dxa" w:w="60"/>
+            </w:tcMar>
+          </w:tcPr>
+          <w:p>
+            <w:pPr>
+              <w:jc w:val="center"/>
+            </w:pPr>
+            <w:r>
+              <w:rPr>
+                <w:b/>
+                <w:bCs/>
+                <w:color w:val="1A1A1A"/>
+                <w:sz w:val="18"/>
+                <w:szCs w:val="18"/>
+              </w:rPr>
+              <w:t xml:space="preserve"/>
+            </w:r>
+          </w:p>
+        </w:tc>
+        <w:tc>
+          <w:tcPr>
+            <w:tcW w:type="dxa" w:w="1320"/>
+            <w:shd w:fill="F2F5F9" w:color="auto" w:val="clear"/>
+            <w:tcMar>
+              <w:top w:type="dxa" w:w="50"/>
+              <w:left w:type="dxa" w:w="60"/>
+              <w:bottom w:type="dxa" w:w="50"/>
+              <w:right w:type="dxa" w:w="60"/>
+            </w:tcMar>
+          </w:tcPr>
+          <w:p>
+            <w:pPr>
+              <w:jc w:val="center"/>
+            </w:pPr>
+            <w:r>
+              <w:rPr>
+                <w:b/>
+                <w:bCs/>
+                <w:color w:val="1A1A1A"/>
+                <w:sz w:val="18"/>
+                <w:szCs w:val="18"/>
+              </w:rPr>
+              <w:t xml:space="preserve"/>
+            </w:r>
+          </w:p>
+        </w:tc>
+        <w:tc>
+          <w:tcPr>
+            <w:tcW w:type="dxa" w:w="1320"/>
+            <w:shd w:fill="F2F5F9" w:color="auto" w:val="clear"/>
+            <w:tcMar>
+              <w:top w:type="dxa" w:w="50"/>
+              <w:left w:type="dxa" w:w="60"/>
+              <w:bottom w:type="dxa" w:w="50"/>
+              <w:right w:type="dxa" w:w="60"/>
+            </w:tcMar>
+          </w:tcPr>
+          <w:p>
+            <w:pPr>
+              <w:jc w:val="center"/>
+            </w:pPr>
+            <w:r>
+              <w:rPr>
+                <w:b/>
+                <w:bCs/>
+                <w:color w:val="16A34A"/>
+                <w:sz w:val="18"/>
+                <w:szCs w:val="18"/>
+              </w:rPr>
+              <w:t xml:space="preserve">✓</w:t>
+            </w:r>
+          </w:p>
+        </w:tc>
+      </w:tr>
+      <w:tr>
+        <w:tc>
+          <w:tcPr>
+            <w:tcW w:type="dxa" w:w="5400"/>
+            <w:shd w:fill="FFFFFF" w:color="auto" w:val="clear"/>
+            <w:tcMar>
+              <w:top w:type="dxa" w:w="50"/>
+              <w:left w:type="dxa" w:w="80"/>
+              <w:bottom w:type="dxa" w:w="50"/>
+              <w:right w:type="dxa" w:w="80"/>
+            </w:tcMar>
+          </w:tcPr>
+          <w:p>
+            <w:r>
+              <w:rPr>
+                <w:b w:val="false"/>
+                <w:bCs w:val="false"/>
+                <w:color w:val="1A1A1A"/>
+                <w:sz w:val="17"/>
+                <w:szCs w:val="17"/>
+              </w:rPr>
+              <w:t xml:space="preserve">T3 · App uninstall tracking on</w:t>
+            </w:r>
+          </w:p>
+        </w:tc>
+        <w:tc>
+          <w:tcPr>
+            <w:tcW w:type="dxa" w:w="1320"/>
+            <w:shd w:fill="FFFFFF" w:color="auto" w:val="clear"/>
+            <w:tcMar>
+              <w:top w:type="dxa" w:w="50"/>
+              <w:left w:type="dxa" w:w="60"/>
+              <w:bottom w:type="dxa" w:w="50"/>
+              <w:right w:type="dxa" w:w="60"/>
+            </w:tcMar>
+          </w:tcPr>
+          <w:p>
+            <w:pPr>
+              <w:jc w:val="center"/>
+            </w:pPr>
+            <w:r>
+              <w:rPr>
+                <w:b/>
+                <w:bCs/>
+                <w:color w:val="16A34A"/>
+                <w:sz w:val="18"/>
+                <w:szCs w:val="18"/>
+              </w:rPr>
+              <w:t xml:space="preserve">✓</w:t>
+            </w:r>
+          </w:p>
+        </w:tc>
+        <w:tc>
+          <w:tcPr>
+            <w:tcW w:type="dxa" w:w="1320"/>
+            <w:shd w:fill="FFFFFF" w:color="auto" w:val="clear"/>
+            <w:tcMar>
+              <w:top w:type="dxa" w:w="50"/>
+              <w:left w:type="dxa" w:w="60"/>
+              <w:bottom w:type="dxa" w:w="50"/>
+              <w:right w:type="dxa" w:w="60"/>
+            </w:tcMar>
+          </w:tcPr>
+          <w:p>
+            <w:pPr>
+              <w:jc w:val="center"/>
+            </w:pPr>
+            <w:r>
+              <w:rPr>
+                <w:b/>
+                <w:bCs/>
+                <w:color w:val="1A1A1A"/>
+                <w:sz w:val="18"/>
+                <w:szCs w:val="18"/>
+              </w:rPr>
+              <w:t xml:space="preserve"/>
+            </w:r>
+          </w:p>
+        </w:tc>
+        <w:tc>
+          <w:tcPr>
+            <w:tcW w:type="dxa" w:w="1320"/>
+            <w:shd w:fill="FFFFFF" w:color="auto" w:val="clear"/>
+            <w:tcMar>
+              <w:top w:type="dxa" w:w="50"/>
+              <w:left w:type="dxa" w:w="60"/>
+              <w:bottom w:type="dxa" w:w="50"/>
+              <w:right w:type="dxa" w:w="60"/>
+            </w:tcMar>
+          </w:tcPr>
+          <w:p>
+            <w:pPr>
+              <w:jc w:val="center"/>
+            </w:pPr>
+            <w:r>
+              <w:rPr>
+                <w:b/>
+                <w:bCs/>
+                <w:color w:val="1A1A1A"/>
+                <w:sz w:val="18"/>
+                <w:szCs w:val="18"/>
+              </w:rPr>
+              <w:t xml:space="preserve"/>
+            </w:r>
+          </w:p>
+        </w:tc>
+      </w:tr>
+      <w:tr>
+        <w:tc>
+          <w:tcPr>
+            <w:tcW w:type="dxa" w:w="5400"/>
+            <w:shd w:fill="F2F5F9" w:color="auto" w:val="clear"/>
+            <w:tcMar>
+              <w:top w:type="dxa" w:w="50"/>
+              <w:left w:type="dxa" w:w="80"/>
+              <w:bottom w:type="dxa" w:w="50"/>
+              <w:right w:type="dxa" w:w="80"/>
+            </w:tcMar>
+          </w:tcPr>
+          <w:p>
+            <w:r>
+              <w:rPr>
+                <w:b w:val="false"/>
+                <w:bCs w:val="false"/>
+                <w:color w:val="1A1A1A"/>
+                <w:sz w:val="17"/>
+                <w:szCs w:val="17"/>
+              </w:rPr>
+              <w:t xml:space="preserve">T3 · Session analytics on</w:t>
+            </w:r>
+          </w:p>
+        </w:tc>
+        <w:tc>
+          <w:tcPr>
+            <w:tcW w:type="dxa" w:w="1320"/>
+            <w:shd w:fill="F2F5F9" w:color="auto" w:val="clear"/>
+            <w:tcMar>
+              <w:top w:type="dxa" w:w="50"/>
+              <w:left w:type="dxa" w:w="60"/>
+              <w:bottom w:type="dxa" w:w="50"/>
+              <w:right w:type="dxa" w:w="60"/>
+            </w:tcMar>
+          </w:tcPr>
+          <w:p>
+            <w:pPr>
+              <w:jc w:val="center"/>
+            </w:pPr>
+            <w:r>
+              <w:rPr>
+                <w:b/>
+                <w:bCs/>
+                <w:color w:val="16A34A"/>
+                <w:sz w:val="18"/>
+                <w:szCs w:val="18"/>
+              </w:rPr>
+              <w:t xml:space="preserve">✓</w:t>
+            </w:r>
+          </w:p>
+        </w:tc>
+        <w:tc>
+          <w:tcPr>
+            <w:tcW w:type="dxa" w:w="1320"/>
+            <w:shd w:fill="F2F5F9" w:color="auto" w:val="clear"/>
+            <w:tcMar>
+              <w:top w:type="dxa" w:w="50"/>
+              <w:left w:type="dxa" w:w="60"/>
+              <w:bottom w:type="dxa" w:w="50"/>
+              <w:right w:type="dxa" w:w="60"/>
+            </w:tcMar>
+          </w:tcPr>
+          <w:p>
+            <w:pPr>
+              <w:jc w:val="center"/>
+            </w:pPr>
+            <w:r>
+              <w:rPr>
+                <w:b/>
+                <w:bCs/>
+                <w:color w:val="1A1A1A"/>
+                <w:sz w:val="18"/>
+                <w:szCs w:val="18"/>
+              </w:rPr>
+              <w:t xml:space="preserve"/>
+            </w:r>
+          </w:p>
+        </w:tc>
+        <w:tc>
+          <w:tcPr>
+            <w:tcW w:type="dxa" w:w="1320"/>
+            <w:shd w:fill="F2F5F9" w:color="auto" w:val="clear"/>
+            <w:tcMar>
+              <w:top w:type="dxa" w:w="50"/>
+              <w:left w:type="dxa" w:w="60"/>
+              <w:bottom w:type="dxa" w:w="50"/>
+              <w:right w:type="dxa" w:w="60"/>
+            </w:tcMar>
+          </w:tcPr>
+          <w:p>
+            <w:pPr>
+              <w:jc w:val="center"/>
+            </w:pPr>
+            <w:r>
+              <w:rPr>
+                <w:b/>
+                <w:bCs/>
+                <w:color w:val="1A1A1A"/>
+                <w:sz w:val="18"/>
+                <w:szCs w:val="18"/>
+              </w:rPr>
+              <w:t xml:space="preserve"/>
+            </w:r>
+          </w:p>
+        </w:tc>
+      </w:tr>
+      <w:tr>
+        <w:tc>
+          <w:tcPr>
+            <w:tcW w:type="dxa" w:w="5400"/>
+            <w:shd w:fill="FFFFFF" w:color="auto" w:val="clear"/>
+            <w:tcMar>
+              <w:top w:type="dxa" w:w="50"/>
+              <w:left w:type="dxa" w:w="80"/>
+              <w:bottom w:type="dxa" w:w="50"/>
+              <w:right w:type="dxa" w:w="80"/>
+            </w:tcMar>
+          </w:tcPr>
+          <w:p>
+            <w:r>
+              <w:rPr>
+                <w:b w:val="false"/>
+                <w:bCs w:val="false"/>
+                <w:color w:val="1A1A1A"/>
+                <w:sz w:val="17"/>
+                <w:szCs w:val="17"/>
+              </w:rPr>
+              <w:t xml:space="preserve">T4 · Properties in correct format (epoch/int)</w:t>
+            </w:r>
+          </w:p>
+        </w:tc>
+        <w:tc>
+          <w:tcPr>
+            <w:tcW w:type="dxa" w:w="1320"/>
+            <w:shd w:fill="FFFFFF" w:color="auto" w:val="clear"/>
+            <w:tcMar>
+              <w:top w:type="dxa" w:w="50"/>
+              <w:left w:type="dxa" w:w="60"/>
+              <w:bottom w:type="dxa" w:w="50"/>
+              <w:right w:type="dxa" w:w="60"/>
+            </w:tcMar>
+          </w:tcPr>
+          <w:p>
+            <w:pPr>
+              <w:jc w:val="center"/>
+            </w:pPr>
+            <w:r>
+              <w:rPr>
+                <w:b/>
+                <w:bCs/>
+                <w:color w:val="16A34A"/>
+                <w:sz w:val="18"/>
+                <w:szCs w:val="18"/>
+              </w:rPr>
+              <w:t xml:space="preserve">✓</w:t>
+            </w:r>
+          </w:p>
+        </w:tc>
+        <w:tc>
+          <w:tcPr>
+            <w:tcW w:type="dxa" w:w="1320"/>
+            <w:shd w:fill="FFFFFF" w:color="auto" w:val="clear"/>
+            <w:tcMar>
+              <w:top w:type="dxa" w:w="50"/>
+              <w:left w:type="dxa" w:w="60"/>
+              <w:bottom w:type="dxa" w:w="50"/>
+              <w:right w:type="dxa" w:w="60"/>
+            </w:tcMar>
+          </w:tcPr>
+          <w:p>
+            <w:pPr>
+              <w:jc w:val="center"/>
+            </w:pPr>
+            <w:r>
+              <w:rPr>
+                <w:b/>
+                <w:bCs/>
+                <w:color w:val="1A1A1A"/>
+                <w:sz w:val="18"/>
+                <w:szCs w:val="18"/>
+              </w:rPr>
+              <w:t xml:space="preserve"/>
+            </w:r>
+          </w:p>
+        </w:tc>
+        <w:tc>
+          <w:tcPr>
+            <w:tcW w:type="dxa" w:w="1320"/>
+            <w:shd w:fill="FFFFFF" w:color="auto" w:val="clear"/>
+            <w:tcMar>
+              <w:top w:type="dxa" w:w="50"/>
+              <w:left w:type="dxa" w:w="60"/>
+              <w:bottom w:type="dxa" w:w="50"/>
+              <w:right w:type="dxa" w:w="60"/>
+            </w:tcMar>
+          </w:tcPr>
+          <w:p>
+            <w:pPr>
+              <w:jc w:val="center"/>
+            </w:pPr>
+            <w:r>
+              <w:rPr>
+                <w:b/>
+                <w:bCs/>
+                <w:color w:val="1A1A1A"/>
+                <w:sz w:val="18"/>
+                <w:szCs w:val="18"/>
+              </w:rPr>
+              <w:t xml:space="preserve"/>
+            </w:r>
+          </w:p>
+        </w:tc>
+      </w:tr>
+      <w:tr>
+        <w:tc>
+          <w:tcPr>
+            <w:tcW w:type="dxa" w:w="5400"/>
+            <w:shd w:fill="F2F5F9" w:color="auto" w:val="clear"/>
+            <w:tcMar>
+              <w:top w:type="dxa" w:w="50"/>
+              <w:left w:type="dxa" w:w="80"/>
+              <w:bottom w:type="dxa" w:w="50"/>
+              <w:right w:type="dxa" w:w="80"/>
+            </w:tcMar>
+          </w:tcPr>
+          <w:p>
+            <w:r>
+              <w:rPr>
+                <w:b w:val="false"/>
+                <w:bCs w:val="false"/>
+                <w:color w:val="1A1A1A"/>
+                <w:sz w:val="17"/>
+                <w:szCs w:val="17"/>
+              </w:rPr>
+              <w:t xml:space="preserve">T4 · Only valid values (no null/empty)</w:t>
+            </w:r>
+          </w:p>
+        </w:tc>
+        <w:tc>
+          <w:tcPr>
+            <w:tcW w:type="dxa" w:w="1320"/>
+            <w:shd w:fill="F2F5F9" w:color="auto" w:val="clear"/>
+            <w:tcMar>
+              <w:top w:type="dxa" w:w="50"/>
+              <w:left w:type="dxa" w:w="60"/>
+              <w:bottom w:type="dxa" w:w="50"/>
+              <w:right w:type="dxa" w:w="60"/>
+            </w:tcMar>
+          </w:tcPr>
+          <w:p>
+            <w:pPr>
+              <w:jc w:val="center"/>
+            </w:pPr>
+            <w:r>
+              <w:rPr>
+                <w:b/>
+                <w:bCs/>
+                <w:color w:val="16A34A"/>
+                <w:sz w:val="18"/>
+                <w:szCs w:val="18"/>
+              </w:rPr>
+              <w:t xml:space="preserve">✓</w:t>
+            </w:r>
+          </w:p>
+        </w:tc>
+        <w:tc>
+          <w:tcPr>
+            <w:tcW w:type="dxa" w:w="1320"/>
+            <w:shd w:fill="F2F5F9" w:color="auto" w:val="clear"/>
+            <w:tcMar>
+              <w:top w:type="dxa" w:w="50"/>
+              <w:left w:type="dxa" w:w="60"/>
+              <w:bottom w:type="dxa" w:w="50"/>
+              <w:right w:type="dxa" w:w="60"/>
+            </w:tcMar>
+          </w:tcPr>
+          <w:p>
+            <w:pPr>
+              <w:jc w:val="center"/>
+            </w:pPr>
+            <w:r>
+              <w:rPr>
+                <w:b/>
+                <w:bCs/>
+                <w:color w:val="1A1A1A"/>
+                <w:sz w:val="18"/>
+                <w:szCs w:val="18"/>
+              </w:rPr>
+              <w:t xml:space="preserve"/>
+            </w:r>
+          </w:p>
+        </w:tc>
+        <w:tc>
+          <w:tcPr>
+            <w:tcW w:type="dxa" w:w="1320"/>
+            <w:shd w:fill="F2F5F9" w:color="auto" w:val="clear"/>
+            <w:tcMar>
+              <w:top w:type="dxa" w:w="50"/>
+              <w:left w:type="dxa" w:w="60"/>
+              <w:bottom w:type="dxa" w:w="50"/>
+              <w:right w:type="dxa" w:w="60"/>
+            </w:tcMar>
+          </w:tcPr>
+          <w:p>
+            <w:pPr>
+              <w:jc w:val="center"/>
+            </w:pPr>
+            <w:r>
+              <w:rPr>
+                <w:b/>
+                <w:bCs/>
+                <w:color w:val="1A1A1A"/>
+                <w:sz w:val="18"/>
+                <w:szCs w:val="18"/>
+              </w:rPr>
+              <w:t xml:space="preserve"/>
+            </w:r>
+          </w:p>
+        </w:tc>
+      </w:tr>
+      <w:tr>
+        <w:tc>
+          <w:tcPr>
+            <w:tcW w:type="dxa" w:w="5400"/>
+            <w:shd w:fill="FFFFFF" w:color="auto" w:val="clear"/>
+            <w:tcMar>
+              <w:top w:type="dxa" w:w="50"/>
+              <w:left w:type="dxa" w:w="80"/>
+              <w:bottom w:type="dxa" w:w="50"/>
+              <w:right w:type="dxa" w:w="80"/>
+            </w:tcMar>
+          </w:tcPr>
+          <w:p>
+            <w:r>
+              <w:rPr>
+                <w:b w:val="false"/>
+                <w:bCs w:val="false"/>
+                <w:color w:val="1A1A1A"/>
+                <w:sz w:val="17"/>
+                <w:szCs w:val="17"/>
+              </w:rPr>
+              <w:t xml:space="preserve">T4 · Business-critical events verified</w:t>
+            </w:r>
+          </w:p>
+        </w:tc>
+        <w:tc>
+          <w:tcPr>
+            <w:tcW w:type="dxa" w:w="1320"/>
+            <w:shd w:fill="FFFFFF" w:color="auto" w:val="clear"/>
+            <w:tcMar>
+              <w:top w:type="dxa" w:w="50"/>
+              <w:left w:type="dxa" w:w="60"/>
+              <w:bottom w:type="dxa" w:w="50"/>
+              <w:right w:type="dxa" w:w="60"/>
+            </w:tcMar>
+          </w:tcPr>
+          <w:p>
+            <w:pPr>
+              <w:jc w:val="center"/>
+            </w:pPr>
+            <w:r>
+              <w:rPr>
+                <w:b/>
+                <w:bCs/>
+                <w:color w:val="16A34A"/>
+                <w:sz w:val="18"/>
+                <w:szCs w:val="18"/>
+              </w:rPr>
+              <w:t xml:space="preserve">✓</w:t>
+            </w:r>
+          </w:p>
+        </w:tc>
+        <w:tc>
+          <w:tcPr>
+            <w:tcW w:type="dxa" w:w="1320"/>
+            <w:shd w:fill="FFFFFF" w:color="auto" w:val="clear"/>
+            <w:tcMar>
+              <w:top w:type="dxa" w:w="50"/>
+              <w:left w:type="dxa" w:w="60"/>
+              <w:bottom w:type="dxa" w:w="50"/>
+              <w:right w:type="dxa" w:w="60"/>
+            </w:tcMar>
+          </w:tcPr>
+          <w:p>
+            <w:pPr>
+              <w:jc w:val="center"/>
+            </w:pPr>
+            <w:r>
+              <w:rPr>
+                <w:b/>
+                <w:bCs/>
+                <w:color w:val="1A1A1A"/>
+                <w:sz w:val="18"/>
+                <w:szCs w:val="18"/>
+              </w:rPr>
+              <w:t xml:space="preserve"/>
+            </w:r>
+          </w:p>
+        </w:tc>
+        <w:tc>
+          <w:tcPr>
+            <w:tcW w:type="dxa" w:w="1320"/>
+            <w:shd w:fill="FFFFFF" w:color="auto" w:val="clear"/>
+            <w:tcMar>
+              <w:top w:type="dxa" w:w="50"/>
+              <w:left w:type="dxa" w:w="60"/>
+              <w:bottom w:type="dxa" w:w="50"/>
+              <w:right w:type="dxa" w:w="60"/>
+            </w:tcMar>
+          </w:tcPr>
+          <w:p>
+            <w:pPr>
+              <w:jc w:val="center"/>
+            </w:pPr>
+            <w:r>
+              <w:rPr>
+                <w:b/>
+                <w:bCs/>
+                <w:color w:val="D97706"/>
+                <w:sz w:val="18"/>
+                <w:szCs w:val="18"/>
+              </w:rPr>
+              <w:t xml:space="preserve">~</w:t>
+            </w:r>
+          </w:p>
+        </w:tc>
+      </w:tr>
+    </w:tbl>
+    <w:p>
+      <w:pPr>
+        <w:spacing w:after="80" w:before="160"/>
+      </w:pPr>
+      <w:r>
+        <w:rPr>
+          <w:b/>
+          <w:bCs/>
+          <w:color w:val="1A1A1A"/>
+          <w:sz w:val="20"/>
+          <w:szCs w:val="20"/>
+        </w:rPr>
+        <w:t xml:space="preserve">Web checklist — 12 items</w:t>
+      </w:r>
+    </w:p>
+    <w:tbl>
+      <w:tblPr>
+        <w:tblW w:type="dxa" w:w="9360"/>
+        <w:tblBorders>
+          <w:top w:val="single" w:color="auto" w:sz="4"/>
+          <w:left w:val="single" w:color="auto" w:sz="4"/>
+          <w:bottom w:val="single" w:color="auto" w:sz="4"/>
+          <w:right w:val="single" w:color="auto" w:sz="4"/>
+          <w:insideH w:val="single" w:color="auto" w:sz="4"/>
+          <w:insideV w:val="single" w:color="auto" w:sz="4"/>
+        </w:tblBorders>
+      </w:tblPr>
+      <w:tblGrid>
+        <w:gridCol w:w="4160"/>
+        <w:gridCol w:w="1300"/>
+        <w:gridCol w:w="1300"/>
+        <w:gridCol w:w="1300"/>
+        <w:gridCol w:w="1300"/>
+      </w:tblGrid>
+      <w:tr>
+        <w:trPr>
+          <w:tblHeader/>
+        </w:trPr>
+        <w:tc>
+          <w:tcPr>
+            <w:tcW w:type="dxa" w:w="4160"/>
+            <w:shd w:fill="1F5FA8" w:color="auto" w:val="clear"/>
+            <w:tcMar>
+              <w:top w:type="dxa" w:w="50"/>
+              <w:left w:type="dxa" w:w="70"/>
+              <w:bottom w:type="dxa" w:w="50"/>
+              <w:right w:type="dxa" w:w="70"/>
+            </w:tcMar>
+          </w:tcPr>
+          <w:p>
+            <w:pPr>
+              <w:jc w:val="left"/>
+            </w:pPr>
+            <w:r>
+              <w:rPr>
+                <w:b/>
+                <w:bCs/>
+                <w:color w:val="FFFFFF"/>
+                <w:sz w:val="17"/>
+                <w:szCs w:val="17"/>
+              </w:rPr>
+              <w:t xml:space="preserve">Checklist item</w:t>
+            </w:r>
+          </w:p>
+        </w:tc>
+        <w:tc>
+          <w:tcPr>
+            <w:tcW w:type="dxa" w:w="1300"/>
+            <w:shd w:fill="1F5FA8" w:color="auto" w:val="clear"/>
+            <w:tcMar>
+              <w:top w:type="dxa" w:w="50"/>
+              <w:left w:type="dxa" w:w="70"/>
+              <w:bottom w:type="dxa" w:w="50"/>
+              <w:right w:type="dxa" w:w="70"/>
+            </w:tcMar>
+          </w:tcPr>
+          <w:p>
+            <w:pPr>
+              <w:jc w:val="center"/>
+            </w:pPr>
+            <w:r>
+              <w:rPr>
+                <w:b/>
+                <w:bCs/>
+                <w:color w:val="FFFFFF"/>
+                <w:sz w:val="17"/>
+                <w:szCs w:val="17"/>
+              </w:rPr>
+              <w:t xml:space="preserve">API</w:t>
+            </w:r>
+          </w:p>
+        </w:tc>
+        <w:tc>
+          <w:tcPr>
+            <w:tcW w:type="dxa" w:w="1300"/>
+            <w:shd w:fill="1F5FA8" w:color="auto" w:val="clear"/>
+            <w:tcMar>
+              <w:top w:type="dxa" w:w="50"/>
+              <w:left w:type="dxa" w:w="70"/>
+              <w:bottom w:type="dxa" w:w="50"/>
+              <w:right w:type="dxa" w:w="70"/>
+            </w:tcMar>
+          </w:tcPr>
+          <w:p>
+            <w:pPr>
+              <w:jc w:val="center"/>
+            </w:pPr>
+            <w:r>
+              <w:rPr>
+                <w:b/>
+                <w:bCs/>
+                <w:color w:val="FFFFFF"/>
+                <w:sz w:val="17"/>
+                <w:szCs w:val="17"/>
+              </w:rPr>
+              <w:t xml:space="preserve">Web crawl</w:t>
+            </w:r>
+          </w:p>
+        </w:tc>
+        <w:tc>
+          <w:tcPr>
+            <w:tcW w:type="dxa" w:w="1300"/>
+            <w:shd w:fill="1F5FA8" w:color="auto" w:val="clear"/>
+            <w:tcMar>
+              <w:top w:type="dxa" w:w="50"/>
+              <w:left w:type="dxa" w:w="70"/>
+              <w:bottom w:type="dxa" w:w="50"/>
+              <w:right w:type="dxa" w:w="70"/>
+            </w:tcMar>
+          </w:tcPr>
+          <w:p>
+            <w:pPr>
+              <w:jc w:val="center"/>
+            </w:pPr>
+            <w:r>
+              <w:rPr>
+                <w:b/>
+                <w:bCs/>
+                <w:color w:val="FFFFFF"/>
+                <w:sz w:val="17"/>
+                <w:szCs w:val="17"/>
+              </w:rPr>
+              <w:t xml:space="preserve">Static (src)</w:t>
+            </w:r>
+          </w:p>
+        </w:tc>
+        <w:tc>
+          <w:tcPr>
+            <w:tcW w:type="dxa" w:w="1300"/>
+            <w:shd w:fill="1F5FA8" w:color="auto" w:val="clear"/>
+            <w:tcMar>
+              <w:top w:type="dxa" w:w="50"/>
+              <w:left w:type="dxa" w:w="70"/>
+              <w:bottom w:type="dxa" w:w="50"/>
+              <w:right w:type="dxa" w:w="70"/>
+            </w:tcMar>
+          </w:tcPr>
+          <w:p>
+            <w:pPr>
+              <w:jc w:val="center"/>
+            </w:pPr>
+            <w:r>
+              <w:rPr>
+                <w:b/>
+                <w:bCs/>
+                <w:color w:val="FFFFFF"/>
+                <w:sz w:val="17"/>
+                <w:szCs w:val="17"/>
+              </w:rPr>
+              <w:t xml:space="preserve">Manual</w:t>
+            </w:r>
+          </w:p>
+        </w:tc>
+      </w:tr>
+      <w:tr>
+        <w:tc>
+          <w:tcPr>
+            <w:tcW w:type="dxa" w:w="4160"/>
+            <w:shd w:fill="FFFFFF" w:color="auto" w:val="clear"/>
+            <w:tcMar>
+              <w:top w:type="dxa" w:w="50"/>
+              <w:left w:type="dxa" w:w="80"/>
+              <w:bottom w:type="dxa" w:w="50"/>
+              <w:right w:type="dxa" w:w="80"/>
+            </w:tcMar>
+          </w:tcPr>
+          <w:p>
+            <w:r>
+              <w:rPr>
+                <w:b w:val="false"/>
+                <w:bCs w:val="false"/>
+                <w:color w:val="1A1A1A"/>
+                <w:sz w:val="17"/>
+                <w:szCs w:val="17"/>
+              </w:rPr>
+              <w:t xml:space="preserve">T1 · SDK in &lt;head&gt; tag</w:t>
+            </w:r>
+          </w:p>
+        </w:tc>
+        <w:tc>
+          <w:tcPr>
+            <w:tcW w:type="dxa" w:w="1300"/>
+            <w:shd w:fill="FFFFFF" w:color="auto" w:val="clear"/>
+            <w:tcMar>
+              <w:top w:type="dxa" w:w="50"/>
+              <w:left w:type="dxa" w:w="60"/>
+              <w:bottom w:type="dxa" w:w="50"/>
+              <w:right w:type="dxa" w:w="60"/>
+            </w:tcMar>
+          </w:tcPr>
+          <w:p>
+            <w:pPr>
+              <w:jc w:val="center"/>
+            </w:pPr>
+            <w:r>
+              <w:rPr>
+                <w:b/>
+                <w:bCs/>
+                <w:color w:val="1A1A1A"/>
+                <w:sz w:val="18"/>
+                <w:szCs w:val="18"/>
+              </w:rPr>
+              <w:t xml:space="preserve"/>
+            </w:r>
+          </w:p>
+        </w:tc>
+        <w:tc>
+          <w:tcPr>
+            <w:tcW w:type="dxa" w:w="1300"/>
+            <w:shd w:fill="FFFFFF" w:color="auto" w:val="clear"/>
+            <w:tcMar>
+              <w:top w:type="dxa" w:w="50"/>
+              <w:left w:type="dxa" w:w="60"/>
+              <w:bottom w:type="dxa" w:w="50"/>
+              <w:right w:type="dxa" w:w="60"/>
+            </w:tcMar>
+          </w:tcPr>
+          <w:p>
+            <w:pPr>
+              <w:jc w:val="center"/>
+            </w:pPr>
+            <w:r>
+              <w:rPr>
+                <w:b/>
+                <w:bCs/>
+                <w:color w:val="16A34A"/>
+                <w:sz w:val="18"/>
+                <w:szCs w:val="18"/>
+              </w:rPr>
+              <w:t xml:space="preserve">✓</w:t>
+            </w:r>
+          </w:p>
+        </w:tc>
+        <w:tc>
+          <w:tcPr>
+            <w:tcW w:type="dxa" w:w="1300"/>
+            <w:shd w:fill="FFFFFF" w:color="auto" w:val="clear"/>
+            <w:tcMar>
+              <w:top w:type="dxa" w:w="50"/>
+              <w:left w:type="dxa" w:w="60"/>
+              <w:bottom w:type="dxa" w:w="50"/>
+              <w:right w:type="dxa" w:w="60"/>
+            </w:tcMar>
+          </w:tcPr>
+          <w:p>
+            <w:pPr>
+              <w:jc w:val="center"/>
+            </w:pPr>
+            <w:r>
+              <w:rPr>
+                <w:b/>
+                <w:bCs/>
+                <w:color w:val="16A34A"/>
+                <w:sz w:val="18"/>
+                <w:szCs w:val="18"/>
+              </w:rPr>
+              <w:t xml:space="preserve">✓</w:t>
+            </w:r>
+          </w:p>
+        </w:tc>
+        <w:tc>
+          <w:tcPr>
+            <w:tcW w:type="dxa" w:w="1300"/>
+            <w:shd w:fill="FFFFFF" w:color="auto" w:val="clear"/>
+            <w:tcMar>
+              <w:top w:type="dxa" w:w="50"/>
+              <w:left w:type="dxa" w:w="60"/>
+              <w:bottom w:type="dxa" w:w="50"/>
+              <w:right w:type="dxa" w:w="60"/>
+            </w:tcMar>
+          </w:tcPr>
+          <w:p>
+            <w:pPr>
+              <w:jc w:val="center"/>
+            </w:pPr>
+            <w:r>
+              <w:rPr>
+                <w:b/>
+                <w:bCs/>
+                <w:color w:val="1A1A1A"/>
+                <w:sz w:val="18"/>
+                <w:szCs w:val="18"/>
+              </w:rPr>
+              <w:t xml:space="preserve"/>
+            </w:r>
+          </w:p>
+        </w:tc>
+      </w:tr>
+      <w:tr>
+        <w:tc>
+          <w:tcPr>
+            <w:tcW w:type="dxa" w:w="4160"/>
+            <w:shd w:fill="F2F5F9" w:color="auto" w:val="clear"/>
+            <w:tcMar>
+              <w:top w:type="dxa" w:w="50"/>
+              <w:left w:type="dxa" w:w="80"/>
+              <w:bottom w:type="dxa" w:w="50"/>
+              <w:right w:type="dxa" w:w="80"/>
+            </w:tcMar>
+          </w:tcPr>
+          <w:p>
+            <w:r>
+              <w:rPr>
+                <w:b w:val="false"/>
+                <w:bCs w:val="false"/>
+                <w:color w:val="1A1A1A"/>
+                <w:sz w:val="17"/>
+                <w:szCs w:val="17"/>
+              </w:rPr>
+              <w:t xml:space="preserve">T1 · GDPR location</w:t>
+            </w:r>
+          </w:p>
+        </w:tc>
+        <w:tc>
+          <w:tcPr>
+            <w:tcW w:type="dxa" w:w="1300"/>
+            <w:shd w:fill="F2F5F9" w:color="auto" w:val="clear"/>
+            <w:tcMar>
+              <w:top w:type="dxa" w:w="50"/>
+              <w:left w:type="dxa" w:w="60"/>
+              <w:bottom w:type="dxa" w:w="50"/>
+              <w:right w:type="dxa" w:w="60"/>
+            </w:tcMar>
+          </w:tcPr>
+          <w:p>
+            <w:pPr>
+              <w:jc w:val="center"/>
+            </w:pPr>
+            <w:r>
+              <w:rPr>
+                <w:b/>
+                <w:bCs/>
+                <w:color w:val="1A1A1A"/>
+                <w:sz w:val="18"/>
+                <w:szCs w:val="18"/>
+              </w:rPr>
+              <w:t xml:space="preserve"/>
+            </w:r>
+          </w:p>
+        </w:tc>
+        <w:tc>
+          <w:tcPr>
+            <w:tcW w:type="dxa" w:w="1300"/>
+            <w:shd w:fill="F2F5F9" w:color="auto" w:val="clear"/>
+            <w:tcMar>
+              <w:top w:type="dxa" w:w="50"/>
+              <w:left w:type="dxa" w:w="60"/>
+              <w:bottom w:type="dxa" w:w="50"/>
+              <w:right w:type="dxa" w:w="60"/>
+            </w:tcMar>
+          </w:tcPr>
+          <w:p>
+            <w:pPr>
+              <w:jc w:val="center"/>
+            </w:pPr>
+            <w:r>
+              <w:rPr>
+                <w:b/>
+                <w:bCs/>
+                <w:color w:val="16A34A"/>
+                <w:sz w:val="18"/>
+                <w:szCs w:val="18"/>
+              </w:rPr>
+              <w:t xml:space="preserve">✓</w:t>
+            </w:r>
+          </w:p>
+        </w:tc>
+        <w:tc>
+          <w:tcPr>
+            <w:tcW w:type="dxa" w:w="1300"/>
+            <w:shd w:fill="F2F5F9" w:color="auto" w:val="clear"/>
+            <w:tcMar>
+              <w:top w:type="dxa" w:w="50"/>
+              <w:left w:type="dxa" w:w="60"/>
+              <w:bottom w:type="dxa" w:w="50"/>
+              <w:right w:type="dxa" w:w="60"/>
+            </w:tcMar>
+          </w:tcPr>
+          <w:p>
+            <w:pPr>
+              <w:jc w:val="center"/>
+            </w:pPr>
+            <w:r>
+              <w:rPr>
+                <w:b/>
+                <w:bCs/>
+                <w:color w:val="16A34A"/>
+                <w:sz w:val="18"/>
+                <w:szCs w:val="18"/>
+              </w:rPr>
+              <w:t xml:space="preserve">✓</w:t>
+            </w:r>
+          </w:p>
+        </w:tc>
+        <w:tc>
+          <w:tcPr>
+            <w:tcW w:type="dxa" w:w="1300"/>
+            <w:shd w:fill="F2F5F9" w:color="auto" w:val="clear"/>
+            <w:tcMar>
+              <w:top w:type="dxa" w:w="50"/>
+              <w:left w:type="dxa" w:w="60"/>
+              <w:bottom w:type="dxa" w:w="50"/>
+              <w:right w:type="dxa" w:w="60"/>
+            </w:tcMar>
+          </w:tcPr>
+          <w:p>
+            <w:pPr>
+              <w:jc w:val="center"/>
+            </w:pPr>
+            <w:r>
+              <w:rPr>
+                <w:b/>
+                <w:bCs/>
+                <w:color w:val="1A1A1A"/>
+                <w:sz w:val="18"/>
+                <w:szCs w:val="18"/>
+              </w:rPr>
+              <w:t xml:space="preserve"/>
+            </w:r>
+          </w:p>
+        </w:tc>
+      </w:tr>
+      <w:tr>
+        <w:tc>
+          <w:tcPr>
+            <w:tcW w:type="dxa" w:w="4160"/>
+            <w:shd w:fill="FFFFFF" w:color="auto" w:val="clear"/>
+            <w:tcMar>
+              <w:top w:type="dxa" w:w="50"/>
+              <w:left w:type="dxa" w:w="80"/>
+              <w:bottom w:type="dxa" w:w="50"/>
+              <w:right w:type="dxa" w:w="80"/>
+            </w:tcMar>
+          </w:tcPr>
+          <w:p>
+            <w:r>
+              <w:rPr>
+                <w:b w:val="false"/>
+                <w:bCs w:val="false"/>
+                <w:color w:val="1A1A1A"/>
+                <w:sz w:val="17"/>
+                <w:szCs w:val="17"/>
+              </w:rPr>
+              <w:t xml:space="preserve">T1 · Install referral tracking (UTM)</w:t>
+            </w:r>
+          </w:p>
+        </w:tc>
+        <w:tc>
+          <w:tcPr>
+            <w:tcW w:type="dxa" w:w="1300"/>
+            <w:shd w:fill="FFFFFF" w:color="auto" w:val="clear"/>
+            <w:tcMar>
+              <w:top w:type="dxa" w:w="50"/>
+              <w:left w:type="dxa" w:w="60"/>
+              <w:bottom w:type="dxa" w:w="50"/>
+              <w:right w:type="dxa" w:w="60"/>
+            </w:tcMar>
+          </w:tcPr>
+          <w:p>
+            <w:pPr>
+              <w:jc w:val="center"/>
+            </w:pPr>
+            <w:r>
+              <w:rPr>
+                <w:b/>
+                <w:bCs/>
+                <w:color w:val="16A34A"/>
+                <w:sz w:val="18"/>
+                <w:szCs w:val="18"/>
+              </w:rPr>
+              <w:t xml:space="preserve">✓</w:t>
+            </w:r>
+          </w:p>
+        </w:tc>
+        <w:tc>
+          <w:tcPr>
+            <w:tcW w:type="dxa" w:w="1300"/>
+            <w:shd w:fill="FFFFFF" w:color="auto" w:val="clear"/>
+            <w:tcMar>
+              <w:top w:type="dxa" w:w="50"/>
+              <w:left w:type="dxa" w:w="60"/>
+              <w:bottom w:type="dxa" w:w="50"/>
+              <w:right w:type="dxa" w:w="60"/>
+            </w:tcMar>
+          </w:tcPr>
+          <w:p>
+            <w:pPr>
+              <w:jc w:val="center"/>
+            </w:pPr>
+            <w:r>
+              <w:rPr>
+                <w:b/>
+                <w:bCs/>
+                <w:color w:val="16A34A"/>
+                <w:sz w:val="18"/>
+                <w:szCs w:val="18"/>
+              </w:rPr>
+              <w:t xml:space="preserve">✓</w:t>
+            </w:r>
+          </w:p>
+        </w:tc>
+        <w:tc>
+          <w:tcPr>
+            <w:tcW w:type="dxa" w:w="1300"/>
+            <w:shd w:fill="FFFFFF" w:color="auto" w:val="clear"/>
+            <w:tcMar>
+              <w:top w:type="dxa" w:w="50"/>
+              <w:left w:type="dxa" w:w="60"/>
+              <w:bottom w:type="dxa" w:w="50"/>
+              <w:right w:type="dxa" w:w="60"/>
+            </w:tcMar>
+          </w:tcPr>
+          <w:p>
+            <w:pPr>
+              <w:jc w:val="center"/>
+            </w:pPr>
+            <w:r>
+              <w:rPr>
+                <w:b/>
+                <w:bCs/>
+                <w:color w:val="1A1A1A"/>
+                <w:sz w:val="18"/>
+                <w:szCs w:val="18"/>
+              </w:rPr>
+              <w:t xml:space="preserve"/>
+            </w:r>
+          </w:p>
+        </w:tc>
+        <w:tc>
+          <w:tcPr>
+            <w:tcW w:type="dxa" w:w="1300"/>
+            <w:shd w:fill="FFFFFF" w:color="auto" w:val="clear"/>
+            <w:tcMar>
+              <w:top w:type="dxa" w:w="50"/>
+              <w:left w:type="dxa" w:w="60"/>
+              <w:bottom w:type="dxa" w:w="50"/>
+              <w:right w:type="dxa" w:w="60"/>
+            </w:tcMar>
+          </w:tcPr>
+          <w:p>
+            <w:pPr>
+              <w:jc w:val="center"/>
+            </w:pPr>
+            <w:r>
+              <w:rPr>
+                <w:b/>
+                <w:bCs/>
+                <w:color w:val="1A1A1A"/>
+                <w:sz w:val="18"/>
+                <w:szCs w:val="18"/>
+              </w:rPr>
+              <w:t xml:space="preserve"/>
+            </w:r>
+          </w:p>
+        </w:tc>
+      </w:tr>
+      <w:tr>
+        <w:tc>
+          <w:tcPr>
+            <w:tcW w:type="dxa" w:w="4160"/>
+            <w:shd w:fill="F2F5F9" w:color="auto" w:val="clear"/>
+            <w:tcMar>
+              <w:top w:type="dxa" w:w="50"/>
+              <w:left w:type="dxa" w:w="80"/>
+              <w:bottom w:type="dxa" w:w="50"/>
+              <w:right w:type="dxa" w:w="80"/>
+            </w:tcMar>
+          </w:tcPr>
+          <w:p>
+            <w:r>
+              <w:rPr>
+                <w:b w:val="false"/>
+                <w:bCs w:val="false"/>
+                <w:color w:val="1A1A1A"/>
+                <w:sz w:val="17"/>
+                <w:szCs w:val="17"/>
+              </w:rPr>
+              <w:t xml:space="preserve">T2 · Identity / email passed</w:t>
+            </w:r>
+          </w:p>
+        </w:tc>
+        <w:tc>
+          <w:tcPr>
+            <w:tcW w:type="dxa" w:w="1300"/>
+            <w:shd w:fill="F2F5F9" w:color="auto" w:val="clear"/>
+            <w:tcMar>
+              <w:top w:type="dxa" w:w="50"/>
+              <w:left w:type="dxa" w:w="60"/>
+              <w:bottom w:type="dxa" w:w="50"/>
+              <w:right w:type="dxa" w:w="60"/>
+            </w:tcMar>
+          </w:tcPr>
+          <w:p>
+            <w:pPr>
+              <w:jc w:val="center"/>
+            </w:pPr>
+            <w:r>
+              <w:rPr>
+                <w:b/>
+                <w:bCs/>
+                <w:color w:val="16A34A"/>
+                <w:sz w:val="18"/>
+                <w:szCs w:val="18"/>
+              </w:rPr>
+              <w:t xml:space="preserve">✓</w:t>
+            </w:r>
+          </w:p>
+        </w:tc>
+        <w:tc>
+          <w:tcPr>
+            <w:tcW w:type="dxa" w:w="1300"/>
+            <w:shd w:fill="F2F5F9" w:color="auto" w:val="clear"/>
+            <w:tcMar>
+              <w:top w:type="dxa" w:w="50"/>
+              <w:left w:type="dxa" w:w="60"/>
+              <w:bottom w:type="dxa" w:w="50"/>
+              <w:right w:type="dxa" w:w="60"/>
+            </w:tcMar>
+          </w:tcPr>
+          <w:p>
+            <w:pPr>
+              <w:jc w:val="center"/>
+            </w:pPr>
+            <w:r>
+              <w:rPr>
+                <w:b/>
+                <w:bCs/>
+                <w:color w:val="1A1A1A"/>
+                <w:sz w:val="18"/>
+                <w:szCs w:val="18"/>
+              </w:rPr>
+              <w:t xml:space="preserve"/>
+            </w:r>
+          </w:p>
+        </w:tc>
+        <w:tc>
+          <w:tcPr>
+            <w:tcW w:type="dxa" w:w="1300"/>
+            <w:shd w:fill="F2F5F9" w:color="auto" w:val="clear"/>
+            <w:tcMar>
+              <w:top w:type="dxa" w:w="50"/>
+              <w:left w:type="dxa" w:w="60"/>
+              <w:bottom w:type="dxa" w:w="50"/>
+              <w:right w:type="dxa" w:w="60"/>
+            </w:tcMar>
+          </w:tcPr>
+          <w:p>
+            <w:pPr>
+              <w:jc w:val="center"/>
+            </w:pPr>
+            <w:r>
+              <w:rPr>
+                <w:b/>
+                <w:bCs/>
+                <w:color w:val="1A1A1A"/>
+                <w:sz w:val="18"/>
+                <w:szCs w:val="18"/>
+              </w:rPr>
+              <w:t xml:space="preserve"/>
+            </w:r>
+          </w:p>
+        </w:tc>
+        <w:tc>
+          <w:tcPr>
+            <w:tcW w:type="dxa" w:w="1300"/>
+            <w:shd w:fill="F2F5F9" w:color="auto" w:val="clear"/>
+            <w:tcMar>
+              <w:top w:type="dxa" w:w="50"/>
+              <w:left w:type="dxa" w:w="60"/>
+              <w:bottom w:type="dxa" w:w="50"/>
+              <w:right w:type="dxa" w:w="60"/>
+            </w:tcMar>
+          </w:tcPr>
+          <w:p>
+            <w:pPr>
+              <w:jc w:val="center"/>
+            </w:pPr>
+            <w:r>
+              <w:rPr>
+                <w:b/>
+                <w:bCs/>
+                <w:color w:val="1A1A1A"/>
+                <w:sz w:val="18"/>
+                <w:szCs w:val="18"/>
+              </w:rPr>
+              <w:t xml:space="preserve"/>
+            </w:r>
+          </w:p>
+        </w:tc>
+      </w:tr>
+      <w:tr>
+        <w:tc>
+          <w:tcPr>
+            <w:tcW w:type="dxa" w:w="4160"/>
+            <w:shd w:fill="FFFFFF" w:color="auto" w:val="clear"/>
+            <w:tcMar>
+              <w:top w:type="dxa" w:w="50"/>
+              <w:left w:type="dxa" w:w="80"/>
+              <w:bottom w:type="dxa" w:w="50"/>
+              <w:right w:type="dxa" w:w="80"/>
+            </w:tcMar>
+          </w:tcPr>
+          <w:p>
+            <w:r>
+              <w:rPr>
+                <w:b w:val="false"/>
+                <w:bCs w:val="false"/>
+                <w:color w:val="1A1A1A"/>
+                <w:sz w:val="17"/>
+                <w:szCs w:val="17"/>
+              </w:rPr>
+              <w:t xml:space="preserve">T2 · onUserLogin in registration/login</w:t>
+            </w:r>
+          </w:p>
+        </w:tc>
+        <w:tc>
+          <w:tcPr>
+            <w:tcW w:type="dxa" w:w="1300"/>
+            <w:shd w:fill="FFFFFF" w:color="auto" w:val="clear"/>
+            <w:tcMar>
+              <w:top w:type="dxa" w:w="50"/>
+              <w:left w:type="dxa" w:w="60"/>
+              <w:bottom w:type="dxa" w:w="50"/>
+              <w:right w:type="dxa" w:w="60"/>
+            </w:tcMar>
+          </w:tcPr>
+          <w:p>
+            <w:pPr>
+              <w:jc w:val="center"/>
+            </w:pPr>
+            <w:r>
+              <w:rPr>
+                <w:b/>
+                <w:bCs/>
+                <w:color w:val="16A34A"/>
+                <w:sz w:val="18"/>
+                <w:szCs w:val="18"/>
+              </w:rPr>
+              <w:t xml:space="preserve">✓</w:t>
+            </w:r>
+          </w:p>
+        </w:tc>
+        <w:tc>
+          <w:tcPr>
+            <w:tcW w:type="dxa" w:w="1300"/>
+            <w:shd w:fill="FFFFFF" w:color="auto" w:val="clear"/>
+            <w:tcMar>
+              <w:top w:type="dxa" w:w="50"/>
+              <w:left w:type="dxa" w:w="60"/>
+              <w:bottom w:type="dxa" w:w="50"/>
+              <w:right w:type="dxa" w:w="60"/>
+            </w:tcMar>
+          </w:tcPr>
+          <w:p>
+            <w:pPr>
+              <w:jc w:val="center"/>
+            </w:pPr>
+            <w:r>
+              <w:rPr>
+                <w:b/>
+                <w:bCs/>
+                <w:color w:val="D97706"/>
+                <w:sz w:val="18"/>
+                <w:szCs w:val="18"/>
+              </w:rPr>
+              <w:t xml:space="preserve">~</w:t>
+            </w:r>
+          </w:p>
+        </w:tc>
+        <w:tc>
+          <w:tcPr>
+            <w:tcW w:type="dxa" w:w="1300"/>
+            <w:shd w:fill="FFFFFF" w:color="auto" w:val="clear"/>
+            <w:tcMar>
+              <w:top w:type="dxa" w:w="50"/>
+              <w:left w:type="dxa" w:w="60"/>
+              <w:bottom w:type="dxa" w:w="50"/>
+              <w:right w:type="dxa" w:w="60"/>
+            </w:tcMar>
+          </w:tcPr>
+          <w:p>
+            <w:pPr>
+              <w:jc w:val="center"/>
+            </w:pPr>
+            <w:r>
+              <w:rPr>
+                <w:b/>
+                <w:bCs/>
+                <w:color w:val="D97706"/>
+                <w:sz w:val="18"/>
+                <w:szCs w:val="18"/>
+              </w:rPr>
+              <w:t xml:space="preserve">~</w:t>
+            </w:r>
+          </w:p>
+        </w:tc>
+        <w:tc>
+          <w:tcPr>
+            <w:tcW w:type="dxa" w:w="1300"/>
+            <w:shd w:fill="FFFFFF" w:color="auto" w:val="clear"/>
+            <w:tcMar>
+              <w:top w:type="dxa" w:w="50"/>
+              <w:left w:type="dxa" w:w="60"/>
+              <w:bottom w:type="dxa" w:w="50"/>
+              <w:right w:type="dxa" w:w="60"/>
+            </w:tcMar>
+          </w:tcPr>
+          <w:p>
+            <w:pPr>
+              <w:jc w:val="center"/>
+            </w:pPr>
+            <w:r>
+              <w:rPr>
+                <w:b/>
+                <w:bCs/>
+                <w:color w:val="1A1A1A"/>
+                <w:sz w:val="18"/>
+                <w:szCs w:val="18"/>
+              </w:rPr>
+              <w:t xml:space="preserve"/>
+            </w:r>
+          </w:p>
+        </w:tc>
+      </w:tr>
+      <w:tr>
+        <w:tc>
+          <w:tcPr>
+            <w:tcW w:type="dxa" w:w="4160"/>
+            <w:shd w:fill="F2F5F9" w:color="auto" w:val="clear"/>
+            <w:tcMar>
+              <w:top w:type="dxa" w:w="50"/>
+              <w:left w:type="dxa" w:w="80"/>
+              <w:bottom w:type="dxa" w:w="50"/>
+              <w:right w:type="dxa" w:w="80"/>
+            </w:tcMar>
+          </w:tcPr>
+          <w:p>
+            <w:r>
+              <w:rPr>
+                <w:b w:val="false"/>
+                <w:bCs w:val="false"/>
+                <w:color w:val="1A1A1A"/>
+                <w:sz w:val="17"/>
+                <w:szCs w:val="17"/>
+              </w:rPr>
+              <w:t xml:space="preserve">T2 · Profile push on update (non-login)</w:t>
+            </w:r>
+          </w:p>
+        </w:tc>
+        <w:tc>
+          <w:tcPr>
+            <w:tcW w:type="dxa" w:w="1300"/>
+            <w:shd w:fill="F2F5F9" w:color="auto" w:val="clear"/>
+            <w:tcMar>
+              <w:top w:type="dxa" w:w="50"/>
+              <w:left w:type="dxa" w:w="60"/>
+              <w:bottom w:type="dxa" w:w="50"/>
+              <w:right w:type="dxa" w:w="60"/>
+            </w:tcMar>
+          </w:tcPr>
+          <w:p>
+            <w:pPr>
+              <w:jc w:val="center"/>
+            </w:pPr>
+            <w:r>
+              <w:rPr>
+                <w:b/>
+                <w:bCs/>
+                <w:color w:val="16A34A"/>
+                <w:sz w:val="18"/>
+                <w:szCs w:val="18"/>
+              </w:rPr>
+              <w:t xml:space="preserve">✓</w:t>
+            </w:r>
+          </w:p>
+        </w:tc>
+        <w:tc>
+          <w:tcPr>
+            <w:tcW w:type="dxa" w:w="1300"/>
+            <w:shd w:fill="F2F5F9" w:color="auto" w:val="clear"/>
+            <w:tcMar>
+              <w:top w:type="dxa" w:w="50"/>
+              <w:left w:type="dxa" w:w="60"/>
+              <w:bottom w:type="dxa" w:w="50"/>
+              <w:right w:type="dxa" w:w="60"/>
+            </w:tcMar>
+          </w:tcPr>
+          <w:p>
+            <w:pPr>
+              <w:jc w:val="center"/>
+            </w:pPr>
+            <w:r>
+              <w:rPr>
+                <w:b/>
+                <w:bCs/>
+                <w:color w:val="1A1A1A"/>
+                <w:sz w:val="18"/>
+                <w:szCs w:val="18"/>
+              </w:rPr>
+              <w:t xml:space="preserve"/>
+            </w:r>
+          </w:p>
+        </w:tc>
+        <w:tc>
+          <w:tcPr>
+            <w:tcW w:type="dxa" w:w="1300"/>
+            <w:shd w:fill="F2F5F9" w:color="auto" w:val="clear"/>
+            <w:tcMar>
+              <w:top w:type="dxa" w:w="50"/>
+              <w:left w:type="dxa" w:w="60"/>
+              <w:bottom w:type="dxa" w:w="50"/>
+              <w:right w:type="dxa" w:w="60"/>
+            </w:tcMar>
+          </w:tcPr>
+          <w:p>
+            <w:pPr>
+              <w:jc w:val="center"/>
+            </w:pPr>
+            <w:r>
+              <w:rPr>
+                <w:b/>
+                <w:bCs/>
+                <w:color w:val="D97706"/>
+                <w:sz w:val="18"/>
+                <w:szCs w:val="18"/>
+              </w:rPr>
+              <w:t xml:space="preserve">~</w:t>
+            </w:r>
+          </w:p>
+        </w:tc>
+        <w:tc>
+          <w:tcPr>
+            <w:tcW w:type="dxa" w:w="1300"/>
+            <w:shd w:fill="F2F5F9" w:color="auto" w:val="clear"/>
+            <w:tcMar>
+              <w:top w:type="dxa" w:w="50"/>
+              <w:left w:type="dxa" w:w="60"/>
+              <w:bottom w:type="dxa" w:w="50"/>
+              <w:right w:type="dxa" w:w="60"/>
+            </w:tcMar>
+          </w:tcPr>
+          <w:p>
+            <w:pPr>
+              <w:jc w:val="center"/>
+            </w:pPr>
+            <w:r>
+              <w:rPr>
+                <w:b/>
+                <w:bCs/>
+                <w:color w:val="1A1A1A"/>
+                <w:sz w:val="18"/>
+                <w:szCs w:val="18"/>
+              </w:rPr>
+              <w:t xml:space="preserve"/>
+            </w:r>
+          </w:p>
+        </w:tc>
+      </w:tr>
+      <w:tr>
+        <w:tc>
+          <w:tcPr>
+            <w:tcW w:type="dxa" w:w="4160"/>
+            <w:shd w:fill="FFFFFF" w:color="auto" w:val="clear"/>
+            <w:tcMar>
+              <w:top w:type="dxa" w:w="50"/>
+              <w:left w:type="dxa" w:w="80"/>
+              <w:bottom w:type="dxa" w:w="50"/>
+              <w:right w:type="dxa" w:w="80"/>
+            </w:tcMar>
+          </w:tcPr>
+          <w:p>
+            <w:r>
+              <w:rPr>
+                <w:b w:val="false"/>
+                <w:bCs w:val="false"/>
+                <w:color w:val="1A1A1A"/>
+                <w:sz w:val="17"/>
+                <w:szCs w:val="17"/>
+              </w:rPr>
+              <w:t xml:space="preserve">T2 · Anonymous profile before registration</w:t>
+            </w:r>
+          </w:p>
+        </w:tc>
+        <w:tc>
+          <w:tcPr>
+            <w:tcW w:type="dxa" w:w="1300"/>
+            <w:shd w:fill="FFFFFF" w:color="auto" w:val="clear"/>
+            <w:tcMar>
+              <w:top w:type="dxa" w:w="50"/>
+              <w:left w:type="dxa" w:w="60"/>
+              <w:bottom w:type="dxa" w:w="50"/>
+              <w:right w:type="dxa" w:w="60"/>
+            </w:tcMar>
+          </w:tcPr>
+          <w:p>
+            <w:pPr>
+              <w:jc w:val="center"/>
+            </w:pPr>
+            <w:r>
+              <w:rPr>
+                <w:b/>
+                <w:bCs/>
+                <w:color w:val="16A34A"/>
+                <w:sz w:val="18"/>
+                <w:szCs w:val="18"/>
+              </w:rPr>
+              <w:t xml:space="preserve">✓</w:t>
+            </w:r>
+          </w:p>
+        </w:tc>
+        <w:tc>
+          <w:tcPr>
+            <w:tcW w:type="dxa" w:w="1300"/>
+            <w:shd w:fill="FFFFFF" w:color="auto" w:val="clear"/>
+            <w:tcMar>
+              <w:top w:type="dxa" w:w="50"/>
+              <w:left w:type="dxa" w:w="60"/>
+              <w:bottom w:type="dxa" w:w="50"/>
+              <w:right w:type="dxa" w:w="60"/>
+            </w:tcMar>
+          </w:tcPr>
+          <w:p>
+            <w:pPr>
+              <w:jc w:val="center"/>
+            </w:pPr>
+            <w:r>
+              <w:rPr>
+                <w:b/>
+                <w:bCs/>
+                <w:color w:val="1A1A1A"/>
+                <w:sz w:val="18"/>
+                <w:szCs w:val="18"/>
+              </w:rPr>
+              <w:t xml:space="preserve"/>
+            </w:r>
+          </w:p>
+        </w:tc>
+        <w:tc>
+          <w:tcPr>
+            <w:tcW w:type="dxa" w:w="1300"/>
+            <w:shd w:fill="FFFFFF" w:color="auto" w:val="clear"/>
+            <w:tcMar>
+              <w:top w:type="dxa" w:w="50"/>
+              <w:left w:type="dxa" w:w="60"/>
+              <w:bottom w:type="dxa" w:w="50"/>
+              <w:right w:type="dxa" w:w="60"/>
+            </w:tcMar>
+          </w:tcPr>
+          <w:p>
+            <w:pPr>
+              <w:jc w:val="center"/>
+            </w:pPr>
+            <w:r>
+              <w:rPr>
+                <w:b/>
+                <w:bCs/>
+                <w:color w:val="1A1A1A"/>
+                <w:sz w:val="18"/>
+                <w:szCs w:val="18"/>
+              </w:rPr>
+              <w:t xml:space="preserve"/>
+            </w:r>
+          </w:p>
+        </w:tc>
+        <w:tc>
+          <w:tcPr>
+            <w:tcW w:type="dxa" w:w="1300"/>
+            <w:shd w:fill="FFFFFF" w:color="auto" w:val="clear"/>
+            <w:tcMar>
+              <w:top w:type="dxa" w:w="50"/>
+              <w:left w:type="dxa" w:w="60"/>
+              <w:bottom w:type="dxa" w:w="50"/>
+              <w:right w:type="dxa" w:w="60"/>
+            </w:tcMar>
+          </w:tcPr>
+          <w:p>
+            <w:pPr>
+              <w:jc w:val="center"/>
+            </w:pPr>
+            <w:r>
+              <w:rPr>
+                <w:b/>
+                <w:bCs/>
+                <w:color w:val="1A1A1A"/>
+                <w:sz w:val="18"/>
+                <w:szCs w:val="18"/>
+              </w:rPr>
+              <w:t xml:space="preserve"/>
+            </w:r>
+          </w:p>
+        </w:tc>
+      </w:tr>
+      <w:tr>
+        <w:tc>
+          <w:tcPr>
+            <w:tcW w:type="dxa" w:w="4160"/>
+            <w:shd w:fill="F2F5F9" w:color="auto" w:val="clear"/>
+            <w:tcMar>
+              <w:top w:type="dxa" w:w="50"/>
+              <w:left w:type="dxa" w:w="80"/>
+              <w:bottom w:type="dxa" w:w="50"/>
+              <w:right w:type="dxa" w:w="80"/>
+            </w:tcMar>
+          </w:tcPr>
+          <w:p>
+            <w:r>
+              <w:rPr>
+                <w:b w:val="false"/>
+                <w:bCs w:val="false"/>
+                <w:color w:val="1A1A1A"/>
+                <w:sz w:val="17"/>
+                <w:szCs w:val="17"/>
+              </w:rPr>
+              <w:t xml:space="preserve">T2 · onUserLogin for existing users</w:t>
+            </w:r>
+          </w:p>
+        </w:tc>
+        <w:tc>
+          <w:tcPr>
+            <w:tcW w:type="dxa" w:w="1300"/>
+            <w:shd w:fill="F2F5F9" w:color="auto" w:val="clear"/>
+            <w:tcMar>
+              <w:top w:type="dxa" w:w="50"/>
+              <w:left w:type="dxa" w:w="60"/>
+              <w:bottom w:type="dxa" w:w="50"/>
+              <w:right w:type="dxa" w:w="60"/>
+            </w:tcMar>
+          </w:tcPr>
+          <w:p>
+            <w:pPr>
+              <w:jc w:val="center"/>
+            </w:pPr>
+            <w:r>
+              <w:rPr>
+                <w:b/>
+                <w:bCs/>
+                <w:color w:val="16A34A"/>
+                <w:sz w:val="18"/>
+                <w:szCs w:val="18"/>
+              </w:rPr>
+              <w:t xml:space="preserve">✓</w:t>
+            </w:r>
+          </w:p>
+        </w:tc>
+        <w:tc>
+          <w:tcPr>
+            <w:tcW w:type="dxa" w:w="1300"/>
+            <w:shd w:fill="F2F5F9" w:color="auto" w:val="clear"/>
+            <w:tcMar>
+              <w:top w:type="dxa" w:w="50"/>
+              <w:left w:type="dxa" w:w="60"/>
+              <w:bottom w:type="dxa" w:w="50"/>
+              <w:right w:type="dxa" w:w="60"/>
+            </w:tcMar>
+          </w:tcPr>
+          <w:p>
+            <w:pPr>
+              <w:jc w:val="center"/>
+            </w:pPr>
+            <w:r>
+              <w:rPr>
+                <w:b/>
+                <w:bCs/>
+                <w:color w:val="1A1A1A"/>
+                <w:sz w:val="18"/>
+                <w:szCs w:val="18"/>
+              </w:rPr>
+              <w:t xml:space="preserve"/>
+            </w:r>
+          </w:p>
+        </w:tc>
+        <w:tc>
+          <w:tcPr>
+            <w:tcW w:type="dxa" w:w="1300"/>
+            <w:shd w:fill="F2F5F9" w:color="auto" w:val="clear"/>
+            <w:tcMar>
+              <w:top w:type="dxa" w:w="50"/>
+              <w:left w:type="dxa" w:w="60"/>
+              <w:bottom w:type="dxa" w:w="50"/>
+              <w:right w:type="dxa" w:w="60"/>
+            </w:tcMar>
+          </w:tcPr>
+          <w:p>
+            <w:pPr>
+              <w:jc w:val="center"/>
+            </w:pPr>
+            <w:r>
+              <w:rPr>
+                <w:b/>
+                <w:bCs/>
+                <w:color w:val="1A1A1A"/>
+                <w:sz w:val="18"/>
+                <w:szCs w:val="18"/>
+              </w:rPr>
+              <w:t xml:space="preserve"/>
+            </w:r>
+          </w:p>
+        </w:tc>
+        <w:tc>
+          <w:tcPr>
+            <w:tcW w:type="dxa" w:w="1300"/>
+            <w:shd w:fill="F2F5F9" w:color="auto" w:val="clear"/>
+            <w:tcMar>
+              <w:top w:type="dxa" w:w="50"/>
+              <w:left w:type="dxa" w:w="60"/>
+              <w:bottom w:type="dxa" w:w="50"/>
+              <w:right w:type="dxa" w:w="60"/>
+            </w:tcMar>
+          </w:tcPr>
+          <w:p>
+            <w:pPr>
+              <w:jc w:val="center"/>
+            </w:pPr>
+            <w:r>
+              <w:rPr>
+                <w:b/>
+                <w:bCs/>
+                <w:color w:val="1A1A1A"/>
+                <w:sz w:val="18"/>
+                <w:szCs w:val="18"/>
+              </w:rPr>
+              <w:t xml:space="preserve"/>
+            </w:r>
+          </w:p>
+        </w:tc>
+      </w:tr>
+      <w:tr>
+        <w:tc>
+          <w:tcPr>
+            <w:tcW w:type="dxa" w:w="4160"/>
+            <w:shd w:fill="FFFFFF" w:color="auto" w:val="clear"/>
+            <w:tcMar>
+              <w:top w:type="dxa" w:w="50"/>
+              <w:left w:type="dxa" w:w="80"/>
+              <w:bottom w:type="dxa" w:w="50"/>
+              <w:right w:type="dxa" w:w="80"/>
+            </w:tcMar>
+          </w:tcPr>
+          <w:p>
+            <w:r>
+              <w:rPr>
+                <w:b w:val="false"/>
+                <w:bCs w:val="false"/>
+                <w:color w:val="1A1A1A"/>
+                <w:sz w:val="17"/>
+                <w:szCs w:val="17"/>
+              </w:rPr>
+              <w:t xml:space="preserve">T2 · Phone number format (+91)</w:t>
+            </w:r>
+          </w:p>
+        </w:tc>
+        <w:tc>
+          <w:tcPr>
+            <w:tcW w:type="dxa" w:w="1300"/>
+            <w:shd w:fill="FFFFFF" w:color="auto" w:val="clear"/>
+            <w:tcMar>
+              <w:top w:type="dxa" w:w="50"/>
+              <w:left w:type="dxa" w:w="60"/>
+              <w:bottom w:type="dxa" w:w="50"/>
+              <w:right w:type="dxa" w:w="60"/>
+            </w:tcMar>
+          </w:tcPr>
+          <w:p>
+            <w:pPr>
+              <w:jc w:val="center"/>
+            </w:pPr>
+            <w:r>
+              <w:rPr>
+                <w:b/>
+                <w:bCs/>
+                <w:color w:val="16A34A"/>
+                <w:sz w:val="18"/>
+                <w:szCs w:val="18"/>
+              </w:rPr>
+              <w:t xml:space="preserve">✓</w:t>
+            </w:r>
+          </w:p>
+        </w:tc>
+        <w:tc>
+          <w:tcPr>
+            <w:tcW w:type="dxa" w:w="1300"/>
+            <w:shd w:fill="FFFFFF" w:color="auto" w:val="clear"/>
+            <w:tcMar>
+              <w:top w:type="dxa" w:w="50"/>
+              <w:left w:type="dxa" w:w="60"/>
+              <w:bottom w:type="dxa" w:w="50"/>
+              <w:right w:type="dxa" w:w="60"/>
+            </w:tcMar>
+          </w:tcPr>
+          <w:p>
+            <w:pPr>
+              <w:jc w:val="center"/>
+            </w:pPr>
+            <w:r>
+              <w:rPr>
+                <w:b/>
+                <w:bCs/>
+                <w:color w:val="1A1A1A"/>
+                <w:sz w:val="18"/>
+                <w:szCs w:val="18"/>
+              </w:rPr>
+              <w:t xml:space="preserve"/>
+            </w:r>
+          </w:p>
+        </w:tc>
+        <w:tc>
+          <w:tcPr>
+            <w:tcW w:type="dxa" w:w="1300"/>
+            <w:shd w:fill="FFFFFF" w:color="auto" w:val="clear"/>
+            <w:tcMar>
+              <w:top w:type="dxa" w:w="50"/>
+              <w:left w:type="dxa" w:w="60"/>
+              <w:bottom w:type="dxa" w:w="50"/>
+              <w:right w:type="dxa" w:w="60"/>
+            </w:tcMar>
+          </w:tcPr>
+          <w:p>
+            <w:pPr>
+              <w:jc w:val="center"/>
+            </w:pPr>
+            <w:r>
+              <w:rPr>
+                <w:b/>
+                <w:bCs/>
+                <w:color w:val="1A1A1A"/>
+                <w:sz w:val="18"/>
+                <w:szCs w:val="18"/>
+              </w:rPr>
+              <w:t xml:space="preserve"/>
+            </w:r>
+          </w:p>
+        </w:tc>
+        <w:tc>
+          <w:tcPr>
+            <w:tcW w:type="dxa" w:w="1300"/>
+            <w:shd w:fill="FFFFFF" w:color="auto" w:val="clear"/>
+            <w:tcMar>
+              <w:top w:type="dxa" w:w="50"/>
+              <w:left w:type="dxa" w:w="60"/>
+              <w:bottom w:type="dxa" w:w="50"/>
+              <w:right w:type="dxa" w:w="60"/>
+            </w:tcMar>
+          </w:tcPr>
+          <w:p>
+            <w:pPr>
+              <w:jc w:val="center"/>
+            </w:pPr>
+            <w:r>
+              <w:rPr>
+                <w:b/>
+                <w:bCs/>
+                <w:color w:val="1A1A1A"/>
+                <w:sz w:val="18"/>
+                <w:szCs w:val="18"/>
+              </w:rPr>
+              <w:t xml:space="preserve"/>
+            </w:r>
+          </w:p>
+        </w:tc>
+      </w:tr>
+      <w:tr>
+        <w:tc>
+          <w:tcPr>
+            <w:tcW w:type="dxa" w:w="4160"/>
+            <w:shd w:fill="F2F5F9" w:color="auto" w:val="clear"/>
+            <w:tcMar>
+              <w:top w:type="dxa" w:w="50"/>
+              <w:left w:type="dxa" w:w="80"/>
+              <w:bottom w:type="dxa" w:w="50"/>
+              <w:right w:type="dxa" w:w="80"/>
+            </w:tcMar>
+          </w:tcPr>
+          <w:p>
+            <w:r>
+              <w:rPr>
+                <w:b w:val="false"/>
+                <w:bCs w:val="false"/>
+                <w:color w:val="1A1A1A"/>
+                <w:sz w:val="17"/>
+                <w:szCs w:val="17"/>
+              </w:rPr>
+              <w:t xml:space="preserve">T3 · Custom events / properties passed</w:t>
+            </w:r>
+          </w:p>
+        </w:tc>
+        <w:tc>
+          <w:tcPr>
+            <w:tcW w:type="dxa" w:w="1300"/>
+            <w:shd w:fill="F2F5F9" w:color="auto" w:val="clear"/>
+            <w:tcMar>
+              <w:top w:type="dxa" w:w="50"/>
+              <w:left w:type="dxa" w:w="60"/>
+              <w:bottom w:type="dxa" w:w="50"/>
+              <w:right w:type="dxa" w:w="60"/>
+            </w:tcMar>
+          </w:tcPr>
+          <w:p>
+            <w:pPr>
+              <w:jc w:val="center"/>
+            </w:pPr>
+            <w:r>
+              <w:rPr>
+                <w:b/>
+                <w:bCs/>
+                <w:color w:val="16A34A"/>
+                <w:sz w:val="18"/>
+                <w:szCs w:val="18"/>
+              </w:rPr>
+              <w:t xml:space="preserve">✓</w:t>
+            </w:r>
+          </w:p>
+        </w:tc>
+        <w:tc>
+          <w:tcPr>
+            <w:tcW w:type="dxa" w:w="1300"/>
+            <w:shd w:fill="F2F5F9" w:color="auto" w:val="clear"/>
+            <w:tcMar>
+              <w:top w:type="dxa" w:w="50"/>
+              <w:left w:type="dxa" w:w="60"/>
+              <w:bottom w:type="dxa" w:w="50"/>
+              <w:right w:type="dxa" w:w="60"/>
+            </w:tcMar>
+          </w:tcPr>
+          <w:p>
+            <w:pPr>
+              <w:jc w:val="center"/>
+            </w:pPr>
+            <w:r>
+              <w:rPr>
+                <w:b/>
+                <w:bCs/>
+                <w:color w:val="D97706"/>
+                <w:sz w:val="18"/>
+                <w:szCs w:val="18"/>
+              </w:rPr>
+              <w:t xml:space="preserve">~</w:t>
+            </w:r>
+          </w:p>
+        </w:tc>
+        <w:tc>
+          <w:tcPr>
+            <w:tcW w:type="dxa" w:w="1300"/>
+            <w:shd w:fill="F2F5F9" w:color="auto" w:val="clear"/>
+            <w:tcMar>
+              <w:top w:type="dxa" w:w="50"/>
+              <w:left w:type="dxa" w:w="60"/>
+              <w:bottom w:type="dxa" w:w="50"/>
+              <w:right w:type="dxa" w:w="60"/>
+            </w:tcMar>
+          </w:tcPr>
+          <w:p>
+            <w:pPr>
+              <w:jc w:val="center"/>
+            </w:pPr>
+            <w:r>
+              <w:rPr>
+                <w:b/>
+                <w:bCs/>
+                <w:color w:val="1A1A1A"/>
+                <w:sz w:val="18"/>
+                <w:szCs w:val="18"/>
+              </w:rPr>
+              <w:t xml:space="preserve"/>
+            </w:r>
+          </w:p>
+        </w:tc>
+        <w:tc>
+          <w:tcPr>
+            <w:tcW w:type="dxa" w:w="1300"/>
+            <w:shd w:fill="F2F5F9" w:color="auto" w:val="clear"/>
+            <w:tcMar>
+              <w:top w:type="dxa" w:w="50"/>
+              <w:left w:type="dxa" w:w="60"/>
+              <w:bottom w:type="dxa" w:w="50"/>
+              <w:right w:type="dxa" w:w="60"/>
+            </w:tcMar>
+          </w:tcPr>
+          <w:p>
+            <w:pPr>
+              <w:jc w:val="center"/>
+            </w:pPr>
+            <w:r>
+              <w:rPr>
+                <w:b/>
+                <w:bCs/>
+                <w:color w:val="1A1A1A"/>
+                <w:sz w:val="18"/>
+                <w:szCs w:val="18"/>
+              </w:rPr>
+              <w:t xml:space="preserve"/>
+            </w:r>
+          </w:p>
+        </w:tc>
+      </w:tr>
+      <w:tr>
+        <w:tc>
+          <w:tcPr>
+            <w:tcW w:type="dxa" w:w="4160"/>
+            <w:shd w:fill="FFFFFF" w:color="auto" w:val="clear"/>
+            <w:tcMar>
+              <w:top w:type="dxa" w:w="50"/>
+              <w:left w:type="dxa" w:w="80"/>
+              <w:bottom w:type="dxa" w:w="50"/>
+              <w:right w:type="dxa" w:w="80"/>
+            </w:tcMar>
+          </w:tcPr>
+          <w:p>
+            <w:r>
+              <w:rPr>
+                <w:b w:val="false"/>
+                <w:bCs w:val="false"/>
+                <w:color w:val="1A1A1A"/>
+                <w:sz w:val="17"/>
+                <w:szCs w:val="17"/>
+              </w:rPr>
+              <w:t xml:space="preserve">T3 · Send test web push</w:t>
+            </w:r>
+          </w:p>
+        </w:tc>
+        <w:tc>
+          <w:tcPr>
+            <w:tcW w:type="dxa" w:w="1300"/>
+            <w:shd w:fill="FFFFFF" w:color="auto" w:val="clear"/>
+            <w:tcMar>
+              <w:top w:type="dxa" w:w="50"/>
+              <w:left w:type="dxa" w:w="60"/>
+              <w:bottom w:type="dxa" w:w="50"/>
+              <w:right w:type="dxa" w:w="60"/>
+            </w:tcMar>
+          </w:tcPr>
+          <w:p>
+            <w:pPr>
+              <w:jc w:val="center"/>
+            </w:pPr>
+            <w:r>
+              <w:rPr>
+                <w:b/>
+                <w:bCs/>
+                <w:color w:val="16A34A"/>
+                <w:sz w:val="18"/>
+                <w:szCs w:val="18"/>
+              </w:rPr>
+              <w:t xml:space="preserve">✓</w:t>
+            </w:r>
+          </w:p>
+        </w:tc>
+        <w:tc>
+          <w:tcPr>
+            <w:tcW w:type="dxa" w:w="1300"/>
+            <w:shd w:fill="FFFFFF" w:color="auto" w:val="clear"/>
+            <w:tcMar>
+              <w:top w:type="dxa" w:w="50"/>
+              <w:left w:type="dxa" w:w="60"/>
+              <w:bottom w:type="dxa" w:w="50"/>
+              <w:right w:type="dxa" w:w="60"/>
+            </w:tcMar>
+          </w:tcPr>
+          <w:p>
+            <w:pPr>
+              <w:jc w:val="center"/>
+            </w:pPr>
+            <w:r>
+              <w:rPr>
+                <w:b/>
+                <w:bCs/>
+                <w:color w:val="16A34A"/>
+                <w:sz w:val="18"/>
+                <w:szCs w:val="18"/>
+              </w:rPr>
+              <w:t xml:space="preserve">✓</w:t>
+            </w:r>
+          </w:p>
+        </w:tc>
+        <w:tc>
+          <w:tcPr>
+            <w:tcW w:type="dxa" w:w="1300"/>
+            <w:shd w:fill="FFFFFF" w:color="auto" w:val="clear"/>
+            <w:tcMar>
+              <w:top w:type="dxa" w:w="50"/>
+              <w:left w:type="dxa" w:w="60"/>
+              <w:bottom w:type="dxa" w:w="50"/>
+              <w:right w:type="dxa" w:w="60"/>
+            </w:tcMar>
+          </w:tcPr>
+          <w:p>
+            <w:pPr>
+              <w:jc w:val="center"/>
+            </w:pPr>
+            <w:r>
+              <w:rPr>
+                <w:b/>
+                <w:bCs/>
+                <w:color w:val="1A1A1A"/>
+                <w:sz w:val="18"/>
+                <w:szCs w:val="18"/>
+              </w:rPr>
+              <w:t xml:space="preserve"/>
+            </w:r>
+          </w:p>
+        </w:tc>
+        <w:tc>
+          <w:tcPr>
+            <w:tcW w:type="dxa" w:w="1300"/>
+            <w:shd w:fill="FFFFFF" w:color="auto" w:val="clear"/>
+            <w:tcMar>
+              <w:top w:type="dxa" w:w="50"/>
+              <w:left w:type="dxa" w:w="60"/>
+              <w:bottom w:type="dxa" w:w="50"/>
+              <w:right w:type="dxa" w:w="60"/>
+            </w:tcMar>
+          </w:tcPr>
+          <w:p>
+            <w:pPr>
+              <w:jc w:val="center"/>
+            </w:pPr>
+            <w:r>
+              <w:rPr>
+                <w:b/>
+                <w:bCs/>
+                <w:color w:val="1A1A1A"/>
+                <w:sz w:val="18"/>
+                <w:szCs w:val="18"/>
+              </w:rPr>
+              <w:t xml:space="preserve"/>
+            </w:r>
+          </w:p>
+        </w:tc>
+      </w:tr>
+      <w:tr>
+        <w:tc>
+          <w:tcPr>
+            <w:tcW w:type="dxa" w:w="4160"/>
+            <w:shd w:fill="F2F5F9" w:color="auto" w:val="clear"/>
+            <w:tcMar>
+              <w:top w:type="dxa" w:w="50"/>
+              <w:left w:type="dxa" w:w="80"/>
+              <w:bottom w:type="dxa" w:w="50"/>
+              <w:right w:type="dxa" w:w="80"/>
+            </w:tcMar>
+          </w:tcPr>
+          <w:p>
+            <w:r>
+              <w:rPr>
+                <w:b w:val="false"/>
+                <w:bCs w:val="false"/>
+                <w:color w:val="1A1A1A"/>
+                <w:sz w:val="17"/>
+                <w:szCs w:val="17"/>
+              </w:rPr>
+              <w:t xml:space="preserve">T3 · Deep link redirection</w:t>
+            </w:r>
+          </w:p>
+        </w:tc>
+        <w:tc>
+          <w:tcPr>
+            <w:tcW w:type="dxa" w:w="1300"/>
+            <w:shd w:fill="F2F5F9" w:color="auto" w:val="clear"/>
+            <w:tcMar>
+              <w:top w:type="dxa" w:w="50"/>
+              <w:left w:type="dxa" w:w="60"/>
+              <w:bottom w:type="dxa" w:w="50"/>
+              <w:right w:type="dxa" w:w="60"/>
+            </w:tcMar>
+          </w:tcPr>
+          <w:p>
+            <w:pPr>
+              <w:jc w:val="center"/>
+            </w:pPr>
+            <w:r>
+              <w:rPr>
+                <w:b/>
+                <w:bCs/>
+                <w:color w:val="16A34A"/>
+                <w:sz w:val="18"/>
+                <w:szCs w:val="18"/>
+              </w:rPr>
+              <w:t xml:space="preserve">✓</w:t>
+            </w:r>
+          </w:p>
+        </w:tc>
+        <w:tc>
+          <w:tcPr>
+            <w:tcW w:type="dxa" w:w="1300"/>
+            <w:shd w:fill="F2F5F9" w:color="auto" w:val="clear"/>
+            <w:tcMar>
+              <w:top w:type="dxa" w:w="50"/>
+              <w:left w:type="dxa" w:w="60"/>
+              <w:bottom w:type="dxa" w:w="50"/>
+              <w:right w:type="dxa" w:w="60"/>
+            </w:tcMar>
+          </w:tcPr>
+          <w:p>
+            <w:pPr>
+              <w:jc w:val="center"/>
+            </w:pPr>
+            <w:r>
+              <w:rPr>
+                <w:b/>
+                <w:bCs/>
+                <w:color w:val="1A1A1A"/>
+                <w:sz w:val="18"/>
+                <w:szCs w:val="18"/>
+              </w:rPr>
+              <w:t xml:space="preserve"/>
+            </w:r>
+          </w:p>
+        </w:tc>
+        <w:tc>
+          <w:tcPr>
+            <w:tcW w:type="dxa" w:w="1300"/>
+            <w:shd w:fill="F2F5F9" w:color="auto" w:val="clear"/>
+            <w:tcMar>
+              <w:top w:type="dxa" w:w="50"/>
+              <w:left w:type="dxa" w:w="60"/>
+              <w:bottom w:type="dxa" w:w="50"/>
+              <w:right w:type="dxa" w:w="60"/>
+            </w:tcMar>
+          </w:tcPr>
+          <w:p>
+            <w:pPr>
+              <w:jc w:val="center"/>
+            </w:pPr>
+            <w:r>
+              <w:rPr>
+                <w:b/>
+                <w:bCs/>
+                <w:color w:val="1A1A1A"/>
+                <w:sz w:val="18"/>
+                <w:szCs w:val="18"/>
+              </w:rPr>
+              <w:t xml:space="preserve"/>
+            </w:r>
+          </w:p>
+        </w:tc>
+        <w:tc>
+          <w:tcPr>
+            <w:tcW w:type="dxa" w:w="1300"/>
+            <w:shd w:fill="F2F5F9" w:color="auto" w:val="clear"/>
+            <w:tcMar>
+              <w:top w:type="dxa" w:w="50"/>
+              <w:left w:type="dxa" w:w="60"/>
+              <w:bottom w:type="dxa" w:w="50"/>
+              <w:right w:type="dxa" w:w="60"/>
+            </w:tcMar>
+          </w:tcPr>
+          <w:p>
+            <w:pPr>
+              <w:jc w:val="center"/>
+            </w:pPr>
+            <w:r>
+              <w:rPr>
+                <w:b/>
+                <w:bCs/>
+                <w:color w:val="16A34A"/>
+                <w:sz w:val="18"/>
+                <w:szCs w:val="18"/>
+              </w:rPr>
+              <w:t xml:space="preserve">✓</w:t>
+            </w:r>
+          </w:p>
+        </w:tc>
+      </w:tr>
+    </w:tbl>
     <w:sectPr>
       <w:pgSz w:w="12240" w:h="15840" w:orient="portrait"/>
       <w:pgMar w:top="1440" w:right="1440" w:bottom="1440" w:left="1440" w:header="708" w:footer="708" w:gutter="0"/>

</xml_diff>